<commit_message>
Updating screenshots (iPhone based).
</commit_message>
<xml_diff>
--- a/release/g/geezword_tigrinya/source/Geezword-Tigrinya-Mobile-Manual.docx
+++ b/release/g/geezword_tigrinya/source/Geezword-Tigrinya-Mobile-Manual.docx
@@ -533,30 +533,6 @@
           <w:szCs w:val="24"/>
         </w:rPr>
         <w:t>Long Press to Select Geez Numerals:</w:t>
-      </w:r>
-    </w:p>
-    <w:p>
-      <w:pPr>
-        <w:pStyle w:val="ListParagraph"/>
-        <w:numPr>
-          <w:ilvl w:val="0"/>
-          <w:numId w:val="3"/>
-        </w:numPr>
-        <w:rPr>
-          <w:rFonts w:ascii="Cambria" w:eastAsia="Times New Roman" w:hAnsi="Cambria" w:cs="Helvetica"/>
-          <w:color w:val="000000"/>
-          <w:sz w:val="24"/>
-          <w:szCs w:val="24"/>
-        </w:rPr>
-      </w:pPr>
-      <w:r>
-        <w:rPr>
-          <w:rFonts w:ascii="Cambria" w:eastAsia="Times New Roman" w:hAnsi="Cambria" w:cs="Helvetica"/>
-          <w:color w:val="000000"/>
-          <w:sz w:val="24"/>
-          <w:szCs w:val="24"/>
-        </w:rPr>
-        <w:t>Special Key ( “^”) to Duplicate Letter.</w:t>
       </w:r>
     </w:p>
     <w:p>
@@ -2236,6 +2212,19 @@
           <w:szCs w:val="24"/>
         </w:rPr>
       </w:pPr>
+    </w:p>
+    <w:p>
+      <w:pPr>
+        <w:shd w:val="clear" w:color="auto" w:fill="FFFFFF"/>
+        <w:spacing w:after="0" w:line="240" w:lineRule="auto"/>
+        <w:jc w:val="center"/>
+        <w:rPr>
+          <w:rFonts w:ascii="GS GeezMahtemUnicode" w:eastAsia="Times New Roman" w:hAnsi="GS GeezMahtemUnicode" w:cs="Nyala"/>
+          <w:color w:val="000000"/>
+          <w:sz w:val="24"/>
+          <w:szCs w:val="24"/>
+        </w:rPr>
+      </w:pPr>
       <w:r>
         <w:rPr>
           <w:rFonts w:ascii="GS GeezMahtemUnicode" w:eastAsia="Times New Roman" w:hAnsi="GS GeezMahtemUnicode" w:cs="Nyala"/>
@@ -2245,11 +2234,1139 @@
           <w:szCs w:val="24"/>
         </w:rPr>
         <w:lastRenderedPageBreak/>
+        <mc:AlternateContent>
+          <mc:Choice Requires="wps">
+            <w:drawing>
+              <wp:anchor distT="0" distB="0" distL="114300" distR="114300" simplePos="0" relativeHeight="251673600" behindDoc="0" locked="0" layoutInCell="1" allowOverlap="1" wp14:anchorId="4F1A907D" wp14:editId="4C804092">
+                <wp:simplePos x="0" y="0"/>
+                <wp:positionH relativeFrom="column">
+                  <wp:posOffset>4207510</wp:posOffset>
+                </wp:positionH>
+                <wp:positionV relativeFrom="paragraph">
+                  <wp:posOffset>1348105</wp:posOffset>
+                </wp:positionV>
+                <wp:extent cx="457200" cy="586105"/>
+                <wp:effectExtent l="63500" t="63500" r="76200" b="74295"/>
+                <wp:wrapNone/>
+                <wp:docPr id="1144703117" name="Rounded Rectangle 5"/>
+                <wp:cNvGraphicFramePr/>
+                <a:graphic xmlns:a="http://schemas.openxmlformats.org/drawingml/2006/main">
+                  <a:graphicData uri="http://schemas.microsoft.com/office/word/2010/wordprocessingShape">
+                    <wps:wsp>
+                      <wps:cNvSpPr/>
+                      <wps:spPr>
+                        <a:xfrm>
+                          <a:off x="0" y="0"/>
+                          <a:ext cx="457200" cy="586105"/>
+                        </a:xfrm>
+                        <a:prstGeom prst="roundRect">
+                          <a:avLst/>
+                        </a:prstGeom>
+                        <a:noFill/>
+                        <a:ln w="25400">
+                          <a:solidFill>
+                            <a:srgbClr val="FF005A"/>
+                          </a:solidFill>
+                        </a:ln>
+                        <a:effectLst>
+                          <a:outerShdw blurRad="50800" dist="12700" dir="2700000" algn="tl" rotWithShape="0">
+                            <a:prstClr val="black">
+                              <a:alpha val="40000"/>
+                            </a:prstClr>
+                          </a:outerShdw>
+                        </a:effectLst>
+                      </wps:spPr>
+                      <wps:style>
+                        <a:lnRef idx="2">
+                          <a:schemeClr val="accent1">
+                            <a:shade val="15000"/>
+                          </a:schemeClr>
+                        </a:lnRef>
+                        <a:fillRef idx="1">
+                          <a:schemeClr val="accent1"/>
+                        </a:fillRef>
+                        <a:effectRef idx="0">
+                          <a:schemeClr val="accent1"/>
+                        </a:effectRef>
+                        <a:fontRef idx="minor">
+                          <a:schemeClr val="lt1"/>
+                        </a:fontRef>
+                      </wps:style>
+                      <wps:bodyPr rot="0" spcFirstLastPara="0" vertOverflow="overflow" horzOverflow="overflow" vert="horz" wrap="square" lIns="91440" tIns="45720" rIns="91440" bIns="45720" numCol="1" spcCol="0" rtlCol="0" fromWordArt="0" anchor="ctr" anchorCtr="0" forceAA="0" compatLnSpc="1">
+                        <a:prstTxWarp prst="textNoShape">
+                          <a:avLst/>
+                        </a:prstTxWarp>
+                        <a:noAutofit/>
+                      </wps:bodyPr>
+                    </wps:wsp>
+                  </a:graphicData>
+                </a:graphic>
+                <wp14:sizeRelH relativeFrom="margin">
+                  <wp14:pctWidth>0</wp14:pctWidth>
+                </wp14:sizeRelH>
+                <wp14:sizeRelV relativeFrom="margin">
+                  <wp14:pctHeight>0</wp14:pctHeight>
+                </wp14:sizeRelV>
+              </wp:anchor>
+            </w:drawing>
+          </mc:Choice>
+          <mc:Fallback>
+            <w:pict>
+              <v:roundrect w14:anchorId="62107016" id="Rounded Rectangle 5" o:spid="_x0000_s1026" style="position:absolute;margin-left:331.3pt;margin-top:106.15pt;width:36pt;height:46.15pt;z-index:251673600;visibility:visible;mso-wrap-style:square;mso-width-percent:0;mso-height-percent:0;mso-wrap-distance-left:9pt;mso-wrap-distance-top:0;mso-wrap-distance-right:9pt;mso-wrap-distance-bottom:0;mso-position-horizontal:absolute;mso-position-horizontal-relative:text;mso-position-vertical:absolute;mso-position-vertical-relative:text;mso-width-percent:0;mso-height-percent:0;mso-width-relative:margin;mso-height-relative:margin;v-text-anchor:middle" arcsize="10923f" o:gfxdata="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" filled="f" strokecolor="#ff005a" strokeweight="2pt">
+                <v:stroke joinstyle="miter"/>
+                <v:shadow on="t" color="black" opacity="26214f" origin="-.5,-.5" offset=".24944mm,.24944mm"/>
+              </v:roundrect>
+            </w:pict>
+          </mc:Fallback>
+        </mc:AlternateContent>
+      </w:r>
+      <w:r>
+        <w:rPr>
+          <w:rFonts w:ascii="GS GeezMahtemUnicode" w:eastAsia="Times New Roman" w:hAnsi="GS GeezMahtemUnicode" w:cs="Nyala"/>
+          <w:noProof/>
+          <w:color w:val="000000"/>
+          <w:sz w:val="24"/>
+          <w:szCs w:val="24"/>
+        </w:rPr>
+        <mc:AlternateContent>
+          <mc:Choice Requires="wps">
+            <w:drawing>
+              <wp:anchor distT="0" distB="0" distL="114300" distR="114300" simplePos="0" relativeHeight="251677696" behindDoc="0" locked="0" layoutInCell="1" allowOverlap="1" wp14:anchorId="3D93F0A0" wp14:editId="5D99EAD5">
+                <wp:simplePos x="0" y="0"/>
+                <wp:positionH relativeFrom="column">
+                  <wp:posOffset>2708910</wp:posOffset>
+                </wp:positionH>
+                <wp:positionV relativeFrom="paragraph">
+                  <wp:posOffset>1351410</wp:posOffset>
+                </wp:positionV>
+                <wp:extent cx="457200" cy="586105"/>
+                <wp:effectExtent l="63500" t="63500" r="76200" b="74295"/>
+                <wp:wrapNone/>
+                <wp:docPr id="359796337" name="Rounded Rectangle 5"/>
+                <wp:cNvGraphicFramePr/>
+                <a:graphic xmlns:a="http://schemas.openxmlformats.org/drawingml/2006/main">
+                  <a:graphicData uri="http://schemas.microsoft.com/office/word/2010/wordprocessingShape">
+                    <wps:wsp>
+                      <wps:cNvSpPr/>
+                      <wps:spPr>
+                        <a:xfrm>
+                          <a:off x="0" y="0"/>
+                          <a:ext cx="457200" cy="586105"/>
+                        </a:xfrm>
+                        <a:prstGeom prst="roundRect">
+                          <a:avLst/>
+                        </a:prstGeom>
+                        <a:noFill/>
+                        <a:ln w="25400">
+                          <a:solidFill>
+                            <a:srgbClr val="FF005A"/>
+                          </a:solidFill>
+                        </a:ln>
+                        <a:effectLst>
+                          <a:outerShdw blurRad="50800" dist="12700" dir="2700000" algn="tl" rotWithShape="0">
+                            <a:prstClr val="black">
+                              <a:alpha val="40000"/>
+                            </a:prstClr>
+                          </a:outerShdw>
+                        </a:effectLst>
+                      </wps:spPr>
+                      <wps:style>
+                        <a:lnRef idx="2">
+                          <a:schemeClr val="accent1">
+                            <a:shade val="15000"/>
+                          </a:schemeClr>
+                        </a:lnRef>
+                        <a:fillRef idx="1">
+                          <a:schemeClr val="accent1"/>
+                        </a:fillRef>
+                        <a:effectRef idx="0">
+                          <a:schemeClr val="accent1"/>
+                        </a:effectRef>
+                        <a:fontRef idx="minor">
+                          <a:schemeClr val="lt1"/>
+                        </a:fontRef>
+                      </wps:style>
+                      <wps:bodyPr rot="0" spcFirstLastPara="0" vertOverflow="overflow" horzOverflow="overflow" vert="horz" wrap="square" lIns="91440" tIns="45720" rIns="91440" bIns="45720" numCol="1" spcCol="0" rtlCol="0" fromWordArt="0" anchor="ctr" anchorCtr="0" forceAA="0" compatLnSpc="1">
+                        <a:prstTxWarp prst="textNoShape">
+                          <a:avLst/>
+                        </a:prstTxWarp>
+                        <a:noAutofit/>
+                      </wps:bodyPr>
+                    </wps:wsp>
+                  </a:graphicData>
+                </a:graphic>
+                <wp14:sizeRelH relativeFrom="margin">
+                  <wp14:pctWidth>0</wp14:pctWidth>
+                </wp14:sizeRelH>
+                <wp14:sizeRelV relativeFrom="margin">
+                  <wp14:pctHeight>0</wp14:pctHeight>
+                </wp14:sizeRelV>
+              </wp:anchor>
+            </w:drawing>
+          </mc:Choice>
+          <mc:Fallback>
+            <w:pict>
+              <v:roundrect w14:anchorId="2DDC630F" id="Rounded Rectangle 5" o:spid="_x0000_s1026" style="position:absolute;margin-left:213.3pt;margin-top:106.4pt;width:36pt;height:46.15pt;z-index:251677696;visibility:visible;mso-wrap-style:square;mso-width-percent:0;mso-height-percent:0;mso-wrap-distance-left:9pt;mso-wrap-distance-top:0;mso-wrap-distance-right:9pt;mso-wrap-distance-bottom:0;mso-position-horizontal:absolute;mso-position-horizontal-relative:text;mso-position-vertical:absolute;mso-position-vertical-relative:text;mso-width-percent:0;mso-height-percent:0;mso-width-relative:margin;mso-height-relative:margin;v-text-anchor:middle" arcsize="10923f" o:gfxdata="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" filled="f" strokecolor="#ff005a" strokeweight="2pt">
+                <v:stroke joinstyle="miter"/>
+                <v:shadow on="t" color="black" opacity="26214f" origin="-.5,-.5" offset=".24944mm,.24944mm"/>
+              </v:roundrect>
+            </w:pict>
+          </mc:Fallback>
+        </mc:AlternateContent>
+      </w:r>
+      <w:r>
+        <w:rPr>
+          <w:rFonts w:ascii="GS GeezMahtemUnicode" w:eastAsia="Times New Roman" w:hAnsi="GS GeezMahtemUnicode" w:cs="Nyala"/>
+          <w:noProof/>
+          <w:color w:val="000000"/>
+          <w:sz w:val="24"/>
+          <w:szCs w:val="24"/>
+        </w:rPr>
+        <mc:AlternateContent>
+          <mc:Choice Requires="wps">
+            <w:drawing>
+              <wp:anchor distT="0" distB="0" distL="114300" distR="114300" simplePos="0" relativeHeight="251670528" behindDoc="0" locked="0" layoutInCell="1" allowOverlap="1" wp14:anchorId="46EDD801" wp14:editId="338C7624">
+                <wp:simplePos x="0" y="0"/>
+                <wp:positionH relativeFrom="column">
+                  <wp:posOffset>700405</wp:posOffset>
+                </wp:positionH>
+                <wp:positionV relativeFrom="paragraph">
+                  <wp:posOffset>682625</wp:posOffset>
+                </wp:positionV>
+                <wp:extent cx="457200" cy="586105"/>
+                <wp:effectExtent l="63500" t="63500" r="76200" b="74295"/>
+                <wp:wrapNone/>
+                <wp:docPr id="1675662279" name="Rounded Rectangle 5"/>
+                <wp:cNvGraphicFramePr/>
+                <a:graphic xmlns:a="http://schemas.openxmlformats.org/drawingml/2006/main">
+                  <a:graphicData uri="http://schemas.microsoft.com/office/word/2010/wordprocessingShape">
+                    <wps:wsp>
+                      <wps:cNvSpPr/>
+                      <wps:spPr>
+                        <a:xfrm>
+                          <a:off x="0" y="0"/>
+                          <a:ext cx="457200" cy="586105"/>
+                        </a:xfrm>
+                        <a:prstGeom prst="roundRect">
+                          <a:avLst/>
+                        </a:prstGeom>
+                        <a:noFill/>
+                        <a:ln w="25400">
+                          <a:solidFill>
+                            <a:srgbClr val="FF005A"/>
+                          </a:solidFill>
+                        </a:ln>
+                        <a:effectLst>
+                          <a:outerShdw blurRad="50800" dist="12700" dir="2700000" algn="tl" rotWithShape="0">
+                            <a:prstClr val="black">
+                              <a:alpha val="40000"/>
+                            </a:prstClr>
+                          </a:outerShdw>
+                        </a:effectLst>
+                      </wps:spPr>
+                      <wps:style>
+                        <a:lnRef idx="2">
+                          <a:schemeClr val="accent1">
+                            <a:shade val="15000"/>
+                          </a:schemeClr>
+                        </a:lnRef>
+                        <a:fillRef idx="1">
+                          <a:schemeClr val="accent1"/>
+                        </a:fillRef>
+                        <a:effectRef idx="0">
+                          <a:schemeClr val="accent1"/>
+                        </a:effectRef>
+                        <a:fontRef idx="minor">
+                          <a:schemeClr val="lt1"/>
+                        </a:fontRef>
+                      </wps:style>
+                      <wps:bodyPr rot="0" spcFirstLastPara="0" vertOverflow="overflow" horzOverflow="overflow" vert="horz" wrap="square" lIns="91440" tIns="45720" rIns="91440" bIns="45720" numCol="1" spcCol="0" rtlCol="0" fromWordArt="0" anchor="ctr" anchorCtr="0" forceAA="0" compatLnSpc="1">
+                        <a:prstTxWarp prst="textNoShape">
+                          <a:avLst/>
+                        </a:prstTxWarp>
+                        <a:noAutofit/>
+                      </wps:bodyPr>
+                    </wps:wsp>
+                  </a:graphicData>
+                </a:graphic>
+                <wp14:sizeRelH relativeFrom="margin">
+                  <wp14:pctWidth>0</wp14:pctWidth>
+                </wp14:sizeRelH>
+                <wp14:sizeRelV relativeFrom="margin">
+                  <wp14:pctHeight>0</wp14:pctHeight>
+                </wp14:sizeRelV>
+              </wp:anchor>
+            </w:drawing>
+          </mc:Choice>
+          <mc:Fallback>
+            <w:pict>
+              <v:roundrect w14:anchorId="14174C25" id="Rounded Rectangle 5" o:spid="_x0000_s1026" style="position:absolute;margin-left:55.15pt;margin-top:53.75pt;width:36pt;height:46.15pt;z-index:251670528;visibility:visible;mso-wrap-style:square;mso-width-percent:0;mso-height-percent:0;mso-wrap-distance-left:9pt;mso-wrap-distance-top:0;mso-wrap-distance-right:9pt;mso-wrap-distance-bottom:0;mso-position-horizontal:absolute;mso-position-horizontal-relative:text;mso-position-vertical:absolute;mso-position-vertical-relative:text;mso-width-percent:0;mso-height-percent:0;mso-width-relative:margin;mso-height-relative:margin;v-text-anchor:middle" arcsize="10923f" o:gfxdata="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" filled="f" strokecolor="#ff005a" strokeweight="2pt">
+                <v:stroke joinstyle="miter"/>
+                <v:shadow on="t" color="black" opacity="26214f" origin="-.5,-.5" offset=".24944mm,.24944mm"/>
+              </v:roundrect>
+            </w:pict>
+          </mc:Fallback>
+        </mc:AlternateContent>
+      </w:r>
+      <w:r>
+        <w:rPr>
+          <w:rFonts w:ascii="GS GeezMahtemUnicode" w:eastAsia="Times New Roman" w:hAnsi="GS GeezMahtemUnicode" w:cs="Nyala"/>
+          <w:noProof/>
+          <w:color w:val="000000"/>
+          <w:sz w:val="24"/>
+          <w:szCs w:val="24"/>
+        </w:rPr>
+        <mc:AlternateContent>
+          <mc:Choice Requires="wps">
+            <w:drawing>
+              <wp:anchor distT="0" distB="0" distL="114300" distR="114300" simplePos="0" relativeHeight="251672576" behindDoc="0" locked="0" layoutInCell="1" allowOverlap="1" wp14:anchorId="1DA4D35D" wp14:editId="4CD13945">
+                <wp:simplePos x="0" y="0"/>
+                <wp:positionH relativeFrom="column">
+                  <wp:posOffset>5202050</wp:posOffset>
+                </wp:positionH>
+                <wp:positionV relativeFrom="paragraph">
+                  <wp:posOffset>687070</wp:posOffset>
+                </wp:positionV>
+                <wp:extent cx="457200" cy="586105"/>
+                <wp:effectExtent l="63500" t="63500" r="76200" b="74295"/>
+                <wp:wrapNone/>
+                <wp:docPr id="369019837" name="Rounded Rectangle 5"/>
+                <wp:cNvGraphicFramePr/>
+                <a:graphic xmlns:a="http://schemas.openxmlformats.org/drawingml/2006/main">
+                  <a:graphicData uri="http://schemas.microsoft.com/office/word/2010/wordprocessingShape">
+                    <wps:wsp>
+                      <wps:cNvSpPr/>
+                      <wps:spPr>
+                        <a:xfrm>
+                          <a:off x="0" y="0"/>
+                          <a:ext cx="457200" cy="586105"/>
+                        </a:xfrm>
+                        <a:prstGeom prst="roundRect">
+                          <a:avLst/>
+                        </a:prstGeom>
+                        <a:noFill/>
+                        <a:ln w="25400">
+                          <a:solidFill>
+                            <a:srgbClr val="FF005A"/>
+                          </a:solidFill>
+                        </a:ln>
+                        <a:effectLst>
+                          <a:outerShdw blurRad="50800" dist="12700" dir="2700000" algn="tl" rotWithShape="0">
+                            <a:prstClr val="black">
+                              <a:alpha val="40000"/>
+                            </a:prstClr>
+                          </a:outerShdw>
+                        </a:effectLst>
+                      </wps:spPr>
+                      <wps:style>
+                        <a:lnRef idx="2">
+                          <a:schemeClr val="accent1">
+                            <a:shade val="15000"/>
+                          </a:schemeClr>
+                        </a:lnRef>
+                        <a:fillRef idx="1">
+                          <a:schemeClr val="accent1"/>
+                        </a:fillRef>
+                        <a:effectRef idx="0">
+                          <a:schemeClr val="accent1"/>
+                        </a:effectRef>
+                        <a:fontRef idx="minor">
+                          <a:schemeClr val="lt1"/>
+                        </a:fontRef>
+                      </wps:style>
+                      <wps:bodyPr rot="0" spcFirstLastPara="0" vertOverflow="overflow" horzOverflow="overflow" vert="horz" wrap="square" lIns="91440" tIns="45720" rIns="91440" bIns="45720" numCol="1" spcCol="0" rtlCol="0" fromWordArt="0" anchor="ctr" anchorCtr="0" forceAA="0" compatLnSpc="1">
+                        <a:prstTxWarp prst="textNoShape">
+                          <a:avLst/>
+                        </a:prstTxWarp>
+                        <a:noAutofit/>
+                      </wps:bodyPr>
+                    </wps:wsp>
+                  </a:graphicData>
+                </a:graphic>
+                <wp14:sizeRelH relativeFrom="margin">
+                  <wp14:pctWidth>0</wp14:pctWidth>
+                </wp14:sizeRelH>
+                <wp14:sizeRelV relativeFrom="margin">
+                  <wp14:pctHeight>0</wp14:pctHeight>
+                </wp14:sizeRelV>
+              </wp:anchor>
+            </w:drawing>
+          </mc:Choice>
+          <mc:Fallback>
+            <w:pict>
+              <v:roundrect w14:anchorId="6AF86775" id="Rounded Rectangle 5" o:spid="_x0000_s1026" style="position:absolute;margin-left:409.6pt;margin-top:54.1pt;width:36pt;height:46.15pt;z-index:251672576;visibility:visible;mso-wrap-style:square;mso-width-percent:0;mso-height-percent:0;mso-wrap-distance-left:9pt;mso-wrap-distance-top:0;mso-wrap-distance-right:9pt;mso-wrap-distance-bottom:0;mso-position-horizontal:absolute;mso-position-horizontal-relative:text;mso-position-vertical:absolute;mso-position-vertical-relative:text;mso-width-percent:0;mso-height-percent:0;mso-width-relative:margin;mso-height-relative:margin;v-text-anchor:middle" arcsize="10923f" o:gfxdata="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" filled="f" strokecolor="#ff005a" strokeweight="2pt">
+                <v:stroke joinstyle="miter"/>
+                <v:shadow on="t" color="black" opacity="26214f" origin="-.5,-.5" offset=".24944mm,.24944mm"/>
+              </v:roundrect>
+            </w:pict>
+          </mc:Fallback>
+        </mc:AlternateContent>
+      </w:r>
+      <w:r>
+        <w:rPr>
+          <w:rFonts w:ascii="GS GeezMahtemUnicode" w:eastAsia="Times New Roman" w:hAnsi="GS GeezMahtemUnicode" w:cs="Nyala"/>
+          <w:noProof/>
+          <w:color w:val="000000"/>
+          <w:sz w:val="24"/>
+          <w:szCs w:val="24"/>
+        </w:rPr>
+        <mc:AlternateContent>
+          <mc:Choice Requires="wps">
+            <w:drawing>
+              <wp:anchor distT="0" distB="0" distL="114300" distR="114300" simplePos="0" relativeHeight="251671552" behindDoc="0" locked="0" layoutInCell="1" allowOverlap="1" wp14:anchorId="4C2CC9C6" wp14:editId="60723CFA">
+                <wp:simplePos x="0" y="0"/>
+                <wp:positionH relativeFrom="column">
+                  <wp:posOffset>2714625</wp:posOffset>
+                </wp:positionH>
+                <wp:positionV relativeFrom="paragraph">
+                  <wp:posOffset>685670</wp:posOffset>
+                </wp:positionV>
+                <wp:extent cx="457200" cy="586105"/>
+                <wp:effectExtent l="63500" t="63500" r="76200" b="74295"/>
+                <wp:wrapNone/>
+                <wp:docPr id="862866833" name="Rounded Rectangle 5"/>
+                <wp:cNvGraphicFramePr/>
+                <a:graphic xmlns:a="http://schemas.openxmlformats.org/drawingml/2006/main">
+                  <a:graphicData uri="http://schemas.microsoft.com/office/word/2010/wordprocessingShape">
+                    <wps:wsp>
+                      <wps:cNvSpPr/>
+                      <wps:spPr>
+                        <a:xfrm>
+                          <a:off x="0" y="0"/>
+                          <a:ext cx="457200" cy="586105"/>
+                        </a:xfrm>
+                        <a:prstGeom prst="roundRect">
+                          <a:avLst/>
+                        </a:prstGeom>
+                        <a:noFill/>
+                        <a:ln w="25400">
+                          <a:solidFill>
+                            <a:srgbClr val="FF005A"/>
+                          </a:solidFill>
+                        </a:ln>
+                        <a:effectLst>
+                          <a:outerShdw blurRad="50800" dist="12700" dir="2700000" algn="tl" rotWithShape="0">
+                            <a:prstClr val="black">
+                              <a:alpha val="40000"/>
+                            </a:prstClr>
+                          </a:outerShdw>
+                        </a:effectLst>
+                      </wps:spPr>
+                      <wps:style>
+                        <a:lnRef idx="2">
+                          <a:schemeClr val="accent1">
+                            <a:shade val="15000"/>
+                          </a:schemeClr>
+                        </a:lnRef>
+                        <a:fillRef idx="1">
+                          <a:schemeClr val="accent1"/>
+                        </a:fillRef>
+                        <a:effectRef idx="0">
+                          <a:schemeClr val="accent1"/>
+                        </a:effectRef>
+                        <a:fontRef idx="minor">
+                          <a:schemeClr val="lt1"/>
+                        </a:fontRef>
+                      </wps:style>
+                      <wps:bodyPr rot="0" spcFirstLastPara="0" vertOverflow="overflow" horzOverflow="overflow" vert="horz" wrap="square" lIns="91440" tIns="45720" rIns="91440" bIns="45720" numCol="1" spcCol="0" rtlCol="0" fromWordArt="0" anchor="ctr" anchorCtr="0" forceAA="0" compatLnSpc="1">
+                        <a:prstTxWarp prst="textNoShape">
+                          <a:avLst/>
+                        </a:prstTxWarp>
+                        <a:noAutofit/>
+                      </wps:bodyPr>
+                    </wps:wsp>
+                  </a:graphicData>
+                </a:graphic>
+                <wp14:sizeRelH relativeFrom="margin">
+                  <wp14:pctWidth>0</wp14:pctWidth>
+                </wp14:sizeRelH>
+                <wp14:sizeRelV relativeFrom="margin">
+                  <wp14:pctHeight>0</wp14:pctHeight>
+                </wp14:sizeRelV>
+              </wp:anchor>
+            </w:drawing>
+          </mc:Choice>
+          <mc:Fallback>
+            <w:pict>
+              <v:roundrect w14:anchorId="1E33D17D" id="Rounded Rectangle 5" o:spid="_x0000_s1026" style="position:absolute;margin-left:213.75pt;margin-top:54pt;width:36pt;height:46.15pt;z-index:251671552;visibility:visible;mso-wrap-style:square;mso-width-percent:0;mso-height-percent:0;mso-wrap-distance-left:9pt;mso-wrap-distance-top:0;mso-wrap-distance-right:9pt;mso-wrap-distance-bottom:0;mso-position-horizontal:absolute;mso-position-horizontal-relative:text;mso-position-vertical:absolute;mso-position-vertical-relative:text;mso-width-percent:0;mso-height-percent:0;mso-width-relative:margin;mso-height-relative:margin;v-text-anchor:middle" arcsize="10923f" o:gfxdata="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" filled="f" strokecolor="#ff005a" strokeweight="2pt">
+                <v:stroke joinstyle="miter"/>
+                <v:shadow on="t" color="black" opacity="26214f" origin="-.5,-.5" offset=".24944mm,.24944mm"/>
+              </v:roundrect>
+            </w:pict>
+          </mc:Fallback>
+        </mc:AlternateContent>
+      </w:r>
+      <w:r>
+        <w:rPr>
+          <w:rFonts w:ascii="GS GeezMahtemUnicode" w:eastAsia="Times New Roman" w:hAnsi="GS GeezMahtemUnicode" w:cs="Nyala"/>
+          <w:noProof/>
+          <w:color w:val="000000"/>
+          <w:sz w:val="24"/>
+          <w:szCs w:val="24"/>
+        </w:rPr>
+        <mc:AlternateContent>
+          <mc:Choice Requires="wps">
+            <w:drawing>
+              <wp:anchor distT="0" distB="0" distL="114300" distR="114300" simplePos="0" relativeHeight="251675648" behindDoc="0" locked="0" layoutInCell="1" allowOverlap="1" wp14:anchorId="7B98E819" wp14:editId="573565F2">
+                <wp:simplePos x="0" y="0"/>
+                <wp:positionH relativeFrom="column">
+                  <wp:posOffset>3693795</wp:posOffset>
+                </wp:positionH>
+                <wp:positionV relativeFrom="paragraph">
+                  <wp:posOffset>2019805</wp:posOffset>
+                </wp:positionV>
+                <wp:extent cx="457200" cy="586105"/>
+                <wp:effectExtent l="63500" t="63500" r="76200" b="74295"/>
+                <wp:wrapNone/>
+                <wp:docPr id="1428194338" name="Rounded Rectangle 5"/>
+                <wp:cNvGraphicFramePr/>
+                <a:graphic xmlns:a="http://schemas.openxmlformats.org/drawingml/2006/main">
+                  <a:graphicData uri="http://schemas.microsoft.com/office/word/2010/wordprocessingShape">
+                    <wps:wsp>
+                      <wps:cNvSpPr/>
+                      <wps:spPr>
+                        <a:xfrm>
+                          <a:off x="0" y="0"/>
+                          <a:ext cx="457200" cy="586105"/>
+                        </a:xfrm>
+                        <a:prstGeom prst="roundRect">
+                          <a:avLst/>
+                        </a:prstGeom>
+                        <a:noFill/>
+                        <a:ln w="25400">
+                          <a:solidFill>
+                            <a:srgbClr val="FF005A"/>
+                          </a:solidFill>
+                        </a:ln>
+                        <a:effectLst>
+                          <a:outerShdw blurRad="50800" dist="12700" dir="2700000" algn="tl" rotWithShape="0">
+                            <a:prstClr val="black">
+                              <a:alpha val="40000"/>
+                            </a:prstClr>
+                          </a:outerShdw>
+                        </a:effectLst>
+                      </wps:spPr>
+                      <wps:style>
+                        <a:lnRef idx="2">
+                          <a:schemeClr val="accent1">
+                            <a:shade val="15000"/>
+                          </a:schemeClr>
+                        </a:lnRef>
+                        <a:fillRef idx="1">
+                          <a:schemeClr val="accent1"/>
+                        </a:fillRef>
+                        <a:effectRef idx="0">
+                          <a:schemeClr val="accent1"/>
+                        </a:effectRef>
+                        <a:fontRef idx="minor">
+                          <a:schemeClr val="lt1"/>
+                        </a:fontRef>
+                      </wps:style>
+                      <wps:bodyPr rot="0" spcFirstLastPara="0" vertOverflow="overflow" horzOverflow="overflow" vert="horz" wrap="square" lIns="91440" tIns="45720" rIns="91440" bIns="45720" numCol="1" spcCol="0" rtlCol="0" fromWordArt="0" anchor="ctr" anchorCtr="0" forceAA="0" compatLnSpc="1">
+                        <a:prstTxWarp prst="textNoShape">
+                          <a:avLst/>
+                        </a:prstTxWarp>
+                        <a:noAutofit/>
+                      </wps:bodyPr>
+                    </wps:wsp>
+                  </a:graphicData>
+                </a:graphic>
+                <wp14:sizeRelH relativeFrom="margin">
+                  <wp14:pctWidth>0</wp14:pctWidth>
+                </wp14:sizeRelH>
+                <wp14:sizeRelV relativeFrom="margin">
+                  <wp14:pctHeight>0</wp14:pctHeight>
+                </wp14:sizeRelV>
+              </wp:anchor>
+            </w:drawing>
+          </mc:Choice>
+          <mc:Fallback>
+            <w:pict>
+              <v:roundrect w14:anchorId="0BC875AF" id="Rounded Rectangle 5" o:spid="_x0000_s1026" style="position:absolute;margin-left:290.85pt;margin-top:159.05pt;width:36pt;height:46.15pt;z-index:251675648;visibility:visible;mso-wrap-style:square;mso-width-percent:0;mso-height-percent:0;mso-wrap-distance-left:9pt;mso-wrap-distance-top:0;mso-wrap-distance-right:9pt;mso-wrap-distance-bottom:0;mso-position-horizontal:absolute;mso-position-horizontal-relative:text;mso-position-vertical:absolute;mso-position-vertical-relative:text;mso-width-percent:0;mso-height-percent:0;mso-width-relative:margin;mso-height-relative:margin;v-text-anchor:middle" arcsize="10923f" o:gfxdata="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" filled="f" strokecolor="#ff005a" strokeweight="2pt">
+                <v:stroke joinstyle="miter"/>
+                <v:shadow on="t" color="black" opacity="26214f" origin="-.5,-.5" offset=".24944mm,.24944mm"/>
+              </v:roundrect>
+            </w:pict>
+          </mc:Fallback>
+        </mc:AlternateContent>
+      </w:r>
+      <w:r>
+        <w:rPr>
+          <w:rFonts w:ascii="GS GeezMahtemUnicode" w:eastAsia="Times New Roman" w:hAnsi="GS GeezMahtemUnicode" w:cs="Nyala"/>
+          <w:noProof/>
+          <w:color w:val="000000"/>
+          <w:sz w:val="24"/>
+          <w:szCs w:val="24"/>
+        </w:rPr>
+        <mc:AlternateContent>
+          <mc:Choice Requires="wps">
+            <w:drawing>
+              <wp:anchor distT="0" distB="0" distL="114300" distR="114300" simplePos="0" relativeHeight="251674624" behindDoc="0" locked="0" layoutInCell="1" allowOverlap="1" wp14:anchorId="4EDB4E48" wp14:editId="53241118">
+                <wp:simplePos x="0" y="0"/>
+                <wp:positionH relativeFrom="column">
+                  <wp:posOffset>3217040</wp:posOffset>
+                </wp:positionH>
+                <wp:positionV relativeFrom="paragraph">
+                  <wp:posOffset>1351915</wp:posOffset>
+                </wp:positionV>
+                <wp:extent cx="457200" cy="586105"/>
+                <wp:effectExtent l="63500" t="63500" r="76200" b="74295"/>
+                <wp:wrapNone/>
+                <wp:docPr id="1447239645" name="Rounded Rectangle 5"/>
+                <wp:cNvGraphicFramePr/>
+                <a:graphic xmlns:a="http://schemas.openxmlformats.org/drawingml/2006/main">
+                  <a:graphicData uri="http://schemas.microsoft.com/office/word/2010/wordprocessingShape">
+                    <wps:wsp>
+                      <wps:cNvSpPr/>
+                      <wps:spPr>
+                        <a:xfrm>
+                          <a:off x="0" y="0"/>
+                          <a:ext cx="457200" cy="586105"/>
+                        </a:xfrm>
+                        <a:prstGeom prst="roundRect">
+                          <a:avLst/>
+                        </a:prstGeom>
+                        <a:noFill/>
+                        <a:ln w="25400">
+                          <a:solidFill>
+                            <a:srgbClr val="FF005A"/>
+                          </a:solidFill>
+                        </a:ln>
+                        <a:effectLst>
+                          <a:outerShdw blurRad="50800" dist="12700" dir="2700000" algn="tl" rotWithShape="0">
+                            <a:prstClr val="black">
+                              <a:alpha val="40000"/>
+                            </a:prstClr>
+                          </a:outerShdw>
+                        </a:effectLst>
+                      </wps:spPr>
+                      <wps:style>
+                        <a:lnRef idx="2">
+                          <a:schemeClr val="accent1">
+                            <a:shade val="15000"/>
+                          </a:schemeClr>
+                        </a:lnRef>
+                        <a:fillRef idx="1">
+                          <a:schemeClr val="accent1"/>
+                        </a:fillRef>
+                        <a:effectRef idx="0">
+                          <a:schemeClr val="accent1"/>
+                        </a:effectRef>
+                        <a:fontRef idx="minor">
+                          <a:schemeClr val="lt1"/>
+                        </a:fontRef>
+                      </wps:style>
+                      <wps:bodyPr rot="0" spcFirstLastPara="0" vertOverflow="overflow" horzOverflow="overflow" vert="horz" wrap="square" lIns="91440" tIns="45720" rIns="91440" bIns="45720" numCol="1" spcCol="0" rtlCol="0" fromWordArt="0" anchor="ctr" anchorCtr="0" forceAA="0" compatLnSpc="1">
+                        <a:prstTxWarp prst="textNoShape">
+                          <a:avLst/>
+                        </a:prstTxWarp>
+                        <a:noAutofit/>
+                      </wps:bodyPr>
+                    </wps:wsp>
+                  </a:graphicData>
+                </a:graphic>
+                <wp14:sizeRelH relativeFrom="margin">
+                  <wp14:pctWidth>0</wp14:pctWidth>
+                </wp14:sizeRelH>
+                <wp14:sizeRelV relativeFrom="margin">
+                  <wp14:pctHeight>0</wp14:pctHeight>
+                </wp14:sizeRelV>
+              </wp:anchor>
+            </w:drawing>
+          </mc:Choice>
+          <mc:Fallback>
+            <w:pict>
+              <v:roundrect w14:anchorId="5636A2A6" id="Rounded Rectangle 5" o:spid="_x0000_s1026" style="position:absolute;margin-left:253.3pt;margin-top:106.45pt;width:36pt;height:46.15pt;z-index:251674624;visibility:visible;mso-wrap-style:square;mso-width-percent:0;mso-height-percent:0;mso-wrap-distance-left:9pt;mso-wrap-distance-top:0;mso-wrap-distance-right:9pt;mso-wrap-distance-bottom:0;mso-position-horizontal:absolute;mso-position-horizontal-relative:text;mso-position-vertical:absolute;mso-position-vertical-relative:text;mso-width-percent:0;mso-height-percent:0;mso-width-relative:margin;mso-height-relative:margin;v-text-anchor:middle" arcsize="10923f" o:gfxdata="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" filled="f" strokecolor="#ff005a" strokeweight="2pt">
+                <v:stroke joinstyle="miter"/>
+                <v:shadow on="t" color="black" opacity="26214f" origin="-.5,-.5" offset=".24944mm,.24944mm"/>
+              </v:roundrect>
+            </w:pict>
+          </mc:Fallback>
+        </mc:AlternateContent>
+      </w:r>
+      <w:r>
+        <w:rPr>
+          <w:rFonts w:ascii="GS GeezMahtemUnicode" w:eastAsia="Times New Roman" w:hAnsi="GS GeezMahtemUnicode" w:cs="Nyala"/>
+          <w:noProof/>
+          <w:color w:val="000000"/>
+          <w:sz w:val="24"/>
+          <w:szCs w:val="24"/>
+        </w:rPr>
+        <mc:AlternateContent>
+          <mc:Choice Requires="wps">
+            <w:drawing>
+              <wp:anchor distT="0" distB="0" distL="114300" distR="114300" simplePos="0" relativeHeight="251679744" behindDoc="0" locked="0" layoutInCell="1" allowOverlap="1" wp14:anchorId="0E6ADC84" wp14:editId="0F1BCED9">
+                <wp:simplePos x="0" y="0"/>
+                <wp:positionH relativeFrom="column">
+                  <wp:posOffset>1202560</wp:posOffset>
+                </wp:positionH>
+                <wp:positionV relativeFrom="paragraph">
+                  <wp:posOffset>1353185</wp:posOffset>
+                </wp:positionV>
+                <wp:extent cx="457200" cy="586105"/>
+                <wp:effectExtent l="63500" t="63500" r="76200" b="74295"/>
+                <wp:wrapNone/>
+                <wp:docPr id="719766292" name="Rounded Rectangle 5"/>
+                <wp:cNvGraphicFramePr/>
+                <a:graphic xmlns:a="http://schemas.openxmlformats.org/drawingml/2006/main">
+                  <a:graphicData uri="http://schemas.microsoft.com/office/word/2010/wordprocessingShape">
+                    <wps:wsp>
+                      <wps:cNvSpPr/>
+                      <wps:spPr>
+                        <a:xfrm>
+                          <a:off x="0" y="0"/>
+                          <a:ext cx="457200" cy="586105"/>
+                        </a:xfrm>
+                        <a:prstGeom prst="roundRect">
+                          <a:avLst/>
+                        </a:prstGeom>
+                        <a:noFill/>
+                        <a:ln w="25400">
+                          <a:solidFill>
+                            <a:srgbClr val="FF005A"/>
+                          </a:solidFill>
+                        </a:ln>
+                        <a:effectLst>
+                          <a:outerShdw blurRad="50800" dist="12700" dir="2700000" algn="tl" rotWithShape="0">
+                            <a:prstClr val="black">
+                              <a:alpha val="40000"/>
+                            </a:prstClr>
+                          </a:outerShdw>
+                        </a:effectLst>
+                      </wps:spPr>
+                      <wps:style>
+                        <a:lnRef idx="2">
+                          <a:schemeClr val="accent1">
+                            <a:shade val="15000"/>
+                          </a:schemeClr>
+                        </a:lnRef>
+                        <a:fillRef idx="1">
+                          <a:schemeClr val="accent1"/>
+                        </a:fillRef>
+                        <a:effectRef idx="0">
+                          <a:schemeClr val="accent1"/>
+                        </a:effectRef>
+                        <a:fontRef idx="minor">
+                          <a:schemeClr val="lt1"/>
+                        </a:fontRef>
+                      </wps:style>
+                      <wps:bodyPr rot="0" spcFirstLastPara="0" vertOverflow="overflow" horzOverflow="overflow" vert="horz" wrap="square" lIns="91440" tIns="45720" rIns="91440" bIns="45720" numCol="1" spcCol="0" rtlCol="0" fromWordArt="0" anchor="ctr" anchorCtr="0" forceAA="0" compatLnSpc="1">
+                        <a:prstTxWarp prst="textNoShape">
+                          <a:avLst/>
+                        </a:prstTxWarp>
+                        <a:noAutofit/>
+                      </wps:bodyPr>
+                    </wps:wsp>
+                  </a:graphicData>
+                </a:graphic>
+                <wp14:sizeRelH relativeFrom="margin">
+                  <wp14:pctWidth>0</wp14:pctWidth>
+                </wp14:sizeRelH>
+                <wp14:sizeRelV relativeFrom="margin">
+                  <wp14:pctHeight>0</wp14:pctHeight>
+                </wp14:sizeRelV>
+              </wp:anchor>
+            </w:drawing>
+          </mc:Choice>
+          <mc:Fallback>
+            <w:pict>
+              <v:roundrect w14:anchorId="7AEE1133" id="Rounded Rectangle 5" o:spid="_x0000_s1026" style="position:absolute;margin-left:94.7pt;margin-top:106.55pt;width:36pt;height:46.15pt;z-index:251679744;visibility:visible;mso-wrap-style:square;mso-width-percent:0;mso-height-percent:0;mso-wrap-distance-left:9pt;mso-wrap-distance-top:0;mso-wrap-distance-right:9pt;mso-wrap-distance-bottom:0;mso-position-horizontal:absolute;mso-position-horizontal-relative:text;mso-position-vertical:absolute;mso-position-vertical-relative:text;mso-width-percent:0;mso-height-percent:0;mso-width-relative:margin;mso-height-relative:margin;v-text-anchor:middle" arcsize="10923f" o:gfxdata="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" filled="f" strokecolor="#ff005a" strokeweight="2pt">
+                <v:stroke joinstyle="miter"/>
+                <v:shadow on="t" color="black" opacity="26214f" origin="-.5,-.5" offset=".24944mm,.24944mm"/>
+              </v:roundrect>
+            </w:pict>
+          </mc:Fallback>
+        </mc:AlternateContent>
+      </w:r>
+      <w:r>
+        <w:rPr>
+          <w:rFonts w:ascii="GS GeezMahtemUnicode" w:eastAsia="Times New Roman" w:hAnsi="GS GeezMahtemUnicode" w:cs="Nyala"/>
+          <w:noProof/>
+          <w:color w:val="000000"/>
+          <w:sz w:val="24"/>
+          <w:szCs w:val="24"/>
+        </w:rPr>
+        <mc:AlternateContent>
+          <mc:Choice Requires="wps">
+            <w:drawing>
+              <wp:anchor distT="0" distB="0" distL="114300" distR="114300" simplePos="0" relativeHeight="251680768" behindDoc="0" locked="0" layoutInCell="1" allowOverlap="1" wp14:anchorId="22FD32F2" wp14:editId="38DB234A">
+                <wp:simplePos x="0" y="0"/>
+                <wp:positionH relativeFrom="column">
+                  <wp:posOffset>1200020</wp:posOffset>
+                </wp:positionH>
+                <wp:positionV relativeFrom="paragraph">
+                  <wp:posOffset>2014855</wp:posOffset>
+                </wp:positionV>
+                <wp:extent cx="457200" cy="586105"/>
+                <wp:effectExtent l="63500" t="63500" r="76200" b="74295"/>
+                <wp:wrapNone/>
+                <wp:docPr id="2136194692" name="Rounded Rectangle 5"/>
+                <wp:cNvGraphicFramePr/>
+                <a:graphic xmlns:a="http://schemas.openxmlformats.org/drawingml/2006/main">
+                  <a:graphicData uri="http://schemas.microsoft.com/office/word/2010/wordprocessingShape">
+                    <wps:wsp>
+                      <wps:cNvSpPr/>
+                      <wps:spPr>
+                        <a:xfrm>
+                          <a:off x="0" y="0"/>
+                          <a:ext cx="457200" cy="586105"/>
+                        </a:xfrm>
+                        <a:prstGeom prst="roundRect">
+                          <a:avLst/>
+                        </a:prstGeom>
+                        <a:noFill/>
+                        <a:ln w="25400">
+                          <a:solidFill>
+                            <a:srgbClr val="FF005A"/>
+                          </a:solidFill>
+                        </a:ln>
+                        <a:effectLst>
+                          <a:outerShdw blurRad="50800" dist="12700" dir="2700000" algn="tl" rotWithShape="0">
+                            <a:prstClr val="black">
+                              <a:alpha val="40000"/>
+                            </a:prstClr>
+                          </a:outerShdw>
+                        </a:effectLst>
+                      </wps:spPr>
+                      <wps:style>
+                        <a:lnRef idx="2">
+                          <a:schemeClr val="accent1">
+                            <a:shade val="15000"/>
+                          </a:schemeClr>
+                        </a:lnRef>
+                        <a:fillRef idx="1">
+                          <a:schemeClr val="accent1"/>
+                        </a:fillRef>
+                        <a:effectRef idx="0">
+                          <a:schemeClr val="accent1"/>
+                        </a:effectRef>
+                        <a:fontRef idx="minor">
+                          <a:schemeClr val="lt1"/>
+                        </a:fontRef>
+                      </wps:style>
+                      <wps:bodyPr rot="0" spcFirstLastPara="0" vertOverflow="overflow" horzOverflow="overflow" vert="horz" wrap="square" lIns="91440" tIns="45720" rIns="91440" bIns="45720" numCol="1" spcCol="0" rtlCol="0" fromWordArt="0" anchor="ctr" anchorCtr="0" forceAA="0" compatLnSpc="1">
+                        <a:prstTxWarp prst="textNoShape">
+                          <a:avLst/>
+                        </a:prstTxWarp>
+                        <a:noAutofit/>
+                      </wps:bodyPr>
+                    </wps:wsp>
+                  </a:graphicData>
+                </a:graphic>
+                <wp14:sizeRelH relativeFrom="margin">
+                  <wp14:pctWidth>0</wp14:pctWidth>
+                </wp14:sizeRelH>
+                <wp14:sizeRelV relativeFrom="margin">
+                  <wp14:pctHeight>0</wp14:pctHeight>
+                </wp14:sizeRelV>
+              </wp:anchor>
+            </w:drawing>
+          </mc:Choice>
+          <mc:Fallback>
+            <w:pict>
+              <v:roundrect w14:anchorId="107D13BC" id="Rounded Rectangle 5" o:spid="_x0000_s1026" style="position:absolute;margin-left:94.5pt;margin-top:158.65pt;width:36pt;height:46.15pt;z-index:251680768;visibility:visible;mso-wrap-style:square;mso-width-percent:0;mso-height-percent:0;mso-wrap-distance-left:9pt;mso-wrap-distance-top:0;mso-wrap-distance-right:9pt;mso-wrap-distance-bottom:0;mso-position-horizontal:absolute;mso-position-horizontal-relative:text;mso-position-vertical:absolute;mso-position-vertical-relative:text;mso-width-percent:0;mso-height-percent:0;mso-width-relative:margin;mso-height-relative:margin;v-text-anchor:middle" arcsize="10923f" o:gfxdata="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" filled="f" strokecolor="#ff005a" strokeweight="2pt">
+                <v:stroke joinstyle="miter"/>
+                <v:shadow on="t" color="black" opacity="26214f" origin="-.5,-.5" offset=".24944mm,.24944mm"/>
+              </v:roundrect>
+            </w:pict>
+          </mc:Fallback>
+        </mc:AlternateContent>
+      </w:r>
+      <w:r>
+        <w:rPr>
+          <w:rFonts w:ascii="GS GeezMahtemUnicode" w:eastAsia="Times New Roman" w:hAnsi="GS GeezMahtemUnicode" w:cs="Nyala"/>
+          <w:noProof/>
+          <w:color w:val="000000"/>
+          <w:sz w:val="24"/>
+          <w:szCs w:val="24"/>
+        </w:rPr>
+        <mc:AlternateContent>
+          <mc:Choice Requires="wps">
+            <w:drawing>
+              <wp:anchor distT="0" distB="0" distL="114300" distR="114300" simplePos="0" relativeHeight="251681792" behindDoc="0" locked="0" layoutInCell="1" allowOverlap="1" wp14:anchorId="76C6F9AB" wp14:editId="49E59A29">
+                <wp:simplePos x="0" y="0"/>
+                <wp:positionH relativeFrom="column">
+                  <wp:posOffset>1696720</wp:posOffset>
+                </wp:positionH>
+                <wp:positionV relativeFrom="paragraph">
+                  <wp:posOffset>2014855</wp:posOffset>
+                </wp:positionV>
+                <wp:extent cx="457200" cy="586105"/>
+                <wp:effectExtent l="63500" t="63500" r="76200" b="74295"/>
+                <wp:wrapNone/>
+                <wp:docPr id="1743578748" name="Rounded Rectangle 5"/>
+                <wp:cNvGraphicFramePr/>
+                <a:graphic xmlns:a="http://schemas.openxmlformats.org/drawingml/2006/main">
+                  <a:graphicData uri="http://schemas.microsoft.com/office/word/2010/wordprocessingShape">
+                    <wps:wsp>
+                      <wps:cNvSpPr/>
+                      <wps:spPr>
+                        <a:xfrm>
+                          <a:off x="0" y="0"/>
+                          <a:ext cx="457200" cy="586105"/>
+                        </a:xfrm>
+                        <a:prstGeom prst="roundRect">
+                          <a:avLst/>
+                        </a:prstGeom>
+                        <a:noFill/>
+                        <a:ln w="25400">
+                          <a:solidFill>
+                            <a:srgbClr val="FF005A"/>
+                          </a:solidFill>
+                        </a:ln>
+                        <a:effectLst>
+                          <a:outerShdw blurRad="50800" dist="12700" dir="2700000" algn="tl" rotWithShape="0">
+                            <a:prstClr val="black">
+                              <a:alpha val="40000"/>
+                            </a:prstClr>
+                          </a:outerShdw>
+                        </a:effectLst>
+                      </wps:spPr>
+                      <wps:style>
+                        <a:lnRef idx="2">
+                          <a:schemeClr val="accent1">
+                            <a:shade val="15000"/>
+                          </a:schemeClr>
+                        </a:lnRef>
+                        <a:fillRef idx="1">
+                          <a:schemeClr val="accent1"/>
+                        </a:fillRef>
+                        <a:effectRef idx="0">
+                          <a:schemeClr val="accent1"/>
+                        </a:effectRef>
+                        <a:fontRef idx="minor">
+                          <a:schemeClr val="lt1"/>
+                        </a:fontRef>
+                      </wps:style>
+                      <wps:bodyPr rot="0" spcFirstLastPara="0" vertOverflow="overflow" horzOverflow="overflow" vert="horz" wrap="square" lIns="91440" tIns="45720" rIns="91440" bIns="45720" numCol="1" spcCol="0" rtlCol="0" fromWordArt="0" anchor="ctr" anchorCtr="0" forceAA="0" compatLnSpc="1">
+                        <a:prstTxWarp prst="textNoShape">
+                          <a:avLst/>
+                        </a:prstTxWarp>
+                        <a:noAutofit/>
+                      </wps:bodyPr>
+                    </wps:wsp>
+                  </a:graphicData>
+                </a:graphic>
+                <wp14:sizeRelH relativeFrom="margin">
+                  <wp14:pctWidth>0</wp14:pctWidth>
+                </wp14:sizeRelH>
+                <wp14:sizeRelV relativeFrom="margin">
+                  <wp14:pctHeight>0</wp14:pctHeight>
+                </wp14:sizeRelV>
+              </wp:anchor>
+            </w:drawing>
+          </mc:Choice>
+          <mc:Fallback>
+            <w:pict>
+              <v:roundrect w14:anchorId="08A2E933" id="Rounded Rectangle 5" o:spid="_x0000_s1026" style="position:absolute;margin-left:133.6pt;margin-top:158.65pt;width:36pt;height:46.15pt;z-index:251681792;visibility:visible;mso-wrap-style:square;mso-width-percent:0;mso-height-percent:0;mso-wrap-distance-left:9pt;mso-wrap-distance-top:0;mso-wrap-distance-right:9pt;mso-wrap-distance-bottom:0;mso-position-horizontal:absolute;mso-position-horizontal-relative:text;mso-position-vertical:absolute;mso-position-vertical-relative:text;mso-width-percent:0;mso-height-percent:0;mso-width-relative:margin;mso-height-relative:margin;v-text-anchor:middle" arcsize="10923f" o:gfxdata="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" filled="f" strokecolor="#ff005a" strokeweight="2pt">
+                <v:stroke joinstyle="miter"/>
+                <v:shadow on="t" color="black" opacity="26214f" origin="-.5,-.5" offset=".24944mm,.24944mm"/>
+              </v:roundrect>
+            </w:pict>
+          </mc:Fallback>
+        </mc:AlternateContent>
+      </w:r>
+      <w:r>
+        <w:rPr>
+          <w:rFonts w:ascii="GS GeezMahtemUnicode" w:eastAsia="Times New Roman" w:hAnsi="GS GeezMahtemUnicode" w:cs="Nyala"/>
+          <w:noProof/>
+          <w:color w:val="000000"/>
+          <w:sz w:val="24"/>
+          <w:szCs w:val="24"/>
+        </w:rPr>
+        <mc:AlternateContent>
+          <mc:Choice Requires="wps">
+            <w:drawing>
+              <wp:anchor distT="0" distB="0" distL="114300" distR="114300" simplePos="0" relativeHeight="251676672" behindDoc="0" locked="0" layoutInCell="1" allowOverlap="1" wp14:anchorId="6F3FB6E8" wp14:editId="0857ED4A">
+                <wp:simplePos x="0" y="0"/>
+                <wp:positionH relativeFrom="column">
+                  <wp:posOffset>2213105</wp:posOffset>
+                </wp:positionH>
+                <wp:positionV relativeFrom="paragraph">
+                  <wp:posOffset>2018030</wp:posOffset>
+                </wp:positionV>
+                <wp:extent cx="457200" cy="586105"/>
+                <wp:effectExtent l="63500" t="63500" r="76200" b="74295"/>
+                <wp:wrapNone/>
+                <wp:docPr id="2095434410" name="Rounded Rectangle 5"/>
+                <wp:cNvGraphicFramePr/>
+                <a:graphic xmlns:a="http://schemas.openxmlformats.org/drawingml/2006/main">
+                  <a:graphicData uri="http://schemas.microsoft.com/office/word/2010/wordprocessingShape">
+                    <wps:wsp>
+                      <wps:cNvSpPr/>
+                      <wps:spPr>
+                        <a:xfrm>
+                          <a:off x="0" y="0"/>
+                          <a:ext cx="457200" cy="586105"/>
+                        </a:xfrm>
+                        <a:prstGeom prst="roundRect">
+                          <a:avLst/>
+                        </a:prstGeom>
+                        <a:noFill/>
+                        <a:ln w="25400">
+                          <a:solidFill>
+                            <a:srgbClr val="FF005A"/>
+                          </a:solidFill>
+                        </a:ln>
+                        <a:effectLst>
+                          <a:outerShdw blurRad="50800" dist="12700" dir="2700000" algn="tl" rotWithShape="0">
+                            <a:prstClr val="black">
+                              <a:alpha val="40000"/>
+                            </a:prstClr>
+                          </a:outerShdw>
+                        </a:effectLst>
+                      </wps:spPr>
+                      <wps:style>
+                        <a:lnRef idx="2">
+                          <a:schemeClr val="accent1">
+                            <a:shade val="15000"/>
+                          </a:schemeClr>
+                        </a:lnRef>
+                        <a:fillRef idx="1">
+                          <a:schemeClr val="accent1"/>
+                        </a:fillRef>
+                        <a:effectRef idx="0">
+                          <a:schemeClr val="accent1"/>
+                        </a:effectRef>
+                        <a:fontRef idx="minor">
+                          <a:schemeClr val="lt1"/>
+                        </a:fontRef>
+                      </wps:style>
+                      <wps:bodyPr rot="0" spcFirstLastPara="0" vertOverflow="overflow" horzOverflow="overflow" vert="horz" wrap="square" lIns="91440" tIns="45720" rIns="91440" bIns="45720" numCol="1" spcCol="0" rtlCol="0" fromWordArt="0" anchor="ctr" anchorCtr="0" forceAA="0" compatLnSpc="1">
+                        <a:prstTxWarp prst="textNoShape">
+                          <a:avLst/>
+                        </a:prstTxWarp>
+                        <a:noAutofit/>
+                      </wps:bodyPr>
+                    </wps:wsp>
+                  </a:graphicData>
+                </a:graphic>
+                <wp14:sizeRelH relativeFrom="margin">
+                  <wp14:pctWidth>0</wp14:pctWidth>
+                </wp14:sizeRelH>
+                <wp14:sizeRelV relativeFrom="margin">
+                  <wp14:pctHeight>0</wp14:pctHeight>
+                </wp14:sizeRelV>
+              </wp:anchor>
+            </w:drawing>
+          </mc:Choice>
+          <mc:Fallback>
+            <w:pict>
+              <v:roundrect w14:anchorId="0D42D291" id="Rounded Rectangle 5" o:spid="_x0000_s1026" style="position:absolute;margin-left:174.25pt;margin-top:158.9pt;width:36pt;height:46.15pt;z-index:251676672;visibility:visible;mso-wrap-style:square;mso-width-percent:0;mso-height-percent:0;mso-wrap-distance-left:9pt;mso-wrap-distance-top:0;mso-wrap-distance-right:9pt;mso-wrap-distance-bottom:0;mso-position-horizontal:absolute;mso-position-horizontal-relative:text;mso-position-vertical:absolute;mso-position-vertical-relative:text;mso-width-percent:0;mso-height-percent:0;mso-width-relative:margin;mso-height-relative:margin;v-text-anchor:middle" arcsize="10923f" o:gfxdata="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" filled="f" strokecolor="#ff005a" strokeweight="2pt">
+                <v:stroke joinstyle="miter"/>
+                <v:shadow on="t" color="black" opacity="26214f" origin="-.5,-.5" offset=".24944mm,.24944mm"/>
+              </v:roundrect>
+            </w:pict>
+          </mc:Fallback>
+        </mc:AlternateContent>
+      </w:r>
+      <w:r>
+        <w:rPr>
+          <w:rFonts w:ascii="GS GeezMahtemUnicode" w:eastAsia="Times New Roman" w:hAnsi="GS GeezMahtemUnicode" w:cs="Nyala"/>
+          <w:noProof/>
+          <w:color w:val="000000"/>
+          <w:sz w:val="24"/>
+          <w:szCs w:val="24"/>
+        </w:rPr>
+        <mc:AlternateContent>
+          <mc:Choice Requires="wps">
+            <w:drawing>
+              <wp:anchor distT="0" distB="0" distL="114300" distR="114300" simplePos="0" relativeHeight="251678720" behindDoc="0" locked="0" layoutInCell="1" allowOverlap="1" wp14:anchorId="1166DEF5" wp14:editId="59D94E53">
+                <wp:simplePos x="0" y="0"/>
+                <wp:positionH relativeFrom="column">
+                  <wp:posOffset>1699260</wp:posOffset>
+                </wp:positionH>
+                <wp:positionV relativeFrom="paragraph">
+                  <wp:posOffset>1348105</wp:posOffset>
+                </wp:positionV>
+                <wp:extent cx="457200" cy="586105"/>
+                <wp:effectExtent l="63500" t="63500" r="76200" b="74295"/>
+                <wp:wrapNone/>
+                <wp:docPr id="103251635" name="Rounded Rectangle 5"/>
+                <wp:cNvGraphicFramePr/>
+                <a:graphic xmlns:a="http://schemas.openxmlformats.org/drawingml/2006/main">
+                  <a:graphicData uri="http://schemas.microsoft.com/office/word/2010/wordprocessingShape">
+                    <wps:wsp>
+                      <wps:cNvSpPr/>
+                      <wps:spPr>
+                        <a:xfrm>
+                          <a:off x="0" y="0"/>
+                          <a:ext cx="457200" cy="586105"/>
+                        </a:xfrm>
+                        <a:prstGeom prst="roundRect">
+                          <a:avLst/>
+                        </a:prstGeom>
+                        <a:noFill/>
+                        <a:ln w="25400">
+                          <a:solidFill>
+                            <a:srgbClr val="FF005A"/>
+                          </a:solidFill>
+                        </a:ln>
+                        <a:effectLst>
+                          <a:outerShdw blurRad="50800" dist="12700" dir="2700000" algn="tl" rotWithShape="0">
+                            <a:prstClr val="black">
+                              <a:alpha val="40000"/>
+                            </a:prstClr>
+                          </a:outerShdw>
+                        </a:effectLst>
+                      </wps:spPr>
+                      <wps:style>
+                        <a:lnRef idx="2">
+                          <a:schemeClr val="accent1">
+                            <a:shade val="15000"/>
+                          </a:schemeClr>
+                        </a:lnRef>
+                        <a:fillRef idx="1">
+                          <a:schemeClr val="accent1"/>
+                        </a:fillRef>
+                        <a:effectRef idx="0">
+                          <a:schemeClr val="accent1"/>
+                        </a:effectRef>
+                        <a:fontRef idx="minor">
+                          <a:schemeClr val="lt1"/>
+                        </a:fontRef>
+                      </wps:style>
+                      <wps:bodyPr rot="0" spcFirstLastPara="0" vertOverflow="overflow" horzOverflow="overflow" vert="horz" wrap="square" lIns="91440" tIns="45720" rIns="91440" bIns="45720" numCol="1" spcCol="0" rtlCol="0" fromWordArt="0" anchor="ctr" anchorCtr="0" forceAA="0" compatLnSpc="1">
+                        <a:prstTxWarp prst="textNoShape">
+                          <a:avLst/>
+                        </a:prstTxWarp>
+                        <a:noAutofit/>
+                      </wps:bodyPr>
+                    </wps:wsp>
+                  </a:graphicData>
+                </a:graphic>
+                <wp14:sizeRelH relativeFrom="margin">
+                  <wp14:pctWidth>0</wp14:pctWidth>
+                </wp14:sizeRelH>
+                <wp14:sizeRelV relativeFrom="margin">
+                  <wp14:pctHeight>0</wp14:pctHeight>
+                </wp14:sizeRelV>
+              </wp:anchor>
+            </w:drawing>
+          </mc:Choice>
+          <mc:Fallback>
+            <w:pict>
+              <v:roundrect w14:anchorId="206CF711" id="Rounded Rectangle 5" o:spid="_x0000_s1026" style="position:absolute;margin-left:133.8pt;margin-top:106.15pt;width:36pt;height:46.15pt;z-index:251678720;visibility:visible;mso-wrap-style:square;mso-width-percent:0;mso-height-percent:0;mso-wrap-distance-left:9pt;mso-wrap-distance-top:0;mso-wrap-distance-right:9pt;mso-wrap-distance-bottom:0;mso-position-horizontal:absolute;mso-position-horizontal-relative:text;mso-position-vertical:absolute;mso-position-vertical-relative:text;mso-width-percent:0;mso-height-percent:0;mso-width-relative:margin;mso-height-relative:margin;v-text-anchor:middle" arcsize="10923f" o:gfxdata="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" filled="f" strokecolor="#ff005a" strokeweight="2pt">
+                <v:stroke joinstyle="miter"/>
+                <v:shadow on="t" color="black" opacity="26214f" origin="-.5,-.5" offset=".24944mm,.24944mm"/>
+              </v:roundrect>
+            </w:pict>
+          </mc:Fallback>
+        </mc:AlternateContent>
+      </w:r>
+      <w:r>
+        <w:rPr>
+          <w:rFonts w:eastAsia="Times New Roman" w:cs="Helvetica"/>
+          <w:noProof/>
+          <w:color w:val="000000"/>
+          <w:sz w:val="24"/>
+          <w:szCs w:val="24"/>
+        </w:rPr>
         <w:drawing>
-          <wp:inline distT="0" distB="0" distL="0" distR="0" wp14:anchorId="25D5B1BA" wp14:editId="2B8CE298">
-            <wp:extent cx="5257799" cy="3475516"/>
-            <wp:effectExtent l="12700" t="12700" r="13335" b="17145"/>
-            <wp:docPr id="7" name="Picture 7" descr="A screen shot of a calculator&#10;&#10;Description automatically generated with medium confidence"/>
+          <wp:inline distT="0" distB="0" distL="0" distR="0" wp14:anchorId="37A97982" wp14:editId="7BA72FB0">
+            <wp:extent cx="5257800" cy="3302000"/>
+            <wp:effectExtent l="12700" t="12700" r="12700" b="12700"/>
+            <wp:docPr id="913714689" name="Picture 4"/>
             <wp:cNvGraphicFramePr>
               <a:graphicFrameLocks xmlns:a="http://schemas.openxmlformats.org/drawingml/2006/main" noChangeAspect="1"/>
             </wp:cNvGraphicFramePr>
@@ -2257,10 +3374,10 @@
               <a:graphicData uri="http://schemas.openxmlformats.org/drawingml/2006/picture">
                 <pic:pic xmlns:pic="http://schemas.openxmlformats.org/drawingml/2006/picture">
                   <pic:nvPicPr>
-                    <pic:cNvPr id="7" name="Picture 7" descr="A screen shot of a calculator&#10;&#10;Description automatically generated with medium confidence"/>
+                    <pic:cNvPr id="1281206609" name="Picture 1281206609"/>
                     <pic:cNvPicPr/>
                   </pic:nvPicPr>
-                  <pic:blipFill rotWithShape="1">
+                  <pic:blipFill>
                     <a:blip r:embed="rId8">
                       <a:extLst>
                         <a:ext uri="{28A0092B-C50C-407E-A947-70E740481C1C}">
@@ -2268,48 +3385,23 @@
                         </a:ext>
                       </a:extLst>
                     </a:blip>
-                    <a:srcRect t="1205"/>
                     <a:stretch>
                       <a:fillRect/>
                     </a:stretch>
                   </pic:blipFill>
-                  <pic:spPr bwMode="auto">
+                  <pic:spPr>
                     <a:xfrm>
                       <a:off x="0" y="0"/>
-                      <a:ext cx="5258070" cy="3475695"/>
+                      <a:ext cx="5257800" cy="3302000"/>
                     </a:xfrm>
                     <a:prstGeom prst="rect">
                       <a:avLst/>
                     </a:prstGeom>
-                    <a:ln w="9525" cap="flat" cmpd="sng" algn="ctr">
+                    <a:ln w="12700">
                       <a:solidFill>
-                        <a:sysClr val="windowText" lastClr="000000"/>
+                        <a:schemeClr val="tx1"/>
                       </a:solidFill>
-                      <a:prstDash val="solid"/>
-                      <a:round/>
-                      <a:headEnd type="none" w="med" len="med"/>
-                      <a:tailEnd type="none" w="med" len="med"/>
-                      <a:extLst>
-                        <a:ext uri="{C807C97D-BFC1-408E-A445-0C87EB9F89A2}">
-                          <ask:lineSketchStyleProps xmlns:ask="http://schemas.microsoft.com/office/drawing/2018/sketchyshapes" sd="0">
-                            <a:custGeom>
-                              <a:avLst/>
-                              <a:gdLst/>
-                              <a:ahLst/>
-                              <a:cxnLst/>
-                              <a:rect l="0" t="0" r="0" b="0"/>
-                              <a:pathLst/>
-                            </a:custGeom>
-                            <ask:type/>
-                          </ask:lineSketchStyleProps>
-                        </a:ext>
-                      </a:extLst>
                     </a:ln>
-                    <a:extLst>
-                      <a:ext uri="{53640926-AAD7-44D8-BBD7-CCE9431645EC}">
-                        <a14:shadowObscured xmlns:a14="http://schemas.microsoft.com/office/drawing/2010/main"/>
-                      </a:ext>
-                    </a:extLst>
                   </pic:spPr>
                 </pic:pic>
               </a:graphicData>
@@ -2320,6 +3412,19 @@
     </w:p>
     <w:p>
       <w:pPr>
+        <w:shd w:val="clear" w:color="auto" w:fill="FFFFFF"/>
+        <w:spacing w:after="0" w:line="240" w:lineRule="auto"/>
+        <w:jc w:val="center"/>
+        <w:rPr>
+          <w:rFonts w:ascii="GS GeezMahtemUnicode" w:eastAsia="Times New Roman" w:hAnsi="GS GeezMahtemUnicode" w:cs="Nyala"/>
+          <w:color w:val="000000"/>
+          <w:sz w:val="24"/>
+          <w:szCs w:val="24"/>
+        </w:rPr>
+      </w:pPr>
+    </w:p>
+    <w:p>
+      <w:pPr>
         <w:jc w:val="center"/>
         <w:rPr>
           <w:i/>
@@ -2344,7 +3449,7 @@
           <w:sz w:val="36"/>
           <w:szCs w:val="36"/>
         </w:rPr>
-        <w:t xml:space="preserve">keys  with </w:t>
+        <w:t xml:space="preserve">keys with </w:t>
       </w:r>
       <w:r>
         <w:rPr>
@@ -2353,7 +3458,25 @@
           <w:sz w:val="36"/>
           <w:szCs w:val="36"/>
         </w:rPr>
-        <w:t>two dots</w:t>
+        <w:t>a</w:t>
+      </w:r>
+      <w:r>
+        <w:rPr>
+          <w:i/>
+          <w:iCs/>
+          <w:sz w:val="36"/>
+          <w:szCs w:val="36"/>
+        </w:rPr>
+        <w:t xml:space="preserve"> dot</w:t>
+      </w:r>
+      <w:r>
+        <w:rPr>
+          <w:i/>
+          <w:iCs/>
+          <w:sz w:val="36"/>
+          <w:szCs w:val="36"/>
+        </w:rPr>
+        <w:t xml:space="preserve"> beside the letter</w:t>
       </w:r>
       <w:r>
         <w:rPr>
@@ -3182,6 +4305,7 @@
       <w:pPr>
         <w:shd w:val="clear" w:color="auto" w:fill="FFFFFF"/>
         <w:spacing w:after="0" w:line="240" w:lineRule="auto"/>
+        <w:jc w:val="center"/>
         <w:rPr>
           <w:rFonts w:eastAsia="Times New Roman" w:cs="Helvetica"/>
           <w:color w:val="000000"/>
@@ -3189,32 +4313,301 @@
           <w:szCs w:val="24"/>
         </w:rPr>
       </w:pPr>
-    </w:p>
-    <w:p>
-      <w:pPr>
-        <w:shd w:val="clear" w:color="auto" w:fill="FFFFFF"/>
-        <w:spacing w:after="0" w:line="240" w:lineRule="auto"/>
-        <w:jc w:val="center"/>
-        <w:rPr>
-          <w:rFonts w:eastAsia="Times New Roman" w:cs="Helvetica"/>
-          <w:color w:val="000000"/>
-          <w:sz w:val="24"/>
-          <w:szCs w:val="24"/>
-        </w:rPr>
-      </w:pPr>
-      <w:r>
-        <w:rPr>
-          <w:rFonts w:eastAsia="Times New Roman" w:cs="Helvetica"/>
+      <w:r>
+        <w:rPr>
+          <w:rFonts w:ascii="GS GeezMahtemUnicode" w:eastAsia="Times New Roman" w:hAnsi="GS GeezMahtemUnicode" w:cs="Nyala"/>
           <w:noProof/>
           <w:color w:val="000000"/>
           <w:sz w:val="24"/>
           <w:szCs w:val="24"/>
         </w:rPr>
+        <mc:AlternateContent>
+          <mc:Choice Requires="wps">
+            <w:drawing>
+              <wp:anchor distT="0" distB="0" distL="114300" distR="114300" simplePos="0" relativeHeight="251683840" behindDoc="0" locked="0" layoutInCell="1" allowOverlap="1" wp14:anchorId="1166CB2D" wp14:editId="45458514">
+                <wp:simplePos x="0" y="0"/>
+                <wp:positionH relativeFrom="column">
+                  <wp:posOffset>5198110</wp:posOffset>
+                </wp:positionH>
+                <wp:positionV relativeFrom="paragraph">
+                  <wp:posOffset>1352680</wp:posOffset>
+                </wp:positionV>
+                <wp:extent cx="457200" cy="586105"/>
+                <wp:effectExtent l="63500" t="63500" r="76200" b="74295"/>
+                <wp:wrapNone/>
+                <wp:docPr id="1495026020" name="Rounded Rectangle 5"/>
+                <wp:cNvGraphicFramePr/>
+                <a:graphic xmlns:a="http://schemas.openxmlformats.org/drawingml/2006/main">
+                  <a:graphicData uri="http://schemas.microsoft.com/office/word/2010/wordprocessingShape">
+                    <wps:wsp>
+                      <wps:cNvSpPr/>
+                      <wps:spPr>
+                        <a:xfrm>
+                          <a:off x="0" y="0"/>
+                          <a:ext cx="457200" cy="586105"/>
+                        </a:xfrm>
+                        <a:prstGeom prst="roundRect">
+                          <a:avLst/>
+                        </a:prstGeom>
+                        <a:noFill/>
+                        <a:ln w="25400">
+                          <a:solidFill>
+                            <a:srgbClr val="FF005A"/>
+                          </a:solidFill>
+                        </a:ln>
+                        <a:effectLst>
+                          <a:outerShdw blurRad="50800" dist="12700" dir="2700000" algn="tl" rotWithShape="0">
+                            <a:prstClr val="black">
+                              <a:alpha val="40000"/>
+                            </a:prstClr>
+                          </a:outerShdw>
+                        </a:effectLst>
+                      </wps:spPr>
+                      <wps:style>
+                        <a:lnRef idx="2">
+                          <a:schemeClr val="accent1">
+                            <a:shade val="15000"/>
+                          </a:schemeClr>
+                        </a:lnRef>
+                        <a:fillRef idx="1">
+                          <a:schemeClr val="accent1"/>
+                        </a:fillRef>
+                        <a:effectRef idx="0">
+                          <a:schemeClr val="accent1"/>
+                        </a:effectRef>
+                        <a:fontRef idx="minor">
+                          <a:schemeClr val="lt1"/>
+                        </a:fontRef>
+                      </wps:style>
+                      <wps:bodyPr rot="0" spcFirstLastPara="0" vertOverflow="overflow" horzOverflow="overflow" vert="horz" wrap="square" lIns="91440" tIns="45720" rIns="91440" bIns="45720" numCol="1" spcCol="0" rtlCol="0" fromWordArt="0" anchor="ctr" anchorCtr="0" forceAA="0" compatLnSpc="1">
+                        <a:prstTxWarp prst="textNoShape">
+                          <a:avLst/>
+                        </a:prstTxWarp>
+                        <a:noAutofit/>
+                      </wps:bodyPr>
+                    </wps:wsp>
+                  </a:graphicData>
+                </a:graphic>
+                <wp14:sizeRelH relativeFrom="margin">
+                  <wp14:pctWidth>0</wp14:pctWidth>
+                </wp14:sizeRelH>
+                <wp14:sizeRelV relativeFrom="margin">
+                  <wp14:pctHeight>0</wp14:pctHeight>
+                </wp14:sizeRelV>
+              </wp:anchor>
+            </w:drawing>
+          </mc:Choice>
+          <mc:Fallback>
+            <w:pict>
+              <v:roundrect w14:anchorId="19A56D1D" id="Rounded Rectangle 5" o:spid="_x0000_s1026" style="position:absolute;margin-left:409.3pt;margin-top:106.5pt;width:36pt;height:46.15pt;z-index:251683840;visibility:visible;mso-wrap-style:square;mso-width-percent:0;mso-height-percent:0;mso-wrap-distance-left:9pt;mso-wrap-distance-top:0;mso-wrap-distance-right:9pt;mso-wrap-distance-bottom:0;mso-position-horizontal:absolute;mso-position-horizontal-relative:text;mso-position-vertical:absolute;mso-position-vertical-relative:text;mso-width-percent:0;mso-height-percent:0;mso-width-relative:margin;mso-height-relative:margin;v-text-anchor:middle" arcsize="10923f" o:gfxdata="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" filled="f" strokecolor="#ff005a" strokeweight="2pt">
+                <v:stroke joinstyle="miter"/>
+                <v:shadow on="t" color="black" opacity="26214f" origin="-.5,-.5" offset=".24944mm,.24944mm"/>
+              </v:roundrect>
+            </w:pict>
+          </mc:Fallback>
+        </mc:AlternateContent>
+      </w:r>
+      <w:r>
+        <w:rPr>
+          <w:rFonts w:ascii="GS GeezMahtemUnicode" w:eastAsia="Times New Roman" w:hAnsi="GS GeezMahtemUnicode" w:cs="Nyala"/>
+          <w:noProof/>
+          <w:color w:val="000000"/>
+          <w:sz w:val="24"/>
+          <w:szCs w:val="24"/>
+        </w:rPr>
+        <mc:AlternateContent>
+          <mc:Choice Requires="wps">
+            <w:drawing>
+              <wp:anchor distT="0" distB="0" distL="114300" distR="114300" simplePos="0" relativeHeight="251684864" behindDoc="0" locked="0" layoutInCell="1" allowOverlap="1" wp14:anchorId="580F6F62" wp14:editId="5250EA03">
+                <wp:simplePos x="0" y="0"/>
+                <wp:positionH relativeFrom="column">
+                  <wp:posOffset>1706725</wp:posOffset>
+                </wp:positionH>
+                <wp:positionV relativeFrom="paragraph">
+                  <wp:posOffset>2679570</wp:posOffset>
+                </wp:positionV>
+                <wp:extent cx="457200" cy="586105"/>
+                <wp:effectExtent l="63500" t="63500" r="81915" b="74295"/>
+                <wp:wrapNone/>
+                <wp:docPr id="1049887349" name="Rounded Rectangle 5"/>
+                <wp:cNvGraphicFramePr/>
+                <a:graphic xmlns:a="http://schemas.openxmlformats.org/drawingml/2006/main">
+                  <a:graphicData uri="http://schemas.microsoft.com/office/word/2010/wordprocessingShape">
+                    <wps:wsp>
+                      <wps:cNvSpPr/>
+                      <wps:spPr>
+                        <a:xfrm>
+                          <a:off x="0" y="0"/>
+                          <a:ext cx="457200" cy="586105"/>
+                        </a:xfrm>
+                        <a:prstGeom prst="roundRect">
+                          <a:avLst/>
+                        </a:prstGeom>
+                        <a:noFill/>
+                        <a:ln w="25400">
+                          <a:solidFill>
+                            <a:srgbClr val="FF005A"/>
+                          </a:solidFill>
+                        </a:ln>
+                        <a:effectLst>
+                          <a:outerShdw blurRad="50800" dist="12700" dir="2700000" algn="tl" rotWithShape="0">
+                            <a:prstClr val="black">
+                              <a:alpha val="40000"/>
+                            </a:prstClr>
+                          </a:outerShdw>
+                        </a:effectLst>
+                      </wps:spPr>
+                      <wps:style>
+                        <a:lnRef idx="2">
+                          <a:schemeClr val="accent1">
+                            <a:shade val="15000"/>
+                          </a:schemeClr>
+                        </a:lnRef>
+                        <a:fillRef idx="1">
+                          <a:schemeClr val="accent1"/>
+                        </a:fillRef>
+                        <a:effectRef idx="0">
+                          <a:schemeClr val="accent1"/>
+                        </a:effectRef>
+                        <a:fontRef idx="minor">
+                          <a:schemeClr val="lt1"/>
+                        </a:fontRef>
+                      </wps:style>
+                      <wps:bodyPr rot="0" spcFirstLastPara="0" vertOverflow="overflow" horzOverflow="overflow" vert="horz" wrap="square" lIns="91440" tIns="45720" rIns="91440" bIns="45720" numCol="1" spcCol="0" rtlCol="0" fromWordArt="0" anchor="ctr" anchorCtr="0" forceAA="0" compatLnSpc="1">
+                        <a:prstTxWarp prst="textNoShape">
+                          <a:avLst/>
+                        </a:prstTxWarp>
+                        <a:noAutofit/>
+                      </wps:bodyPr>
+                    </wps:wsp>
+                  </a:graphicData>
+                </a:graphic>
+                <wp14:sizeRelH relativeFrom="margin">
+                  <wp14:pctWidth>0</wp14:pctWidth>
+                </wp14:sizeRelH>
+                <wp14:sizeRelV relativeFrom="margin">
+                  <wp14:pctHeight>0</wp14:pctHeight>
+                </wp14:sizeRelV>
+              </wp:anchor>
+            </w:drawing>
+          </mc:Choice>
+          <mc:Fallback>
+            <w:pict>
+              <v:roundrect w14:anchorId="01DC6566" id="Rounded Rectangle 5" o:spid="_x0000_s1026" style="position:absolute;margin-left:134.4pt;margin-top:211pt;width:36pt;height:46.15pt;z-index:251684864;visibility:visible;mso-wrap-style:square;mso-width-percent:0;mso-height-percent:0;mso-wrap-distance-left:9pt;mso-wrap-distance-top:0;mso-wrap-distance-right:9pt;mso-wrap-distance-bottom:0;mso-position-horizontal:absolute;mso-position-horizontal-relative:text;mso-position-vertical:absolute;mso-position-vertical-relative:text;mso-width-percent:0;mso-height-percent:0;mso-width-relative:margin;mso-height-relative:margin;v-text-anchor:middle" arcsize="10923f" o:gfxdata="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" filled="f" strokecolor="#ff005a" strokeweight="2pt">
+                <v:stroke joinstyle="miter"/>
+                <v:shadow on="t" color="black" opacity="26214f" origin="-.5,-.5" offset=".24944mm,.24944mm"/>
+              </v:roundrect>
+            </w:pict>
+          </mc:Fallback>
+        </mc:AlternateContent>
+      </w:r>
+      <w:r>
+        <w:rPr>
+          <w:rFonts w:ascii="GS GeezMahtemUnicode" w:eastAsia="Times New Roman" w:hAnsi="GS GeezMahtemUnicode" w:cs="Nyala"/>
+          <w:noProof/>
+          <w:color w:val="000000"/>
+          <w:sz w:val="24"/>
+          <w:szCs w:val="24"/>
+        </w:rPr>
+        <mc:AlternateContent>
+          <mc:Choice Requires="wps">
+            <w:drawing>
+              <wp:anchor distT="0" distB="0" distL="114300" distR="114300" simplePos="0" relativeHeight="251685888" behindDoc="0" locked="0" layoutInCell="1" allowOverlap="1" wp14:anchorId="640A1248" wp14:editId="6DEAA1C2">
+                <wp:simplePos x="0" y="0"/>
+                <wp:positionH relativeFrom="column">
+                  <wp:posOffset>4195315</wp:posOffset>
+                </wp:positionH>
+                <wp:positionV relativeFrom="paragraph">
+                  <wp:posOffset>2681605</wp:posOffset>
+                </wp:positionV>
+                <wp:extent cx="457200" cy="586105"/>
+                <wp:effectExtent l="63500" t="63500" r="76200" b="74295"/>
+                <wp:wrapNone/>
+                <wp:docPr id="913360907" name="Rounded Rectangle 5"/>
+                <wp:cNvGraphicFramePr/>
+                <a:graphic xmlns:a="http://schemas.openxmlformats.org/drawingml/2006/main">
+                  <a:graphicData uri="http://schemas.microsoft.com/office/word/2010/wordprocessingShape">
+                    <wps:wsp>
+                      <wps:cNvSpPr/>
+                      <wps:spPr>
+                        <a:xfrm>
+                          <a:off x="0" y="0"/>
+                          <a:ext cx="457200" cy="586105"/>
+                        </a:xfrm>
+                        <a:prstGeom prst="roundRect">
+                          <a:avLst/>
+                        </a:prstGeom>
+                        <a:noFill/>
+                        <a:ln w="25400">
+                          <a:solidFill>
+                            <a:srgbClr val="FF005A"/>
+                          </a:solidFill>
+                        </a:ln>
+                        <a:effectLst>
+                          <a:outerShdw blurRad="50800" dist="12700" dir="2700000" algn="tl" rotWithShape="0">
+                            <a:prstClr val="black">
+                              <a:alpha val="40000"/>
+                            </a:prstClr>
+                          </a:outerShdw>
+                        </a:effectLst>
+                      </wps:spPr>
+                      <wps:style>
+                        <a:lnRef idx="2">
+                          <a:schemeClr val="accent1">
+                            <a:shade val="15000"/>
+                          </a:schemeClr>
+                        </a:lnRef>
+                        <a:fillRef idx="1">
+                          <a:schemeClr val="accent1"/>
+                        </a:fillRef>
+                        <a:effectRef idx="0">
+                          <a:schemeClr val="accent1"/>
+                        </a:effectRef>
+                        <a:fontRef idx="minor">
+                          <a:schemeClr val="lt1"/>
+                        </a:fontRef>
+                      </wps:style>
+                      <wps:bodyPr rot="0" spcFirstLastPara="0" vertOverflow="overflow" horzOverflow="overflow" vert="horz" wrap="square" lIns="91440" tIns="45720" rIns="91440" bIns="45720" numCol="1" spcCol="0" rtlCol="0" fromWordArt="0" anchor="ctr" anchorCtr="0" forceAA="0" compatLnSpc="1">
+                        <a:prstTxWarp prst="textNoShape">
+                          <a:avLst/>
+                        </a:prstTxWarp>
+                        <a:noAutofit/>
+                      </wps:bodyPr>
+                    </wps:wsp>
+                  </a:graphicData>
+                </a:graphic>
+                <wp14:sizeRelH relativeFrom="margin">
+                  <wp14:pctWidth>0</wp14:pctWidth>
+                </wp14:sizeRelH>
+                <wp14:sizeRelV relativeFrom="margin">
+                  <wp14:pctHeight>0</wp14:pctHeight>
+                </wp14:sizeRelV>
+              </wp:anchor>
+            </w:drawing>
+          </mc:Choice>
+          <mc:Fallback>
+            <w:pict>
+              <v:roundrect w14:anchorId="7E58103F" id="Rounded Rectangle 5" o:spid="_x0000_s1026" style="position:absolute;margin-left:330.35pt;margin-top:211.15pt;width:36pt;height:46.15pt;z-index:251685888;visibility:visible;mso-wrap-style:square;mso-width-percent:0;mso-height-percent:0;mso-wrap-distance-left:9pt;mso-wrap-distance-top:0;mso-wrap-distance-right:9pt;mso-wrap-distance-bottom:0;mso-position-horizontal:absolute;mso-position-horizontal-relative:text;mso-position-vertical:absolute;mso-position-vertical-relative:text;mso-width-percent:0;mso-height-percent:0;mso-width-relative:margin;mso-height-relative:margin;v-text-anchor:middle" arcsize="10923f" o:gfxdata="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" filled="f" strokecolor="#ff005a" strokeweight="2pt">
+                <v:stroke joinstyle="miter"/>
+                <v:shadow on="t" color="black" opacity="26214f" origin="-.5,-.5" offset=".24944mm,.24944mm"/>
+              </v:roundrect>
+            </w:pict>
+          </mc:Fallback>
+        </mc:AlternateContent>
+      </w:r>
+      <w:r>
+        <w:rPr>
+          <w:rFonts w:eastAsia="Times New Roman" w:cs="Helvetica"/>
+          <w:noProof/>
+          <w:color w:val="000000"/>
+          <w:sz w:val="24"/>
+          <w:szCs w:val="24"/>
+        </w:rPr>
         <w:drawing>
-          <wp:inline distT="0" distB="0" distL="0" distR="0" wp14:anchorId="593D72B9" wp14:editId="098C84D5">
-            <wp:extent cx="5257799" cy="3470007"/>
-            <wp:effectExtent l="12700" t="12700" r="13335" b="10160"/>
-            <wp:docPr id="6" name="Picture 6" descr="A screen shot of a calculator&#10;&#10;Description automatically generated with medium confidence"/>
+          <wp:inline distT="0" distB="0" distL="0" distR="0" wp14:anchorId="1A7F70F4" wp14:editId="5D9E2A0F">
+            <wp:extent cx="5257800" cy="3302000"/>
+            <wp:effectExtent l="12700" t="12700" r="12700" b="12700"/>
+            <wp:docPr id="1281206609" name="Picture 4"/>
             <wp:cNvGraphicFramePr>
               <a:graphicFrameLocks xmlns:a="http://schemas.openxmlformats.org/drawingml/2006/main" noChangeAspect="1"/>
             </wp:cNvGraphicFramePr>
@@ -3222,59 +4615,34 @@
               <a:graphicData uri="http://schemas.openxmlformats.org/drawingml/2006/picture">
                 <pic:pic xmlns:pic="http://schemas.openxmlformats.org/drawingml/2006/picture">
                   <pic:nvPicPr>
-                    <pic:cNvPr id="6" name="Picture 6" descr="A screen shot of a calculator&#10;&#10;Description automatically generated with medium confidence"/>
+                    <pic:cNvPr id="1281206609" name="Picture 1281206609"/>
                     <pic:cNvPicPr/>
                   </pic:nvPicPr>
-                  <pic:blipFill rotWithShape="1">
-                    <a:blip r:embed="rId9">
+                  <pic:blipFill>
+                    <a:blip r:embed="rId8">
                       <a:extLst>
                         <a:ext uri="{28A0092B-C50C-407E-A947-70E740481C1C}">
                           <a14:useLocalDpi xmlns:a14="http://schemas.microsoft.com/office/drawing/2010/main" val="0"/>
                         </a:ext>
                       </a:extLst>
                     </a:blip>
-                    <a:srcRect t="1361"/>
                     <a:stretch>
                       <a:fillRect/>
                     </a:stretch>
                   </pic:blipFill>
-                  <pic:spPr bwMode="auto">
+                  <pic:spPr>
                     <a:xfrm>
                       <a:off x="0" y="0"/>
-                      <a:ext cx="5258070" cy="3470186"/>
+                      <a:ext cx="5257800" cy="3302000"/>
                     </a:xfrm>
                     <a:prstGeom prst="rect">
                       <a:avLst/>
                     </a:prstGeom>
-                    <a:ln w="9525" cap="flat" cmpd="sng" algn="ctr">
+                    <a:ln w="12700">
                       <a:solidFill>
-                        <a:sysClr val="windowText" lastClr="000000"/>
+                        <a:schemeClr val="tx1"/>
                       </a:solidFill>
-                      <a:prstDash val="solid"/>
-                      <a:round/>
-                      <a:headEnd type="none" w="med" len="med"/>
-                      <a:tailEnd type="none" w="med" len="med"/>
-                      <a:extLst>
-                        <a:ext uri="{C807C97D-BFC1-408E-A445-0C87EB9F89A2}">
-                          <ask:lineSketchStyleProps xmlns:ask="http://schemas.microsoft.com/office/drawing/2018/sketchyshapes" sd="0">
-                            <a:custGeom>
-                              <a:avLst/>
-                              <a:gdLst/>
-                              <a:ahLst/>
-                              <a:cxnLst/>
-                              <a:rect l="0" t="0" r="0" b="0"/>
-                              <a:pathLst/>
-                            </a:custGeom>
-                            <ask:type/>
-                          </ask:lineSketchStyleProps>
-                        </a:ext>
-                      </a:extLst>
                     </a:ln>
-                    <a:extLst>
-                      <a:ext uri="{53640926-AAD7-44D8-BBD7-CCE9431645EC}">
-                        <a14:shadowObscured xmlns:a14="http://schemas.microsoft.com/office/drawing/2010/main"/>
-                      </a:ext>
-                    </a:extLst>
                   </pic:spPr>
                 </pic:pic>
               </a:graphicData>
@@ -3282,6 +4650,19 @@
           </wp:inline>
         </w:drawing>
       </w:r>
+    </w:p>
+    <w:p>
+      <w:pPr>
+        <w:shd w:val="clear" w:color="auto" w:fill="FFFFFF"/>
+        <w:spacing w:after="0" w:line="240" w:lineRule="auto"/>
+        <w:jc w:val="center"/>
+        <w:rPr>
+          <w:rFonts w:eastAsia="Times New Roman" w:cs="Helvetica"/>
+          <w:color w:val="000000"/>
+          <w:sz w:val="24"/>
+          <w:szCs w:val="24"/>
+        </w:rPr>
+      </w:pPr>
     </w:p>
     <w:p>
       <w:pPr>
@@ -3680,8 +5061,19 @@
           <w:sz w:val="28"/>
           <w:szCs w:val="28"/>
         </w:rPr>
-        <w:t>= አኡኢኣኤእኦ</w:t>
-      </w:r>
+        <w:t xml:space="preserve">= </w:t>
+      </w:r>
+      <w:proofErr w:type="spellStart"/>
+      <w:r>
+        <w:rPr>
+          <w:rFonts w:ascii="GS GeezMahtemUnicode" w:eastAsia="Times New Roman" w:hAnsi="GS GeezMahtemUnicode" w:cs="Abyssinica SIL"/>
+          <w:color w:val="000000"/>
+          <w:sz w:val="28"/>
+          <w:szCs w:val="28"/>
+        </w:rPr>
+        <w:t>አኡኢኣኤእኦ</w:t>
+      </w:r>
+      <w:proofErr w:type="spellEnd"/>
     </w:p>
     <w:p>
       <w:pPr>
@@ -3955,6 +5347,7 @@
         </w:rPr>
         <w:t xml:space="preserve"> = </w:t>
       </w:r>
+      <w:proofErr w:type="spellStart"/>
       <w:r>
         <w:rPr>
           <w:rFonts w:ascii="GS GeezMahtemUnicode" w:eastAsia="Times New Roman" w:hAnsi="GS GeezMahtemUnicode" w:cs="Abyssinica SIL"/>
@@ -3964,6 +5357,7 @@
         </w:rPr>
         <w:t>ዐዑዒዓዔዕዖ</w:t>
       </w:r>
+      <w:proofErr w:type="spellEnd"/>
     </w:p>
     <w:p>
       <w:pPr>
@@ -9647,18 +11041,61 @@
           <w:sz w:val="24"/>
           <w:szCs w:val="24"/>
         </w:rPr>
-        <w:t xml:space="preserve"> as shown below for the letter </w:t>
+        <w:t xml:space="preserve"> as shown below for the letter</w:t>
+      </w:r>
+      <w:r>
+        <w:rPr>
+          <w:rFonts w:eastAsia="Times New Roman" w:cs="Helvetica"/>
+          <w:color w:val="000000"/>
+          <w:sz w:val="24"/>
+          <w:szCs w:val="24"/>
+        </w:rPr>
+        <w:t xml:space="preserve"> </w:t>
+      </w:r>
+      <w:r>
+        <w:rPr>
+          <w:rFonts w:eastAsia="Times New Roman" w:cs="Helvetica"/>
+          <w:color w:val="000000"/>
+          <w:sz w:val="24"/>
+          <w:szCs w:val="24"/>
+        </w:rPr>
+        <w:t>“</w:t>
       </w:r>
       <w:r>
         <w:rPr>
           <w:rFonts w:ascii="GS GeezMahtemUnicode" w:eastAsia="Times New Roman" w:hAnsi="GS GeezMahtemUnicode" w:cs="Nyala"/>
-          <w:b/>
-          <w:bCs/>
-          <w:color w:val="5B9BD5" w:themeColor="accent5"/>
-          <w:sz w:val="24"/>
-          <w:szCs w:val="24"/>
-        </w:rPr>
-        <w:t>ት.</w:t>
+          <w:color w:val="000000"/>
+          <w:sz w:val="24"/>
+          <w:szCs w:val="24"/>
+        </w:rPr>
+        <w:t>ት</w:t>
+      </w:r>
+      <w:r>
+        <w:rPr>
+          <w:rFonts w:eastAsia="Times New Roman" w:cs="Helvetica"/>
+          <w:color w:val="000000"/>
+          <w:sz w:val="24"/>
+          <w:szCs w:val="24"/>
+        </w:rPr>
+        <w:t>”</w:t>
+      </w:r>
+      <w:r>
+        <w:rPr>
+          <w:rFonts w:eastAsia="Times New Roman" w:cs="Helvetica"/>
+          <w:color w:val="000000"/>
+          <w:sz w:val="24"/>
+          <w:szCs w:val="24"/>
+        </w:rPr>
+        <w:t>.</w:t>
+      </w:r>
+      <w:r>
+        <w:rPr>
+          <w:rFonts w:eastAsia="Times New Roman" w:cs="Helvetica"/>
+          <w:color w:val="000000"/>
+          <w:sz w:val="24"/>
+          <w:szCs w:val="24"/>
+        </w:rPr>
+        <w:t xml:space="preserve"> </w:t>
       </w:r>
     </w:p>
     <w:p>
@@ -9835,6 +11272,32 @@
         </w:rPr>
         <w:t xml:space="preserve"> </w:t>
       </w:r>
+    </w:p>
+    <w:p>
+      <w:pPr>
+        <w:shd w:val="clear" w:color="auto" w:fill="FFFFFF"/>
+        <w:spacing w:after="0" w:line="240" w:lineRule="auto"/>
+        <w:jc w:val="both"/>
+        <w:rPr>
+          <w:rFonts w:eastAsia="Times New Roman" w:cs="Helvetica"/>
+          <w:color w:val="000000"/>
+          <w:sz w:val="24"/>
+          <w:szCs w:val="24"/>
+        </w:rPr>
+      </w:pPr>
+    </w:p>
+    <w:p>
+      <w:pPr>
+        <w:shd w:val="clear" w:color="auto" w:fill="FFFFFF"/>
+        <w:spacing w:after="0" w:line="240" w:lineRule="auto"/>
+        <w:jc w:val="both"/>
+        <w:rPr>
+          <w:rFonts w:eastAsia="Times New Roman" w:cs="Helvetica"/>
+          <w:color w:val="000000"/>
+          <w:sz w:val="24"/>
+          <w:szCs w:val="24"/>
+        </w:rPr>
+      </w:pPr>
     </w:p>
     <w:p>
       <w:pPr>
@@ -9874,21 +11337,360 @@
           <w:sz w:val="24"/>
           <w:szCs w:val="24"/>
         </w:rPr>
+        <w:drawing>
+          <wp:inline distT="0" distB="0" distL="0" distR="0" wp14:anchorId="6230E423" wp14:editId="64479ADC">
+            <wp:extent cx="5257800" cy="3302000"/>
+            <wp:effectExtent l="12700" t="12700" r="12700" b="12700"/>
+            <wp:docPr id="1271309269" name="Picture 6"/>
+            <wp:cNvGraphicFramePr>
+              <a:graphicFrameLocks xmlns:a="http://schemas.openxmlformats.org/drawingml/2006/main" noChangeAspect="1"/>
+            </wp:cNvGraphicFramePr>
+            <a:graphic xmlns:a="http://schemas.openxmlformats.org/drawingml/2006/main">
+              <a:graphicData uri="http://schemas.openxmlformats.org/drawingml/2006/picture">
+                <pic:pic xmlns:pic="http://schemas.openxmlformats.org/drawingml/2006/picture">
+                  <pic:nvPicPr>
+                    <pic:cNvPr id="1271309269" name="Picture 1271309269"/>
+                    <pic:cNvPicPr/>
+                  </pic:nvPicPr>
+                  <pic:blipFill>
+                    <a:blip r:embed="rId9">
+                      <a:extLst>
+                        <a:ext uri="{28A0092B-C50C-407E-A947-70E740481C1C}">
+                          <a14:useLocalDpi xmlns:a14="http://schemas.microsoft.com/office/drawing/2010/main" val="0"/>
+                        </a:ext>
+                      </a:extLst>
+                    </a:blip>
+                    <a:stretch>
+                      <a:fillRect/>
+                    </a:stretch>
+                  </pic:blipFill>
+                  <pic:spPr>
+                    <a:xfrm>
+                      <a:off x="0" y="0"/>
+                      <a:ext cx="5257800" cy="3302000"/>
+                    </a:xfrm>
+                    <a:prstGeom prst="rect">
+                      <a:avLst/>
+                    </a:prstGeom>
+                    <a:ln w="12700">
+                      <a:solidFill>
+                        <a:schemeClr val="tx1"/>
+                      </a:solidFill>
+                    </a:ln>
+                  </pic:spPr>
+                </pic:pic>
+              </a:graphicData>
+            </a:graphic>
+          </wp:inline>
+        </w:drawing>
+      </w:r>
+    </w:p>
+    <w:p>
+      <w:pPr>
+        <w:shd w:val="clear" w:color="auto" w:fill="FFFFFF"/>
+        <w:spacing w:after="0" w:line="240" w:lineRule="auto"/>
+        <w:rPr>
+          <w:rFonts w:eastAsia="Times New Roman" w:cs="Helvetica"/>
+          <w:b/>
+          <w:bCs/>
+          <w:color w:val="000000"/>
+          <w:sz w:val="24"/>
+          <w:szCs w:val="24"/>
+        </w:rPr>
+      </w:pPr>
+    </w:p>
+    <w:p>
+      <w:pPr>
+        <w:rPr>
+          <w:rFonts w:eastAsia="Times New Roman" w:cs="Helvetica"/>
+          <w:b/>
+          <w:bCs/>
+          <w:color w:val="000000"/>
+          <w:sz w:val="24"/>
+          <w:szCs w:val="24"/>
+        </w:rPr>
+      </w:pPr>
+      <w:r>
+        <w:rPr>
+          <w:rFonts w:eastAsia="Times New Roman" w:cs="Helvetica"/>
+          <w:b/>
+          <w:bCs/>
+          <w:color w:val="000000"/>
+          <w:sz w:val="24"/>
+          <w:szCs w:val="24"/>
+        </w:rPr>
+        <w:br w:type="page"/>
+      </w:r>
+    </w:p>
+    <w:p>
+      <w:pPr>
+        <w:shd w:val="clear" w:color="auto" w:fill="FFFFFF"/>
+        <w:spacing w:after="0" w:line="240" w:lineRule="auto"/>
+        <w:rPr>
+          <w:rFonts w:eastAsia="Times New Roman" w:cs="Helvetica"/>
+          <w:b/>
+          <w:bCs/>
+          <w:color w:val="000000"/>
+          <w:sz w:val="24"/>
+          <w:szCs w:val="24"/>
+        </w:rPr>
+      </w:pPr>
+    </w:p>
+    <w:p>
+      <w:pPr>
+        <w:shd w:val="clear" w:color="auto" w:fill="FFFFFF"/>
+        <w:spacing w:after="0" w:line="240" w:lineRule="auto"/>
+        <w:rPr>
+          <w:rFonts w:eastAsia="Times New Roman" w:cs="Helvetica"/>
+          <w:b/>
+          <w:bCs/>
+          <w:color w:val="000000"/>
+          <w:sz w:val="36"/>
+          <w:szCs w:val="36"/>
+        </w:rPr>
+      </w:pPr>
+      <w:r>
+        <w:rPr>
+          <w:rFonts w:eastAsia="Times New Roman" w:cs="Helvetica"/>
+          <w:b/>
+          <w:bCs/>
+          <w:color w:val="000000"/>
+          <w:sz w:val="36"/>
+          <w:szCs w:val="36"/>
+        </w:rPr>
+        <w:t xml:space="preserve">Long Press </w:t>
+      </w:r>
+      <w:r>
+        <w:rPr>
+          <w:rFonts w:eastAsia="Times New Roman" w:cs="Helvetica"/>
+          <w:b/>
+          <w:bCs/>
+          <w:color w:val="000000"/>
+          <w:sz w:val="36"/>
+          <w:szCs w:val="36"/>
+        </w:rPr>
+        <w:t>to Select</w:t>
+      </w:r>
+      <w:r>
+        <w:rPr>
+          <w:rFonts w:eastAsia="Times New Roman" w:cs="Helvetica"/>
+          <w:b/>
+          <w:bCs/>
+          <w:color w:val="000000"/>
+          <w:sz w:val="36"/>
+          <w:szCs w:val="36"/>
+        </w:rPr>
+        <w:t xml:space="preserve"> Punctuations:</w:t>
+      </w:r>
+    </w:p>
+    <w:p>
+      <w:pPr>
+        <w:pStyle w:val="ListParagraph"/>
+        <w:shd w:val="clear" w:color="auto" w:fill="FFFFFF"/>
+        <w:spacing w:after="0" w:line="240" w:lineRule="auto"/>
+        <w:ind w:left="0"/>
+        <w:jc w:val="both"/>
+        <w:rPr>
+          <w:rFonts w:eastAsia="Times New Roman" w:cs="Helvetica"/>
+          <w:b/>
+          <w:bCs/>
+          <w:noProof/>
+          <w:color w:val="000000"/>
+          <w:sz w:val="24"/>
+          <w:szCs w:val="24"/>
+        </w:rPr>
+      </w:pPr>
+      <w:r>
+        <w:rPr>
+          <w:rFonts w:eastAsia="Times New Roman" w:cs="Helvetica"/>
+          <w:color w:val="000000"/>
+          <w:sz w:val="24"/>
+          <w:szCs w:val="24"/>
+        </w:rPr>
+        <w:t>Long Press (means press and hold it a bit linger) the two dots</w:t>
+      </w:r>
+      <w:r>
+        <w:rPr>
+          <w:rFonts w:eastAsia="Times New Roman" w:cs="Helvetica"/>
+          <w:color w:val="000000"/>
+          <w:sz w:val="24"/>
+          <w:szCs w:val="24"/>
+        </w:rPr>
+        <w:t xml:space="preserve"> (</w:t>
+      </w:r>
+      <w:r>
+        <w:rPr>
+          <w:rFonts w:ascii="GS GeezMahtemUnicode" w:eastAsia="Times New Roman" w:hAnsi="GS GeezMahtemUnicode" w:cs="Nyala"/>
+          <w:color w:val="000000"/>
+          <w:sz w:val="24"/>
+          <w:szCs w:val="24"/>
+        </w:rPr>
+        <w:t>፡),</w:t>
+      </w:r>
+      <w:r>
+        <w:rPr>
+          <w:rFonts w:eastAsia="Times New Roman" w:cs="Helvetica"/>
+          <w:color w:val="000000"/>
+          <w:sz w:val="24"/>
+          <w:szCs w:val="24"/>
+        </w:rPr>
+        <w:t xml:space="preserve"> a pop screen of two rows of punctuation symbols</w:t>
+      </w:r>
+      <w:r>
+        <w:rPr>
+          <w:rFonts w:eastAsia="Times New Roman" w:cs="Helvetica"/>
+          <w:color w:val="000000"/>
+          <w:sz w:val="24"/>
+          <w:szCs w:val="24"/>
+        </w:rPr>
+        <w:t xml:space="preserve"> gets displayed</w:t>
+      </w:r>
+      <w:r>
+        <w:rPr>
+          <w:rFonts w:eastAsia="Times New Roman" w:cs="Helvetica"/>
+          <w:color w:val="000000"/>
+          <w:sz w:val="24"/>
+          <w:szCs w:val="24"/>
+        </w:rPr>
+        <w:t xml:space="preserve">. They are </w:t>
+      </w:r>
+      <w:r>
+        <w:rPr>
+          <w:rFonts w:eastAsia="Times New Roman" w:cs="Helvetica"/>
+          <w:color w:val="000000"/>
+          <w:sz w:val="24"/>
+          <w:szCs w:val="24"/>
+        </w:rPr>
+        <w:t xml:space="preserve">the </w:t>
+      </w:r>
+      <w:r>
+        <w:rPr>
+          <w:rFonts w:eastAsia="Times New Roman" w:cs="Helvetica"/>
+          <w:color w:val="000000"/>
+          <w:sz w:val="24"/>
+          <w:szCs w:val="24"/>
+        </w:rPr>
+        <w:t xml:space="preserve">most commonly used </w:t>
+      </w:r>
+      <w:r>
+        <w:rPr>
+          <w:rFonts w:eastAsia="Times New Roman" w:cs="Helvetica"/>
+          <w:color w:val="000000"/>
+          <w:sz w:val="24"/>
+          <w:szCs w:val="24"/>
+        </w:rPr>
+        <w:t xml:space="preserve">punctuation symbols for </w:t>
+      </w:r>
+      <w:r>
+        <w:rPr>
+          <w:rFonts w:eastAsia="Times New Roman" w:cs="Helvetica"/>
+          <w:color w:val="000000"/>
+          <w:sz w:val="24"/>
+          <w:szCs w:val="24"/>
+        </w:rPr>
+        <w:t xml:space="preserve">Geez and English as shown below. You can move up your finger to the popup screen to select the </w:t>
+      </w:r>
+      <w:r>
+        <w:rPr>
+          <w:rFonts w:eastAsia="Times New Roman" w:cs="Helvetica"/>
+          <w:color w:val="000000"/>
+          <w:sz w:val="24"/>
+          <w:szCs w:val="24"/>
+        </w:rPr>
+        <w:t xml:space="preserve">right </w:t>
+      </w:r>
+      <w:r>
+        <w:rPr>
+          <w:rFonts w:eastAsia="Times New Roman" w:cs="Helvetica"/>
+          <w:color w:val="000000"/>
+          <w:sz w:val="24"/>
+          <w:szCs w:val="24"/>
+        </w:rPr>
+        <w:t>symbol.</w:t>
+      </w:r>
+      <w:r>
+        <w:rPr>
+          <w:rFonts w:eastAsia="Times New Roman" w:cs="Helvetica"/>
+          <w:b/>
+          <w:bCs/>
+          <w:noProof/>
+          <w:color w:val="000000"/>
+          <w:sz w:val="24"/>
+          <w:szCs w:val="24"/>
+        </w:rPr>
+        <w:t xml:space="preserve"> </w:t>
+      </w:r>
+    </w:p>
+    <w:p>
+      <w:pPr>
+        <w:pStyle w:val="ListParagraph"/>
+        <w:shd w:val="clear" w:color="auto" w:fill="FFFFFF"/>
+        <w:spacing w:after="0" w:line="240" w:lineRule="auto"/>
+        <w:ind w:left="0"/>
+        <w:jc w:val="both"/>
+        <w:rPr>
+          <w:rFonts w:eastAsia="Times New Roman" w:cs="Helvetica"/>
+          <w:b/>
+          <w:bCs/>
+          <w:noProof/>
+          <w:color w:val="000000"/>
+          <w:sz w:val="24"/>
+          <w:szCs w:val="24"/>
+        </w:rPr>
+      </w:pPr>
+    </w:p>
+    <w:p>
+      <w:pPr>
+        <w:pStyle w:val="ListParagraph"/>
+        <w:shd w:val="clear" w:color="auto" w:fill="FFFFFF"/>
+        <w:spacing w:after="0" w:line="240" w:lineRule="auto"/>
+        <w:ind w:left="0"/>
+        <w:jc w:val="both"/>
+        <w:rPr>
+          <w:rFonts w:ascii="GS GeezMahtemUnicode" w:eastAsia="Times New Roman" w:hAnsi="GS GeezMahtemUnicode" w:cs="Nyala"/>
+          <w:color w:val="000000"/>
+          <w:sz w:val="24"/>
+          <w:szCs w:val="24"/>
+        </w:rPr>
+      </w:pPr>
+    </w:p>
+    <w:p>
+      <w:pPr>
+        <w:pStyle w:val="ListParagraph"/>
+        <w:shd w:val="clear" w:color="auto" w:fill="FFFFFF"/>
+        <w:spacing w:after="0" w:line="240" w:lineRule="auto"/>
+        <w:rPr>
+          <w:rFonts w:eastAsia="Times New Roman" w:cs="Helvetica"/>
+          <w:color w:val="000000"/>
+          <w:sz w:val="36"/>
+          <w:szCs w:val="36"/>
+        </w:rPr>
+      </w:pPr>
+      <w:r>
+        <w:rPr>
+          <w:rFonts w:eastAsia="Times New Roman" w:cs="Helvetica"/>
+          <w:b/>
+          <w:bCs/>
+          <w:noProof/>
+          <w:color w:val="000000"/>
+          <w:sz w:val="24"/>
+          <w:szCs w:val="24"/>
+        </w:rPr>
         <mc:AlternateContent>
           <mc:Choice Requires="wps">
             <w:drawing>
-              <wp:anchor distT="0" distB="0" distL="114300" distR="114300" simplePos="0" relativeHeight="251668480" behindDoc="0" locked="0" layoutInCell="1" allowOverlap="1" wp14:anchorId="65956006" wp14:editId="0C89DB81">
+              <wp:anchor distT="0" distB="0" distL="114300" distR="114300" simplePos="0" relativeHeight="251664384" behindDoc="0" locked="0" layoutInCell="1" allowOverlap="1" wp14:anchorId="78923F86" wp14:editId="186E0C7F">
                 <wp:simplePos x="0" y="0"/>
                 <wp:positionH relativeFrom="column">
-                  <wp:posOffset>2928344</wp:posOffset>
+                  <wp:posOffset>4603875</wp:posOffset>
                 </wp:positionH>
                 <wp:positionV relativeFrom="paragraph">
-                  <wp:posOffset>1228090</wp:posOffset>
+                  <wp:posOffset>2030818</wp:posOffset>
                 </wp:positionV>
-                <wp:extent cx="363910" cy="456896"/>
-                <wp:effectExtent l="63500" t="63500" r="67945" b="64135"/>
+                <wp:extent cx="427990" cy="576218"/>
+                <wp:effectExtent l="63500" t="63500" r="67310" b="59055"/>
                 <wp:wrapNone/>
-                <wp:docPr id="63964661" name="Rounded Rectangle 1"/>
+                <wp:docPr id="1201574087" name="Rounded Rectangle 1"/>
                 <wp:cNvGraphicFramePr/>
                 <a:graphic xmlns:a="http://schemas.openxmlformats.org/drawingml/2006/main">
                   <a:graphicData uri="http://schemas.microsoft.com/office/word/2010/wordprocessingShape">
@@ -9897,7 +11699,7 @@
                       <wps:spPr>
                         <a:xfrm>
                           <a:off x="0" y="0"/>
-                          <a:ext cx="363910" cy="456896"/>
+                          <a:ext cx="427990" cy="576218"/>
                         </a:xfrm>
                         <a:prstGeom prst="roundRect">
                           <a:avLst/>
@@ -9955,7 +11757,7 @@
           </mc:Choice>
           <mc:Fallback>
             <w:pict>
-              <v:roundrect w14:anchorId="396425AF" id="Rounded Rectangle 1" o:spid="_x0000_s1026" style="position:absolute;margin-left:230.6pt;margin-top:96.7pt;width:28.65pt;height:36pt;z-index:251668480;visibility:visible;mso-wrap-style:square;mso-width-percent:0;mso-height-percent:0;mso-wrap-distance-left:9pt;mso-wrap-distance-top:0;mso-wrap-distance-right:9pt;mso-wrap-distance-bottom:0;mso-position-horizontal:absolute;mso-position-horizontal-relative:text;mso-position-vertical:absolute;mso-position-vertical-relative:text;mso-width-percent:0;mso-height-percent:0;mso-width-relative:margin;mso-height-relative:margin;v-text-anchor:middle" arcsize="10923f" o:gfxdata="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" filled="f" strokecolor="#2e74b5 [2408]" strokeweight="2.25pt">
+              <v:roundrect w14:anchorId="29C5E265" id="Rounded Rectangle 1" o:spid="_x0000_s1026" style="position:absolute;margin-left:362.5pt;margin-top:159.9pt;width:33.7pt;height:45.35pt;z-index:251664384;visibility:visible;mso-wrap-style:square;mso-width-percent:0;mso-height-percent:0;mso-wrap-distance-left:9pt;mso-wrap-distance-top:0;mso-wrap-distance-right:9pt;mso-wrap-distance-bottom:0;mso-position-horizontal:absolute;mso-position-horizontal-relative:text;mso-position-vertical:absolute;mso-position-vertical-relative:text;mso-width-percent:0;mso-height-percent:0;mso-width-relative:margin;mso-height-relative:margin;v-text-anchor:middle" arcsize="10923f" o:gfxdata="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" filled="f" strokecolor="#2e74b5 [2408]" strokeweight="2.25pt">
                 <v:stroke joinstyle="miter"/>
               </v:roundrect>
             </w:pict>
@@ -9965,18 +11767,16 @@
       <w:r>
         <w:rPr>
           <w:rFonts w:eastAsia="Times New Roman" w:cs="Helvetica"/>
-          <w:b/>
-          <w:bCs/>
           <w:noProof/>
           <w:color w:val="000000"/>
-          <w:sz w:val="24"/>
-          <w:szCs w:val="24"/>
+          <w:sz w:val="36"/>
+          <w:szCs w:val="36"/>
         </w:rPr>
         <w:drawing>
-          <wp:inline distT="0" distB="0" distL="0" distR="0" wp14:anchorId="085B0979" wp14:editId="1DFDF34F">
-            <wp:extent cx="5257800" cy="3534349"/>
-            <wp:effectExtent l="12700" t="12700" r="12700" b="9525"/>
-            <wp:docPr id="2" name="Picture 2" descr="A picture containing text, electronics, keyboard&#10;&#10;Description automatically generated"/>
+          <wp:inline distT="0" distB="0" distL="0" distR="0" wp14:anchorId="1B67D3E2" wp14:editId="5F8BC6A6">
+            <wp:extent cx="5257800" cy="3302000"/>
+            <wp:effectExtent l="12700" t="12700" r="12700" b="12700"/>
+            <wp:docPr id="1637097524" name="Picture 8"/>
             <wp:cNvGraphicFramePr>
               <a:graphicFrameLocks xmlns:a="http://schemas.openxmlformats.org/drawingml/2006/main" noChangeAspect="1"/>
             </wp:cNvGraphicFramePr>
@@ -9984,10 +11784,10 @@
               <a:graphicData uri="http://schemas.openxmlformats.org/drawingml/2006/picture">
                 <pic:pic xmlns:pic="http://schemas.openxmlformats.org/drawingml/2006/picture">
                   <pic:nvPicPr>
-                    <pic:cNvPr id="2" name="Picture 2" descr="A picture containing text, electronics, keyboard&#10;&#10;Description automatically generated"/>
+                    <pic:cNvPr id="1637097524" name="Picture 1637097524"/>
                     <pic:cNvPicPr/>
                   </pic:nvPicPr>
-                  <pic:blipFill rotWithShape="1">
+                  <pic:blipFill>
                     <a:blip r:embed="rId10">
                       <a:extLst>
                         <a:ext uri="{28A0092B-C50C-407E-A947-70E740481C1C}">
@@ -9995,29 +11795,23 @@
                         </a:ext>
                       </a:extLst>
                     </a:blip>
-                    <a:srcRect t="1836"/>
                     <a:stretch>
                       <a:fillRect/>
                     </a:stretch>
                   </pic:blipFill>
-                  <pic:spPr bwMode="auto">
+                  <pic:spPr>
                     <a:xfrm>
                       <a:off x="0" y="0"/>
-                      <a:ext cx="5258070" cy="3534531"/>
+                      <a:ext cx="5257800" cy="3302000"/>
                     </a:xfrm>
                     <a:prstGeom prst="rect">
                       <a:avLst/>
                     </a:prstGeom>
-                    <a:ln>
+                    <a:ln w="12700">
                       <a:solidFill>
                         <a:schemeClr val="tx1"/>
                       </a:solidFill>
                     </a:ln>
-                    <a:extLst>
-                      <a:ext uri="{53640926-AAD7-44D8-BBD7-CCE9431645EC}">
-                        <a14:shadowObscured xmlns:a14="http://schemas.microsoft.com/office/drawing/2010/main"/>
-                      </a:ext>
-                    </a:extLst>
                   </pic:spPr>
                 </pic:pic>
               </a:graphicData>
@@ -10030,6 +11824,7 @@
       <w:pPr>
         <w:shd w:val="clear" w:color="auto" w:fill="FFFFFF"/>
         <w:spacing w:after="0" w:line="240" w:lineRule="auto"/>
+        <w:jc w:val="center"/>
         <w:rPr>
           <w:rFonts w:eastAsia="Times New Roman" w:cs="Helvetica"/>
           <w:b/>
@@ -10056,72 +11851,62 @@
           <w:rFonts w:eastAsia="Times New Roman" w:cs="Helvetica"/>
           <w:b/>
           <w:bCs/>
+          <w:noProof/>
+          <w:color w:val="000000"/>
+          <w:sz w:val="24"/>
+          <w:szCs w:val="24"/>
+        </w:rPr>
+        <mc:AlternateContent>
+          <mc:Choice Requires="wpi">
+            <w:drawing>
+              <wp:anchor distT="0" distB="0" distL="114300" distR="114300" simplePos="0" relativeHeight="251660288" behindDoc="0" locked="0" layoutInCell="1" allowOverlap="1" wp14:anchorId="0C8D577E" wp14:editId="75B46B3E">
+                <wp:simplePos x="0" y="0"/>
+                <wp:positionH relativeFrom="column">
+                  <wp:posOffset>-5079060</wp:posOffset>
+                </wp:positionH>
+                <wp:positionV relativeFrom="paragraph">
+                  <wp:posOffset>145610</wp:posOffset>
+                </wp:positionV>
+                <wp:extent cx="413640" cy="398880"/>
+                <wp:effectExtent l="38100" t="38100" r="43815" b="39370"/>
+                <wp:wrapNone/>
+                <wp:docPr id="12" name="Ink 12"/>
+                <wp:cNvGraphicFramePr/>
+                <a:graphic xmlns:a="http://schemas.openxmlformats.org/drawingml/2006/main">
+                  <a:graphicData uri="http://schemas.microsoft.com/office/word/2010/wordprocessingInk">
+                    <w14:contentPart bwMode="auto" r:id="rId11">
+                      <w14:nvContentPartPr>
+                        <w14:cNvContentPartPr/>
+                      </w14:nvContentPartPr>
+                      <w14:xfrm>
+                        <a:off x="0" y="0"/>
+                        <a:ext cx="413640" cy="398880"/>
+                      </w14:xfrm>
+                    </w14:contentPart>
+                  </a:graphicData>
+                </a:graphic>
+              </wp:anchor>
+            </w:drawing>
+          </mc:Choice>
+          <mc:Fallback>
+            <w:pict>
+              <v:shape w14:anchorId="37E3538C" id="Ink 12" o:spid="_x0000_s1026" type="#_x0000_t75" style="position:absolute;margin-left:-400.65pt;margin-top:10.75pt;width:33.95pt;height:32.8pt;z-index:251660288;visibility:visible;mso-wrap-style:square;mso-wrap-distance-left:9pt;mso-wrap-distance-top:0;mso-wrap-distance-right:9pt;mso-wrap-distance-bottom:0;mso-position-horizontal:absolute;mso-position-horizontal-relative:text;mso-position-vertical:absolute;mso-position-vertical-relative:text" o:gfxdata="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">
+                <v:imagedata r:id="rId16" o:title=""/>
+              </v:shape>
+            </w:pict>
+          </mc:Fallback>
+        </mc:AlternateContent>
+      </w:r>
+      <w:r>
+        <w:rPr>
+          <w:rFonts w:eastAsia="Times New Roman" w:cs="Helvetica"/>
+          <w:b/>
+          <w:bCs/>
           <w:color w:val="000000"/>
           <w:sz w:val="24"/>
           <w:szCs w:val="24"/>
         </w:rPr>
         <w:br w:type="page"/>
-      </w:r>
-    </w:p>
-    <w:p>
-      <w:pPr>
-        <w:shd w:val="clear" w:color="auto" w:fill="FFFFFF"/>
-        <w:spacing w:after="0" w:line="240" w:lineRule="auto"/>
-        <w:rPr>
-          <w:rFonts w:eastAsia="Times New Roman" w:cs="Helvetica"/>
-          <w:b/>
-          <w:bCs/>
-          <w:color w:val="000000"/>
-          <w:sz w:val="24"/>
-          <w:szCs w:val="24"/>
-        </w:rPr>
-      </w:pPr>
-    </w:p>
-    <w:p>
-      <w:pPr>
-        <w:shd w:val="clear" w:color="auto" w:fill="FFFFFF"/>
-        <w:spacing w:after="0" w:line="240" w:lineRule="auto"/>
-        <w:rPr>
-          <w:rFonts w:eastAsia="Times New Roman" w:cs="Helvetica"/>
-          <w:b/>
-          <w:bCs/>
-          <w:color w:val="000000"/>
-          <w:sz w:val="36"/>
-          <w:szCs w:val="36"/>
-        </w:rPr>
-      </w:pPr>
-      <w:r>
-        <w:rPr>
-          <w:rFonts w:eastAsia="Times New Roman" w:cs="Helvetica"/>
-          <w:b/>
-          <w:bCs/>
-          <w:color w:val="000000"/>
-          <w:sz w:val="36"/>
-          <w:szCs w:val="36"/>
-        </w:rPr>
-        <w:t xml:space="preserve">Long Press </w:t>
-      </w:r>
-      <w:r>
-        <w:rPr>
-          <w:rFonts w:eastAsia="Times New Roman" w:cs="Helvetica"/>
-          <w:b/>
-          <w:bCs/>
-          <w:color w:val="000000"/>
-          <w:sz w:val="36"/>
-          <w:szCs w:val="36"/>
-        </w:rPr>
-        <w:t>to Select</w:t>
-      </w:r>
-      <w:r>
-        <w:rPr>
-          <w:rFonts w:eastAsia="Times New Roman" w:cs="Helvetica"/>
-          <w:b/>
-          <w:bCs/>
-          <w:color w:val="000000"/>
-          <w:sz w:val="36"/>
-          <w:szCs w:val="36"/>
-        </w:rPr>
-        <w:t xml:space="preserve"> Punctuations:</w:t>
       </w:r>
     </w:p>
     <w:p>
@@ -10129,10 +11914,58 @@
         <w:pStyle w:val="ListParagraph"/>
         <w:shd w:val="clear" w:color="auto" w:fill="FFFFFF"/>
         <w:spacing w:after="0" w:line="240" w:lineRule="auto"/>
-        <w:ind w:left="0"/>
+        <w:rPr>
+          <w:rFonts w:eastAsia="Times New Roman" w:cs="Helvetica"/>
+          <w:b/>
+          <w:bCs/>
+          <w:color w:val="000000"/>
+          <w:sz w:val="36"/>
+          <w:szCs w:val="36"/>
+        </w:rPr>
+      </w:pPr>
+      <w:r>
+        <w:rPr>
+          <w:rFonts w:eastAsia="Times New Roman" w:cs="Helvetica"/>
+          <w:b/>
+          <w:bCs/>
+          <w:color w:val="000000"/>
+          <w:sz w:val="36"/>
+          <w:szCs w:val="36"/>
+        </w:rPr>
+        <w:lastRenderedPageBreak/>
+        <w:t xml:space="preserve">Long Press </w:t>
+      </w:r>
+      <w:r>
+        <w:rPr>
+          <w:rFonts w:eastAsia="Times New Roman" w:cs="Helvetica"/>
+          <w:b/>
+          <w:bCs/>
+          <w:color w:val="000000"/>
+          <w:sz w:val="36"/>
+          <w:szCs w:val="36"/>
+        </w:rPr>
+        <w:t>to Select</w:t>
+      </w:r>
+      <w:r>
+        <w:rPr>
+          <w:rFonts w:eastAsia="Times New Roman" w:cs="Helvetica"/>
+          <w:b/>
+          <w:bCs/>
+          <w:color w:val="000000"/>
+          <w:sz w:val="36"/>
+          <w:szCs w:val="36"/>
+        </w:rPr>
+        <w:t xml:space="preserve"> Geez Numerals:</w:t>
+      </w:r>
+    </w:p>
+    <w:p>
+      <w:pPr>
+        <w:pStyle w:val="ListParagraph"/>
+        <w:shd w:val="clear" w:color="auto" w:fill="FFFFFF"/>
+        <w:spacing w:line="240" w:lineRule="auto"/>
         <w:jc w:val="both"/>
         <w:rPr>
-          <w:rFonts w:ascii="GS GeezMahtemUnicode" w:eastAsia="Times New Roman" w:hAnsi="GS GeezMahtemUnicode" w:cs="Nyala"/>
+          <w:rFonts w:eastAsia="Times New Roman" w:cs="Helvetica"/>
           <w:color w:val="000000"/>
           <w:sz w:val="24"/>
           <w:szCs w:val="24"/>
@@ -10145,142 +11978,45 @@
           <w:sz w:val="24"/>
           <w:szCs w:val="24"/>
         </w:rPr>
-        <w:t>Long Press (means press and hold it a bit linger) the two dots</w:t>
-      </w:r>
-      <w:r>
-        <w:rPr>
-          <w:rFonts w:eastAsia="Times New Roman" w:cs="Helvetica"/>
-          <w:color w:val="000000"/>
-          <w:sz w:val="24"/>
-          <w:szCs w:val="24"/>
-        </w:rPr>
-        <w:t xml:space="preserve"> (</w:t>
-      </w:r>
-      <w:r>
-        <w:rPr>
-          <w:rFonts w:ascii="GS GeezMahtemUnicode" w:eastAsia="Times New Roman" w:hAnsi="GS GeezMahtemUnicode" w:cs="Nyala"/>
-          <w:color w:val="000000"/>
-          <w:sz w:val="24"/>
-          <w:szCs w:val="24"/>
-        </w:rPr>
-        <w:t>፡),</w:t>
-      </w:r>
-      <w:r>
-        <w:rPr>
-          <w:rFonts w:eastAsia="Times New Roman" w:cs="Helvetica"/>
-          <w:color w:val="000000"/>
-          <w:sz w:val="24"/>
-          <w:szCs w:val="24"/>
-        </w:rPr>
-        <w:t xml:space="preserve"> a pop screen of two rows of punctuation symbols</w:t>
-      </w:r>
-      <w:r>
-        <w:rPr>
-          <w:rFonts w:eastAsia="Times New Roman" w:cs="Helvetica"/>
-          <w:color w:val="000000"/>
-          <w:sz w:val="24"/>
-          <w:szCs w:val="24"/>
-        </w:rPr>
-        <w:t xml:space="preserve"> gets displayed</w:t>
-      </w:r>
-      <w:r>
-        <w:rPr>
-          <w:rFonts w:eastAsia="Times New Roman" w:cs="Helvetica"/>
-          <w:color w:val="000000"/>
-          <w:sz w:val="24"/>
-          <w:szCs w:val="24"/>
-        </w:rPr>
-        <w:t xml:space="preserve">. They are </w:t>
-      </w:r>
-      <w:r>
-        <w:rPr>
-          <w:rFonts w:eastAsia="Times New Roman" w:cs="Helvetica"/>
-          <w:color w:val="000000"/>
-          <w:sz w:val="24"/>
-          <w:szCs w:val="24"/>
-        </w:rPr>
-        <w:t xml:space="preserve">the </w:t>
-      </w:r>
-      <w:r>
-        <w:rPr>
-          <w:rFonts w:eastAsia="Times New Roman" w:cs="Helvetica"/>
-          <w:color w:val="000000"/>
-          <w:sz w:val="24"/>
-          <w:szCs w:val="24"/>
-        </w:rPr>
-        <w:t xml:space="preserve">most commonly used </w:t>
-      </w:r>
-      <w:r>
-        <w:rPr>
-          <w:rFonts w:eastAsia="Times New Roman" w:cs="Helvetica"/>
-          <w:color w:val="000000"/>
-          <w:sz w:val="24"/>
-          <w:szCs w:val="24"/>
-        </w:rPr>
-        <w:t xml:space="preserve">punctuation symbols for </w:t>
-      </w:r>
-      <w:r>
-        <w:rPr>
-          <w:rFonts w:eastAsia="Times New Roman" w:cs="Helvetica"/>
-          <w:color w:val="000000"/>
-          <w:sz w:val="24"/>
-          <w:szCs w:val="24"/>
-        </w:rPr>
-        <w:t xml:space="preserve">Geez and English as shown below. You can move up your finger to the popup screen to select the </w:t>
-      </w:r>
-      <w:r>
-        <w:rPr>
-          <w:rFonts w:eastAsia="Times New Roman" w:cs="Helvetica"/>
-          <w:color w:val="000000"/>
-          <w:sz w:val="24"/>
-          <w:szCs w:val="24"/>
-        </w:rPr>
-        <w:t xml:space="preserve">right </w:t>
-      </w:r>
-      <w:r>
-        <w:rPr>
-          <w:rFonts w:eastAsia="Times New Roman" w:cs="Helvetica"/>
-          <w:color w:val="000000"/>
-          <w:sz w:val="24"/>
-          <w:szCs w:val="24"/>
-        </w:rPr>
-        <w:t>symbol.</w:t>
-      </w:r>
-      <w:r>
-        <w:rPr>
-          <w:rFonts w:eastAsia="Times New Roman" w:cs="Helvetica"/>
-          <w:b/>
-          <w:bCs/>
-          <w:noProof/>
-          <w:color w:val="000000"/>
-          <w:sz w:val="24"/>
-          <w:szCs w:val="24"/>
-        </w:rPr>
-        <w:t xml:space="preserve"> </w:t>
-      </w:r>
+        <w:t>Geez numerals can be accessed from the Numerals layer. Long Press (means press and hold it a bit longer) on any numeral key and the corresponding Geez numerals will pop up as shown below. You can move up your finger to the popup screen to select the desired Geez numeral.</w:t>
+      </w:r>
+    </w:p>
+    <w:p>
+      <w:pPr>
+        <w:pStyle w:val="ListParagraph"/>
+        <w:shd w:val="clear" w:color="auto" w:fill="FFFFFF"/>
+        <w:spacing w:line="240" w:lineRule="auto"/>
+        <w:jc w:val="both"/>
+        <w:rPr>
+          <w:rFonts w:eastAsia="Times New Roman" w:cs="Helvetica"/>
+          <w:color w:val="000000"/>
+          <w:sz w:val="24"/>
+          <w:szCs w:val="24"/>
+        </w:rPr>
+      </w:pPr>
+    </w:p>
+    <w:p>
+      <w:pPr>
+        <w:pStyle w:val="ListParagraph"/>
+        <w:shd w:val="clear" w:color="auto" w:fill="FFFFFF"/>
+        <w:spacing w:line="240" w:lineRule="auto"/>
+        <w:jc w:val="both"/>
+        <w:rPr>
+          <w:rFonts w:eastAsia="Times New Roman" w:cs="Helvetica"/>
+          <w:color w:val="000000"/>
+          <w:sz w:val="24"/>
+          <w:szCs w:val="24"/>
+        </w:rPr>
+      </w:pPr>
     </w:p>
     <w:p>
       <w:pPr>
         <w:pStyle w:val="ListParagraph"/>
         <w:shd w:val="clear" w:color="auto" w:fill="FFFFFF"/>
         <w:spacing w:after="0" w:line="240" w:lineRule="auto"/>
-        <w:rPr>
-          <w:rFonts w:eastAsia="Times New Roman" w:cs="Helvetica"/>
-          <w:color w:val="000000"/>
-          <w:sz w:val="36"/>
-          <w:szCs w:val="36"/>
-        </w:rPr>
-      </w:pPr>
-    </w:p>
-    <w:p>
-      <w:pPr>
-        <w:shd w:val="clear" w:color="auto" w:fill="FFFFFF"/>
-        <w:spacing w:after="0" w:line="240" w:lineRule="auto"/>
         <w:jc w:val="center"/>
         <w:rPr>
-          <w:rFonts w:eastAsia="Times New Roman" w:cs="Helvetica"/>
-          <w:b/>
-          <w:bCs/>
+          <w:rFonts w:ascii="GS GeezMahtemUnicode" w:eastAsia="Times New Roman" w:hAnsi="GS GeezMahtemUnicode" w:cs="Nyala"/>
           <w:color w:val="000000"/>
           <w:sz w:val="24"/>
           <w:szCs w:val="24"/>
@@ -10299,18 +12035,18 @@
         <mc:AlternateContent>
           <mc:Choice Requires="wps">
             <w:drawing>
-              <wp:anchor distT="0" distB="0" distL="114300" distR="114300" simplePos="0" relativeHeight="251664384" behindDoc="0" locked="0" layoutInCell="1" allowOverlap="1" wp14:anchorId="78923F86" wp14:editId="219B16DF">
+              <wp:anchor distT="0" distB="0" distL="114300" distR="114300" simplePos="0" relativeHeight="251687936" behindDoc="0" locked="0" layoutInCell="1" allowOverlap="1" wp14:anchorId="4195342A" wp14:editId="6E9955B2">
                 <wp:simplePos x="0" y="0"/>
                 <wp:positionH relativeFrom="column">
-                  <wp:posOffset>4940300</wp:posOffset>
+                  <wp:posOffset>890336</wp:posOffset>
                 </wp:positionH>
                 <wp:positionV relativeFrom="paragraph">
-                  <wp:posOffset>2349279</wp:posOffset>
+                  <wp:posOffset>702043</wp:posOffset>
                 </wp:positionV>
-                <wp:extent cx="327439" cy="456896"/>
-                <wp:effectExtent l="63500" t="63500" r="66675" b="64135"/>
+                <wp:extent cx="427990" cy="576218"/>
+                <wp:effectExtent l="63500" t="63500" r="67310" b="59055"/>
                 <wp:wrapNone/>
-                <wp:docPr id="1201574087" name="Rounded Rectangle 1"/>
+                <wp:docPr id="467919121" name="Rounded Rectangle 1"/>
                 <wp:cNvGraphicFramePr/>
                 <a:graphic xmlns:a="http://schemas.openxmlformats.org/drawingml/2006/main">
                   <a:graphicData uri="http://schemas.microsoft.com/office/word/2010/wordprocessingShape">
@@ -10319,7 +12055,7 @@
                       <wps:spPr>
                         <a:xfrm>
                           <a:off x="0" y="0"/>
-                          <a:ext cx="327439" cy="456896"/>
+                          <a:ext cx="427990" cy="576218"/>
                         </a:xfrm>
                         <a:prstGeom prst="roundRect">
                           <a:avLst/>
@@ -10377,7 +12113,7 @@
           </mc:Choice>
           <mc:Fallback>
             <w:pict>
-              <v:roundrect w14:anchorId="06EF8621" id="Rounded Rectangle 1" o:spid="_x0000_s1026" style="position:absolute;margin-left:389pt;margin-top:185pt;width:25.8pt;height:36pt;z-index:251664384;visibility:visible;mso-wrap-style:square;mso-width-percent:0;mso-height-percent:0;mso-wrap-distance-left:9pt;mso-wrap-distance-top:0;mso-wrap-distance-right:9pt;mso-wrap-distance-bottom:0;mso-position-horizontal:absolute;mso-position-horizontal-relative:text;mso-position-vertical:absolute;mso-position-vertical-relative:text;mso-width-percent:0;mso-height-percent:0;mso-width-relative:margin;mso-height-relative:margin;v-text-anchor:middle" arcsize="10923f" o:gfxdata="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" filled="f" strokecolor="#2e74b5 [2408]" strokeweight="2.25pt">
+              <v:roundrect w14:anchorId="29FE6C1B" id="Rounded Rectangle 1" o:spid="_x0000_s1026" style="position:absolute;margin-left:70.1pt;margin-top:55.3pt;width:33.7pt;height:45.35pt;z-index:251687936;visibility:visible;mso-wrap-style:square;mso-width-percent:0;mso-height-percent:0;mso-wrap-distance-left:9pt;mso-wrap-distance-top:0;mso-wrap-distance-right:9pt;mso-wrap-distance-bottom:0;mso-position-horizontal:absolute;mso-position-horizontal-relative:text;mso-position-vertical:absolute;mso-position-vertical-relative:text;mso-width-percent:0;mso-height-percent:0;mso-width-relative:margin;mso-height-relative:margin;v-text-anchor:middle" arcsize="10923f" o:gfxdata="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" filled="f" strokecolor="#2e74b5 [2408]" strokeweight="2.25pt">
                 <v:stroke joinstyle="miter"/>
               </v:roundrect>
             </w:pict>
@@ -10386,19 +12122,17 @@
       </w:r>
       <w:r>
         <w:rPr>
-          <w:rFonts w:eastAsia="Times New Roman" w:cs="Helvetica"/>
-          <w:b/>
-          <w:bCs/>
+          <w:rFonts w:ascii="GS GeezMahtemUnicode" w:eastAsia="Times New Roman" w:hAnsi="GS GeezMahtemUnicode" w:cs="Nyala"/>
           <w:noProof/>
           <w:color w:val="000000"/>
           <w:sz w:val="24"/>
           <w:szCs w:val="24"/>
         </w:rPr>
         <w:drawing>
-          <wp:inline distT="0" distB="0" distL="0" distR="0" wp14:anchorId="286FAB85" wp14:editId="77B87931">
-            <wp:extent cx="5257799" cy="3502598"/>
-            <wp:effectExtent l="12700" t="12700" r="13335" b="15875"/>
-            <wp:docPr id="4" name="Picture 4" descr="A screen shot of a calculator&#10;&#10;Description automatically generated with medium confidence"/>
+          <wp:inline distT="0" distB="0" distL="0" distR="0" wp14:anchorId="32FD78D2" wp14:editId="293FBD76">
+            <wp:extent cx="5257800" cy="3302000"/>
+            <wp:effectExtent l="12700" t="12700" r="12700" b="12700"/>
+            <wp:docPr id="1760461964" name="Picture 10"/>
             <wp:cNvGraphicFramePr>
               <a:graphicFrameLocks xmlns:a="http://schemas.openxmlformats.org/drawingml/2006/main" noChangeAspect="1"/>
             </wp:cNvGraphicFramePr>
@@ -10406,375 +12140,7 @@
               <a:graphicData uri="http://schemas.openxmlformats.org/drawingml/2006/picture">
                 <pic:pic xmlns:pic="http://schemas.openxmlformats.org/drawingml/2006/picture">
                   <pic:nvPicPr>
-                    <pic:cNvPr id="4" name="Picture 4" descr="A screen shot of a calculator&#10;&#10;Description automatically generated with medium confidence"/>
-                    <pic:cNvPicPr/>
-                  </pic:nvPicPr>
-                  <pic:blipFill rotWithShape="1">
-                    <a:blip r:embed="rId11">
-                      <a:extLst>
-                        <a:ext uri="{28A0092B-C50C-407E-A947-70E740481C1C}">
-                          <a14:useLocalDpi xmlns:a14="http://schemas.microsoft.com/office/drawing/2010/main" val="0"/>
-                        </a:ext>
-                      </a:extLst>
-                    </a:blip>
-                    <a:srcRect t="1502"/>
-                    <a:stretch>
-                      <a:fillRect/>
-                    </a:stretch>
-                  </pic:blipFill>
-                  <pic:spPr bwMode="auto">
-                    <a:xfrm>
-                      <a:off x="0" y="0"/>
-                      <a:ext cx="5258070" cy="3502778"/>
-                    </a:xfrm>
-                    <a:prstGeom prst="rect">
-                      <a:avLst/>
-                    </a:prstGeom>
-                    <a:ln w="9525" cap="flat" cmpd="sng" algn="ctr">
-                      <a:solidFill>
-                        <a:sysClr val="windowText" lastClr="000000"/>
-                      </a:solidFill>
-                      <a:prstDash val="solid"/>
-                      <a:round/>
-                      <a:headEnd type="none" w="med" len="med"/>
-                      <a:tailEnd type="none" w="med" len="med"/>
-                      <a:extLst>
-                        <a:ext uri="{C807C97D-BFC1-408E-A445-0C87EB9F89A2}">
-                          <ask:lineSketchStyleProps xmlns:ask="http://schemas.microsoft.com/office/drawing/2018/sketchyshapes" sd="0">
-                            <a:custGeom>
-                              <a:avLst/>
-                              <a:gdLst/>
-                              <a:ahLst/>
-                              <a:cxnLst/>
-                              <a:rect l="0" t="0" r="0" b="0"/>
-                              <a:pathLst/>
-                            </a:custGeom>
-                            <ask:type/>
-                          </ask:lineSketchStyleProps>
-                        </a:ext>
-                      </a:extLst>
-                    </a:ln>
-                    <a:extLst>
-                      <a:ext uri="{53640926-AAD7-44D8-BBD7-CCE9431645EC}">
-                        <a14:shadowObscured xmlns:a14="http://schemas.microsoft.com/office/drawing/2010/main"/>
-                      </a:ext>
-                    </a:extLst>
-                  </pic:spPr>
-                </pic:pic>
-              </a:graphicData>
-            </a:graphic>
-          </wp:inline>
-        </w:drawing>
-      </w:r>
-    </w:p>
-    <w:p>
-      <w:pPr>
-        <w:rPr>
-          <w:rFonts w:eastAsia="Times New Roman" w:cs="Helvetica"/>
-          <w:b/>
-          <w:bCs/>
-          <w:color w:val="000000"/>
-          <w:sz w:val="24"/>
-          <w:szCs w:val="24"/>
-        </w:rPr>
-      </w:pPr>
-      <w:r>
-        <w:rPr>
-          <w:rFonts w:eastAsia="Times New Roman" w:cs="Helvetica"/>
-          <w:b/>
-          <w:bCs/>
-          <w:noProof/>
-          <w:color w:val="000000"/>
-          <w:sz w:val="24"/>
-          <w:szCs w:val="24"/>
-        </w:rPr>
-        <mc:AlternateContent>
-          <mc:Choice Requires="wpi">
-            <w:drawing>
-              <wp:anchor distT="0" distB="0" distL="114300" distR="114300" simplePos="0" relativeHeight="251660288" behindDoc="0" locked="0" layoutInCell="1" allowOverlap="1" wp14:anchorId="0C8D577E" wp14:editId="75B46B3E">
-                <wp:simplePos x="0" y="0"/>
-                <wp:positionH relativeFrom="column">
-                  <wp:posOffset>-5079060</wp:posOffset>
-                </wp:positionH>
-                <wp:positionV relativeFrom="paragraph">
-                  <wp:posOffset>145610</wp:posOffset>
-                </wp:positionV>
-                <wp:extent cx="413640" cy="398880"/>
-                <wp:effectExtent l="38100" t="38100" r="43815" b="39370"/>
-                <wp:wrapNone/>
-                <wp:docPr id="12" name="Ink 12"/>
-                <wp:cNvGraphicFramePr/>
-                <a:graphic xmlns:a="http://schemas.openxmlformats.org/drawingml/2006/main">
-                  <a:graphicData uri="http://schemas.microsoft.com/office/word/2010/wordprocessingInk">
-                    <w14:contentPart bwMode="auto" r:id="rId12">
-                      <w14:nvContentPartPr>
-                        <w14:cNvContentPartPr/>
-                      </w14:nvContentPartPr>
-                      <w14:xfrm>
-                        <a:off x="0" y="0"/>
-                        <a:ext cx="413640" cy="398880"/>
-                      </w14:xfrm>
-                    </w14:contentPart>
-                  </a:graphicData>
-                </a:graphic>
-              </wp:anchor>
-            </w:drawing>
-          </mc:Choice>
-          <mc:Fallback>
-            <w:pict>
-              <v:shape w14:anchorId="37E3538C" id="Ink 12" o:spid="_x0000_s1026" type="#_x0000_t75" style="position:absolute;margin-left:-400.65pt;margin-top:10.75pt;width:33.95pt;height:32.8pt;z-index:251660288;visibility:visible;mso-wrap-style:square;mso-wrap-distance-left:9pt;mso-wrap-distance-top:0;mso-wrap-distance-right:9pt;mso-wrap-distance-bottom:0;mso-position-horizontal:absolute;mso-position-horizontal-relative:text;mso-position-vertical:absolute;mso-position-vertical-relative:text" o:gfxdata="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">
-                <v:imagedata r:id="rId16" o:title=""/>
-              </v:shape>
-            </w:pict>
-          </mc:Fallback>
-        </mc:AlternateContent>
-      </w:r>
-      <w:r>
-        <w:rPr>
-          <w:rFonts w:eastAsia="Times New Roman" w:cs="Helvetica"/>
-          <w:b/>
-          <w:bCs/>
-          <w:color w:val="000000"/>
-          <w:sz w:val="24"/>
-          <w:szCs w:val="24"/>
-        </w:rPr>
-        <w:br w:type="page"/>
-      </w:r>
-    </w:p>
-    <w:p>
-      <w:pPr>
-        <w:pStyle w:val="ListParagraph"/>
-        <w:shd w:val="clear" w:color="auto" w:fill="FFFFFF"/>
-        <w:spacing w:after="0" w:line="240" w:lineRule="auto"/>
-        <w:rPr>
-          <w:rFonts w:eastAsia="Times New Roman" w:cs="Helvetica"/>
-          <w:b/>
-          <w:bCs/>
-          <w:color w:val="000000"/>
-          <w:sz w:val="36"/>
-          <w:szCs w:val="36"/>
-        </w:rPr>
-      </w:pPr>
-      <w:r>
-        <w:rPr>
-          <w:rFonts w:eastAsia="Times New Roman" w:cs="Helvetica"/>
-          <w:b/>
-          <w:bCs/>
-          <w:color w:val="000000"/>
-          <w:sz w:val="36"/>
-          <w:szCs w:val="36"/>
-        </w:rPr>
-        <w:lastRenderedPageBreak/>
-        <w:t xml:space="preserve">Long Press </w:t>
-      </w:r>
-      <w:r>
-        <w:rPr>
-          <w:rFonts w:eastAsia="Times New Roman" w:cs="Helvetica"/>
-          <w:b/>
-          <w:bCs/>
-          <w:color w:val="000000"/>
-          <w:sz w:val="36"/>
-          <w:szCs w:val="36"/>
-        </w:rPr>
-        <w:t>to Select</w:t>
-      </w:r>
-      <w:r>
-        <w:rPr>
-          <w:rFonts w:eastAsia="Times New Roman" w:cs="Helvetica"/>
-          <w:b/>
-          <w:bCs/>
-          <w:color w:val="000000"/>
-          <w:sz w:val="36"/>
-          <w:szCs w:val="36"/>
-        </w:rPr>
-        <w:t xml:space="preserve"> Geez Numerals:</w:t>
-      </w:r>
-    </w:p>
-    <w:p>
-      <w:pPr>
-        <w:pStyle w:val="ListParagraph"/>
-        <w:shd w:val="clear" w:color="auto" w:fill="FFFFFF"/>
-        <w:spacing w:line="240" w:lineRule="auto"/>
-        <w:jc w:val="both"/>
-        <w:rPr>
-          <w:rFonts w:eastAsia="Times New Roman" w:cs="Helvetica"/>
-          <w:color w:val="000000"/>
-          <w:sz w:val="24"/>
-          <w:szCs w:val="24"/>
-        </w:rPr>
-      </w:pPr>
-      <w:r>
-        <w:rPr>
-          <w:rFonts w:eastAsia="Times New Roman" w:cs="Helvetica"/>
-          <w:color w:val="000000"/>
-          <w:sz w:val="24"/>
-          <w:szCs w:val="24"/>
-        </w:rPr>
-        <w:t>Geez numerals can be accessed from the Numerals layer. Long Press (means press and hold it a bit longer) on any numeral key and the corresponding Geez numerals will pop up as shown below. You can move up your finger to the popup screen to select the desired Geez numeral.</w:t>
-      </w:r>
-    </w:p>
-    <w:p>
-      <w:pPr>
-        <w:pStyle w:val="ListParagraph"/>
-        <w:shd w:val="clear" w:color="auto" w:fill="FFFFFF"/>
-        <w:spacing w:line="240" w:lineRule="auto"/>
-        <w:jc w:val="both"/>
-        <w:rPr>
-          <w:rFonts w:eastAsia="Times New Roman" w:cs="Helvetica"/>
-          <w:color w:val="000000"/>
-          <w:sz w:val="24"/>
-          <w:szCs w:val="24"/>
-        </w:rPr>
-      </w:pPr>
-    </w:p>
-    <w:p>
-      <w:pPr>
-        <w:pStyle w:val="ListParagraph"/>
-        <w:shd w:val="clear" w:color="auto" w:fill="FFFFFF"/>
-        <w:spacing w:after="0" w:line="240" w:lineRule="auto"/>
-        <w:rPr>
-          <w:rFonts w:ascii="GS GeezMahtemUnicode" w:eastAsia="Times New Roman" w:hAnsi="GS GeezMahtemUnicode" w:cs="Nyala"/>
-          <w:color w:val="000000"/>
-          <w:sz w:val="24"/>
-          <w:szCs w:val="24"/>
-        </w:rPr>
-      </w:pPr>
-    </w:p>
-    <w:p>
-      <w:pPr>
-        <w:shd w:val="clear" w:color="auto" w:fill="FFFFFF"/>
-        <w:spacing w:after="0" w:line="240" w:lineRule="auto"/>
-        <w:jc w:val="center"/>
-        <w:rPr>
-          <w:rFonts w:eastAsia="Times New Roman" w:cs="Helvetica"/>
-          <w:b/>
-          <w:bCs/>
-          <w:color w:val="000000"/>
-          <w:sz w:val="24"/>
-          <w:szCs w:val="24"/>
-        </w:rPr>
-      </w:pPr>
-      <w:r>
-        <w:rPr>
-          <w:rFonts w:eastAsia="Times New Roman" w:cs="Helvetica"/>
-          <w:b/>
-          <w:bCs/>
-          <w:noProof/>
-          <w:color w:val="000000"/>
-          <w:sz w:val="24"/>
-          <w:szCs w:val="24"/>
-        </w:rPr>
-        <mc:AlternateContent>
-          <mc:Choice Requires="wps">
-            <w:drawing>
-              <wp:anchor distT="0" distB="0" distL="114300" distR="114300" simplePos="0" relativeHeight="251666432" behindDoc="0" locked="0" layoutInCell="1" allowOverlap="1" wp14:anchorId="62EAC607" wp14:editId="346B54C3">
-                <wp:simplePos x="0" y="0"/>
-                <wp:positionH relativeFrom="column">
-                  <wp:posOffset>914124</wp:posOffset>
-                </wp:positionH>
-                <wp:positionV relativeFrom="paragraph">
-                  <wp:posOffset>1244600</wp:posOffset>
-                </wp:positionV>
-                <wp:extent cx="363910" cy="456896"/>
-                <wp:effectExtent l="63500" t="63500" r="67945" b="64135"/>
-                <wp:wrapNone/>
-                <wp:docPr id="572531192" name="Rounded Rectangle 1"/>
-                <wp:cNvGraphicFramePr/>
-                <a:graphic xmlns:a="http://schemas.openxmlformats.org/drawingml/2006/main">
-                  <a:graphicData uri="http://schemas.microsoft.com/office/word/2010/wordprocessingShape">
-                    <wps:wsp>
-                      <wps:cNvSpPr/>
-                      <wps:spPr>
-                        <a:xfrm>
-                          <a:off x="0" y="0"/>
-                          <a:ext cx="363910" cy="456896"/>
-                        </a:xfrm>
-                        <a:prstGeom prst="roundRect">
-                          <a:avLst/>
-                        </a:prstGeom>
-                        <a:noFill/>
-                        <a:ln w="28575">
-                          <a:solidFill>
-                            <a:schemeClr val="accent5">
-                              <a:lumMod val="75000"/>
-                            </a:schemeClr>
-                          </a:solidFill>
-                        </a:ln>
-                        <a:effectLst>
-                          <a:glow rad="50800">
-                            <a:schemeClr val="accent1">
-                              <a:satMod val="175000"/>
-                              <a:alpha val="40000"/>
-                            </a:schemeClr>
-                          </a:glow>
-                        </a:effectLst>
-                      </wps:spPr>
-                      <wps:style>
-                        <a:lnRef idx="2">
-                          <a:schemeClr val="accent1">
-                            <a:shade val="15000"/>
-                          </a:schemeClr>
-                        </a:lnRef>
-                        <a:fillRef idx="1">
-                          <a:schemeClr val="accent1"/>
-                        </a:fillRef>
-                        <a:effectRef idx="0">
-                          <a:schemeClr val="accent1"/>
-                        </a:effectRef>
-                        <a:fontRef idx="minor">
-                          <a:schemeClr val="lt1"/>
-                        </a:fontRef>
-                      </wps:style>
-                      <wps:bodyPr rot="0" spcFirstLastPara="0" vertOverflow="overflow" horzOverflow="overflow" vert="horz" wrap="square" lIns="91440" tIns="45720" rIns="91440" bIns="45720" numCol="1" spcCol="0" rtlCol="0" fromWordArt="0" anchor="ctr" anchorCtr="0" forceAA="0" compatLnSpc="1">
-                        <a:prstTxWarp prst="textNoShape">
-                          <a:avLst/>
-                        </a:prstTxWarp>
-                        <a:noAutofit/>
-                      </wps:bodyPr>
-                    </wps:wsp>
-                  </a:graphicData>
-                </a:graphic>
-                <wp14:sizeRelH relativeFrom="margin">
-                  <wp14:pctWidth>0</wp14:pctWidth>
-                </wp14:sizeRelH>
-                <wp14:sizeRelV relativeFrom="margin">
-                  <wp14:pctHeight>0</wp14:pctHeight>
-                </wp14:sizeRelV>
-              </wp:anchor>
-            </w:drawing>
-          </mc:Choice>
-          <mc:Fallback>
-            <w:pict>
-              <v:roundrect w14:anchorId="3868D25F" id="Rounded Rectangle 1" o:spid="_x0000_s1026" style="position:absolute;margin-left:1in;margin-top:98pt;width:28.65pt;height:36pt;z-index:251666432;visibility:visible;mso-wrap-style:square;mso-width-percent:0;mso-height-percent:0;mso-wrap-distance-left:9pt;mso-wrap-distance-top:0;mso-wrap-distance-right:9pt;mso-wrap-distance-bottom:0;mso-position-horizontal:absolute;mso-position-horizontal-relative:text;mso-position-vertical:absolute;mso-position-vertical-relative:text;mso-width-percent:0;mso-height-percent:0;mso-width-relative:margin;mso-height-relative:margin;v-text-anchor:middle" arcsize="10923f" o:gfxdata="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" filled="f" strokecolor="#2e74b5 [2408]" strokeweight="2.25pt">
-                <v:stroke joinstyle="miter"/>
-              </v:roundrect>
-            </w:pict>
-          </mc:Fallback>
-        </mc:AlternateContent>
-      </w:r>
-      <w:r>
-        <w:rPr>
-          <w:rFonts w:eastAsia="Times New Roman" w:cs="Helvetica"/>
-          <w:b/>
-          <w:bCs/>
-          <w:noProof/>
-          <w:color w:val="000000"/>
-          <w:sz w:val="24"/>
-          <w:szCs w:val="24"/>
-        </w:rPr>
-        <w:drawing>
-          <wp:inline distT="0" distB="0" distL="0" distR="0" wp14:anchorId="026E0746" wp14:editId="370D8A9E">
-            <wp:extent cx="5256226" cy="3795823"/>
-            <wp:effectExtent l="12700" t="12700" r="14605" b="14605"/>
-            <wp:docPr id="5" name="Picture 5" descr="A screen shot of a calculator&#10;&#10;Description automatically generated with medium confidence"/>
-            <wp:cNvGraphicFramePr>
-              <a:graphicFrameLocks xmlns:a="http://schemas.openxmlformats.org/drawingml/2006/main" noChangeAspect="1"/>
-            </wp:cNvGraphicFramePr>
-            <a:graphic xmlns:a="http://schemas.openxmlformats.org/drawingml/2006/main">
-              <a:graphicData uri="http://schemas.openxmlformats.org/drawingml/2006/picture">
-                <pic:pic xmlns:pic="http://schemas.openxmlformats.org/drawingml/2006/picture">
-                  <pic:nvPicPr>
-                    <pic:cNvPr id="5" name="Picture 5" descr="A screen shot of a calculator&#10;&#10;Description automatically generated with medium confidence"/>
+                    <pic:cNvPr id="1760461964" name="Picture 1760461964"/>
                     <pic:cNvPicPr/>
                   </pic:nvPicPr>
                   <pic:blipFill>
@@ -10792,12 +12158,12 @@
                   <pic:spPr>
                     <a:xfrm>
                       <a:off x="0" y="0"/>
-                      <a:ext cx="5306834" cy="3832370"/>
+                      <a:ext cx="5257800" cy="3302000"/>
                     </a:xfrm>
                     <a:prstGeom prst="rect">
                       <a:avLst/>
                     </a:prstGeom>
-                    <a:ln>
+                    <a:ln w="12700">
                       <a:solidFill>
                         <a:schemeClr val="tx1"/>
                       </a:solidFill>
@@ -10814,6 +12180,21 @@
       <w:pPr>
         <w:shd w:val="clear" w:color="auto" w:fill="FFFFFF"/>
         <w:spacing w:after="0" w:line="240" w:lineRule="auto"/>
+        <w:jc w:val="center"/>
+        <w:rPr>
+          <w:rFonts w:eastAsia="Times New Roman" w:cs="Helvetica"/>
+          <w:b/>
+          <w:bCs/>
+          <w:color w:val="000000"/>
+          <w:sz w:val="24"/>
+          <w:szCs w:val="24"/>
+        </w:rPr>
+      </w:pPr>
+    </w:p>
+    <w:p>
+      <w:pPr>
+        <w:shd w:val="clear" w:color="auto" w:fill="FFFFFF"/>
+        <w:spacing w:after="0" w:line="240" w:lineRule="auto"/>
         <w:rPr>
           <w:rFonts w:eastAsia="Times New Roman" w:cs="Helvetica"/>
           <w:b/>
@@ -10856,1030 +12237,6 @@
           <w:color w:val="000000"/>
           <w:sz w:val="36"/>
           <w:szCs w:val="36"/>
-        </w:rPr>
-        <w:t>Special Key (</w:t>
-      </w:r>
-      <w:r>
-        <w:rPr>
-          <w:rFonts w:eastAsia="Times New Roman" w:cs="Helvetica"/>
-          <w:b/>
-          <w:bCs/>
-          <w:color w:val="000000"/>
-          <w:sz w:val="36"/>
-          <w:szCs w:val="36"/>
-        </w:rPr>
-        <w:t xml:space="preserve"> “^”</w:t>
-      </w:r>
-      <w:r>
-        <w:rPr>
-          <w:rFonts w:eastAsia="Times New Roman" w:cs="Helvetica"/>
-          <w:b/>
-          <w:bCs/>
-          <w:color w:val="000000"/>
-          <w:sz w:val="36"/>
-          <w:szCs w:val="36"/>
-        </w:rPr>
-        <w:t>)</w:t>
-      </w:r>
-      <w:r>
-        <w:rPr>
-          <w:rFonts w:eastAsia="Times New Roman" w:cs="Helvetica"/>
-          <w:b/>
-          <w:bCs/>
-          <w:color w:val="000000"/>
-          <w:sz w:val="36"/>
-          <w:szCs w:val="36"/>
-        </w:rPr>
-        <w:t xml:space="preserve"> to Duplicate previous letter.</w:t>
-      </w:r>
-      <w:r>
-        <w:rPr>
-          <w:rFonts w:eastAsia="Times New Roman" w:cs="Helvetica"/>
-          <w:b/>
-          <w:bCs/>
-          <w:noProof/>
-          <w:color w:val="000000"/>
-          <w:sz w:val="24"/>
-          <w:szCs w:val="24"/>
-        </w:rPr>
-        <w:t xml:space="preserve"> </w:t>
-      </w:r>
-    </w:p>
-    <w:p>
-      <w:pPr>
-        <w:rPr>
-          <w:rFonts w:eastAsia="Times New Roman" w:cs="Helvetica"/>
-          <w:color w:val="000000"/>
-          <w:sz w:val="24"/>
-          <w:szCs w:val="24"/>
-        </w:rPr>
-      </w:pPr>
-      <w:r>
-        <w:rPr>
-          <w:rFonts w:eastAsia="Times New Roman" w:cs="Helvetica"/>
-          <w:color w:val="000000"/>
-          <w:sz w:val="24"/>
-          <w:szCs w:val="24"/>
-        </w:rPr>
-        <w:t xml:space="preserve">The “Press Twice” </w:t>
-      </w:r>
-      <w:r>
-        <w:rPr>
-          <w:rFonts w:eastAsia="Times New Roman" w:cs="Helvetica"/>
-          <w:color w:val="000000"/>
-          <w:sz w:val="24"/>
-          <w:szCs w:val="24"/>
-        </w:rPr>
-        <w:t xml:space="preserve">special </w:t>
-      </w:r>
-      <w:r>
-        <w:rPr>
-          <w:rFonts w:eastAsia="Times New Roman" w:cs="Helvetica"/>
-          <w:color w:val="000000"/>
-          <w:sz w:val="24"/>
-          <w:szCs w:val="24"/>
-        </w:rPr>
-        <w:t>letters</w:t>
-      </w:r>
-      <w:r>
-        <w:rPr>
-          <w:rFonts w:eastAsia="Times New Roman" w:cs="Helvetica"/>
-          <w:color w:val="000000"/>
-          <w:sz w:val="24"/>
-          <w:szCs w:val="24"/>
-        </w:rPr>
-        <w:t>, can be typed in duplicate with a</w:t>
-      </w:r>
-      <w:r>
-        <w:rPr>
-          <w:rFonts w:eastAsia="Times New Roman" w:cs="Helvetica"/>
-          <w:color w:val="000000"/>
-          <w:sz w:val="24"/>
-          <w:szCs w:val="24"/>
-        </w:rPr>
-        <w:t xml:space="preserve"> little trick </w:t>
-      </w:r>
-      <w:r>
-        <w:rPr>
-          <w:rFonts w:eastAsia="Times New Roman" w:cs="Helvetica"/>
-          <w:color w:val="000000"/>
-          <w:sz w:val="24"/>
-          <w:szCs w:val="24"/>
-        </w:rPr>
-        <w:t xml:space="preserve">using </w:t>
-      </w:r>
-      <w:r>
-        <w:rPr>
-          <w:rFonts w:eastAsia="Times New Roman" w:cs="Helvetica"/>
-          <w:b/>
-          <w:bCs/>
-          <w:color w:val="000000"/>
-          <w:sz w:val="24"/>
-          <w:szCs w:val="24"/>
-        </w:rPr>
-        <w:t>“</w:t>
-      </w:r>
-      <w:r>
-        <w:rPr>
-          <w:rFonts w:eastAsia="Times New Roman" w:cs="Helvetica"/>
-          <w:b/>
-          <w:bCs/>
-          <w:color w:val="000000"/>
-          <w:sz w:val="24"/>
-          <w:szCs w:val="24"/>
-        </w:rPr>
-        <w:t>^</w:t>
-      </w:r>
-      <w:r>
-        <w:rPr>
-          <w:rFonts w:eastAsia="Times New Roman" w:cs="Helvetica"/>
-          <w:b/>
-          <w:bCs/>
-          <w:color w:val="000000"/>
-          <w:sz w:val="24"/>
-          <w:szCs w:val="24"/>
-        </w:rPr>
-        <w:t>”</w:t>
-      </w:r>
-      <w:r>
-        <w:rPr>
-          <w:rFonts w:eastAsia="Times New Roman" w:cs="Helvetica"/>
-          <w:color w:val="000000"/>
-          <w:sz w:val="24"/>
-          <w:szCs w:val="24"/>
-        </w:rPr>
-        <w:t>.</w:t>
-      </w:r>
-    </w:p>
-    <w:p>
-      <w:pPr>
-        <w:rPr>
-          <w:rFonts w:ascii="GS GeezMahtemUnicode" w:eastAsia="Times New Roman" w:hAnsi="GS GeezMahtemUnicode" w:cs="Abyssinica SIL"/>
-          <w:color w:val="000000"/>
-          <w:sz w:val="24"/>
-          <w:szCs w:val="24"/>
-        </w:rPr>
-      </w:pPr>
-      <w:r>
-        <w:rPr>
-          <w:rFonts w:eastAsia="Times New Roman" w:cs="Helvetica"/>
-          <w:color w:val="000000"/>
-          <w:sz w:val="24"/>
-          <w:szCs w:val="24"/>
-        </w:rPr>
-        <w:t xml:space="preserve"> For example, to type </w:t>
-      </w:r>
-      <w:r>
-        <w:rPr>
-          <w:rFonts w:ascii="GS GeezMahtemUnicode" w:eastAsia="Times New Roman" w:hAnsi="GS GeezMahtemUnicode" w:cs="Abyssinica SIL"/>
-          <w:color w:val="000000"/>
-          <w:sz w:val="24"/>
-          <w:szCs w:val="24"/>
-        </w:rPr>
-        <w:t>ህህ</w:t>
-      </w:r>
-      <w:r>
-        <w:rPr>
-          <w:rFonts w:eastAsia="Times New Roman" w:cs="Helvetica"/>
-          <w:color w:val="000000"/>
-          <w:sz w:val="24"/>
-          <w:szCs w:val="24"/>
-        </w:rPr>
-        <w:t xml:space="preserve"> , use the</w:t>
-      </w:r>
-      <w:r>
-        <w:rPr>
-          <w:rFonts w:eastAsia="Times New Roman" w:cs="Helvetica"/>
-          <w:color w:val="000000"/>
-          <w:sz w:val="24"/>
-          <w:szCs w:val="24"/>
-        </w:rPr>
-        <w:t xml:space="preserve"> </w:t>
-      </w:r>
-      <w:r>
-        <w:rPr>
-          <w:rFonts w:eastAsia="Times New Roman" w:cs="Helvetica"/>
-          <w:b/>
-          <w:bCs/>
-          <w:color w:val="000000"/>
-          <w:sz w:val="24"/>
-          <w:szCs w:val="24"/>
-        </w:rPr>
-        <w:t>“^”</w:t>
-      </w:r>
-      <w:r>
-        <w:rPr>
-          <w:rFonts w:eastAsia="Times New Roman" w:cs="Helvetica"/>
-          <w:color w:val="000000"/>
-          <w:sz w:val="24"/>
-          <w:szCs w:val="24"/>
-        </w:rPr>
-        <w:t xml:space="preserve"> </w:t>
-      </w:r>
-      <w:r>
-        <w:rPr>
-          <w:rFonts w:eastAsia="Times New Roman" w:cs="Helvetica"/>
-          <w:color w:val="000000"/>
-          <w:sz w:val="24"/>
-          <w:szCs w:val="24"/>
-        </w:rPr>
-        <w:t>symbol to duplicate previous letter, as shown below.</w:t>
-      </w:r>
-    </w:p>
-    <w:p>
-      <w:pPr>
-        <w:ind w:firstLine="720"/>
-        <w:rPr>
-          <w:rFonts w:ascii="GS GeezMahtemUnicode" w:eastAsia="Times New Roman" w:hAnsi="GS GeezMahtemUnicode" w:cs="Abyssinica SIL"/>
-          <w:color w:val="000000"/>
-          <w:sz w:val="36"/>
-          <w:szCs w:val="36"/>
-        </w:rPr>
-      </w:pPr>
-      <w:r>
-        <w:rPr>
-          <w:rFonts w:ascii="Courier New" w:eastAsia="Times New Roman" w:hAnsi="Courier New" w:cs="Courier New"/>
-          <w:b/>
-          <w:bCs/>
-          <w:color w:val="000000"/>
-          <w:sz w:val="36"/>
-          <w:szCs w:val="36"/>
-        </w:rPr>
-        <w:t>h^</w:t>
-      </w:r>
-      <w:r>
-        <w:rPr>
-          <w:rFonts w:eastAsia="Times New Roman" w:cs="Helvetica"/>
-          <w:b/>
-          <w:bCs/>
-          <w:color w:val="000000"/>
-          <w:sz w:val="36"/>
-          <w:szCs w:val="36"/>
-        </w:rPr>
-        <w:t xml:space="preserve"> </w:t>
-      </w:r>
-      <w:r>
-        <w:rPr>
-          <w:rFonts w:eastAsia="Times New Roman" w:cs="Helvetica"/>
-          <w:b/>
-          <w:bCs/>
-          <w:color w:val="000000"/>
-          <w:sz w:val="36"/>
-          <w:szCs w:val="36"/>
-        </w:rPr>
-        <w:t>=</w:t>
-      </w:r>
-      <w:r>
-        <w:rPr>
-          <w:rFonts w:ascii="GS GeezMahtemUnicode" w:eastAsia="Times New Roman" w:hAnsi="GS GeezMahtemUnicode" w:cs="Abyssinica SIL"/>
-          <w:color w:val="000000"/>
-          <w:sz w:val="36"/>
-          <w:szCs w:val="36"/>
-        </w:rPr>
-        <w:t xml:space="preserve"> ህህ</w:t>
-      </w:r>
-    </w:p>
-    <w:p>
-      <w:pPr>
-        <w:rPr>
-          <w:rFonts w:ascii="Nyala" w:eastAsia="Times New Roman" w:hAnsi="Nyala" w:cstheme="minorHAnsi"/>
-          <w:color w:val="000000"/>
-          <w:sz w:val="24"/>
-          <w:szCs w:val="24"/>
-          <w:lang w:val="am-ET"/>
-        </w:rPr>
-      </w:pPr>
-      <w:r>
-        <w:rPr>
-          <w:rFonts w:eastAsia="Times New Roman" w:cstheme="minorHAnsi"/>
-          <w:color w:val="000000"/>
-          <w:sz w:val="24"/>
-          <w:szCs w:val="24"/>
-        </w:rPr>
-        <w:t>The same rule applies to others in the table below.</w:t>
-      </w:r>
-    </w:p>
-    <w:tbl>
-      <w:tblPr>
-        <w:tblStyle w:val="TableGrid"/>
-        <w:tblpPr w:leftFromText="180" w:rightFromText="180" w:vertAnchor="text" w:horzAnchor="margin" w:tblpY="-5"/>
-        <w:tblW w:w="0" w:type="auto"/>
-        <w:tblLook w:val="04A0" w:firstRow="1" w:lastRow="0" w:firstColumn="1" w:lastColumn="0" w:noHBand="0" w:noVBand="1"/>
-      </w:tblPr>
-      <w:tblGrid>
-        <w:gridCol w:w="768"/>
-        <w:gridCol w:w="734"/>
-        <w:gridCol w:w="767"/>
-        <w:gridCol w:w="825"/>
-        <w:gridCol w:w="841"/>
-        <w:gridCol w:w="765"/>
-        <w:gridCol w:w="754"/>
-        <w:gridCol w:w="762"/>
-        <w:gridCol w:w="893"/>
-        <w:gridCol w:w="765"/>
-        <w:gridCol w:w="814"/>
-        <w:gridCol w:w="816"/>
-      </w:tblGrid>
-      <w:tr>
-        <w:tc>
-          <w:tcPr>
-            <w:tcW w:w="768" w:type="dxa"/>
-            <w:shd w:val="clear" w:color="auto" w:fill="ADD8E6"/>
-          </w:tcPr>
-          <w:p>
-            <w:pPr>
-              <w:rPr>
-                <w:rFonts w:ascii="Abyssinica SIL" w:eastAsia="Times New Roman" w:hAnsi="Abyssinica SIL" w:cs="Abyssinica SIL"/>
-                <w:color w:val="000000"/>
-                <w:sz w:val="36"/>
-                <w:szCs w:val="36"/>
-              </w:rPr>
-            </w:pPr>
-            <w:proofErr w:type="spellStart"/>
-            <w:r>
-              <w:rPr>
-                <w:rFonts w:ascii="GS GeezMahtemUnicode" w:eastAsia="Times New Roman" w:hAnsi="GS GeezMahtemUnicode" w:cs="Abyssinica SIL"/>
-                <w:color w:val="000000"/>
-                <w:sz w:val="36"/>
-                <w:szCs w:val="36"/>
-              </w:rPr>
-              <w:t>ህህ</w:t>
-            </w:r>
-            <w:proofErr w:type="spellEnd"/>
-          </w:p>
-        </w:tc>
-        <w:tc>
-          <w:tcPr>
-            <w:tcW w:w="734" w:type="dxa"/>
-            <w:shd w:val="clear" w:color="auto" w:fill="ADD8E6"/>
-          </w:tcPr>
-          <w:p>
-            <w:pPr>
-              <w:rPr>
-                <w:rFonts w:ascii="Abyssinica SIL" w:eastAsia="Times New Roman" w:hAnsi="Abyssinica SIL" w:cs="Abyssinica SIL"/>
-                <w:color w:val="000000"/>
-                <w:sz w:val="36"/>
-                <w:szCs w:val="36"/>
-              </w:rPr>
-            </w:pPr>
-            <w:r>
-              <w:rPr>
-                <w:rFonts w:ascii="GS GeezMahtemUnicode" w:eastAsia="Times New Roman" w:hAnsi="GS GeezMahtemUnicode" w:cs="Abyssinica SIL"/>
-                <w:color w:val="000000"/>
-                <w:sz w:val="36"/>
-                <w:szCs w:val="36"/>
-              </w:rPr>
-              <w:t>ስስ</w:t>
-            </w:r>
-          </w:p>
-        </w:tc>
-        <w:tc>
-          <w:tcPr>
-            <w:tcW w:w="767" w:type="dxa"/>
-            <w:shd w:val="clear" w:color="auto" w:fill="ADD8E6"/>
-          </w:tcPr>
-          <w:p>
-            <w:pPr>
-              <w:rPr>
-                <w:rFonts w:ascii="Abyssinica SIL" w:eastAsia="Times New Roman" w:hAnsi="Abyssinica SIL" w:cs="Abyssinica SIL"/>
-                <w:color w:val="000000"/>
-                <w:sz w:val="36"/>
-                <w:szCs w:val="36"/>
-              </w:rPr>
-            </w:pPr>
-            <w:r>
-              <w:rPr>
-                <w:rFonts w:ascii="GS GeezMahtemUnicode" w:eastAsia="Times New Roman" w:hAnsi="GS GeezMahtemUnicode" w:cs="Abyssinica SIL"/>
-                <w:color w:val="000000"/>
-                <w:sz w:val="36"/>
-                <w:szCs w:val="36"/>
-              </w:rPr>
-              <w:t>ቅቅ</w:t>
-            </w:r>
-          </w:p>
-        </w:tc>
-        <w:tc>
-          <w:tcPr>
-            <w:tcW w:w="825" w:type="dxa"/>
-            <w:shd w:val="clear" w:color="auto" w:fill="ADD8E6"/>
-          </w:tcPr>
-          <w:p>
-            <w:pPr>
-              <w:rPr>
-                <w:rFonts w:ascii="Abyssinica SIL" w:eastAsia="Times New Roman" w:hAnsi="Abyssinica SIL" w:cs="Abyssinica SIL"/>
-                <w:color w:val="000000"/>
-                <w:sz w:val="36"/>
-                <w:szCs w:val="36"/>
-              </w:rPr>
-            </w:pPr>
-            <w:r>
-              <w:rPr>
-                <w:rFonts w:ascii="GS GeezMahtemUnicode" w:eastAsia="Times New Roman" w:hAnsi="GS GeezMahtemUnicode" w:cs="Abyssinica SIL"/>
-                <w:color w:val="000000"/>
-                <w:sz w:val="36"/>
-                <w:szCs w:val="36"/>
-              </w:rPr>
-              <w:t>ትት</w:t>
-            </w:r>
-          </w:p>
-        </w:tc>
-        <w:tc>
-          <w:tcPr>
-            <w:tcW w:w="841" w:type="dxa"/>
-            <w:shd w:val="clear" w:color="auto" w:fill="ADD8E6"/>
-          </w:tcPr>
-          <w:p>
-            <w:pPr>
-              <w:rPr>
-                <w:rFonts w:ascii="Abyssinica SIL" w:eastAsia="Times New Roman" w:hAnsi="Abyssinica SIL" w:cs="Abyssinica SIL"/>
-                <w:color w:val="000000"/>
-                <w:sz w:val="36"/>
-                <w:szCs w:val="36"/>
-              </w:rPr>
-            </w:pPr>
-            <w:r>
-              <w:rPr>
-                <w:rFonts w:ascii="GS GeezMahtemUnicode" w:eastAsia="Times New Roman" w:hAnsi="GS GeezMahtemUnicode" w:cs="Abyssinica SIL"/>
-                <w:color w:val="000000"/>
-                <w:sz w:val="36"/>
-                <w:szCs w:val="36"/>
-              </w:rPr>
-              <w:t>ችች</w:t>
-            </w:r>
-          </w:p>
-        </w:tc>
-        <w:tc>
-          <w:tcPr>
-            <w:tcW w:w="765" w:type="dxa"/>
-            <w:shd w:val="clear" w:color="auto" w:fill="ADD8E6"/>
-          </w:tcPr>
-          <w:p>
-            <w:pPr>
-              <w:rPr>
-                <w:rFonts w:ascii="Abyssinica SIL" w:eastAsia="Times New Roman" w:hAnsi="Abyssinica SIL" w:cs="Abyssinica SIL"/>
-                <w:color w:val="000000"/>
-                <w:sz w:val="36"/>
-                <w:szCs w:val="36"/>
-              </w:rPr>
-            </w:pPr>
-            <w:r>
-              <w:rPr>
-                <w:rFonts w:ascii="GS GeezMahtemUnicode" w:eastAsia="Times New Roman" w:hAnsi="GS GeezMahtemUnicode" w:cs="Abyssinica SIL"/>
-                <w:color w:val="000000"/>
-                <w:sz w:val="36"/>
-                <w:szCs w:val="36"/>
-              </w:rPr>
-              <w:t>ንን</w:t>
-            </w:r>
-          </w:p>
-        </w:tc>
-        <w:tc>
-          <w:tcPr>
-            <w:tcW w:w="754" w:type="dxa"/>
-            <w:shd w:val="clear" w:color="auto" w:fill="ADD8E6"/>
-          </w:tcPr>
-          <w:p>
-            <w:pPr>
-              <w:rPr>
-                <w:rFonts w:ascii="Abyssinica SIL" w:eastAsia="Times New Roman" w:hAnsi="Abyssinica SIL" w:cs="Abyssinica SIL"/>
-                <w:color w:val="000000"/>
-                <w:sz w:val="36"/>
-                <w:szCs w:val="36"/>
-              </w:rPr>
-            </w:pPr>
-            <w:r>
-              <w:rPr>
-                <w:rFonts w:ascii="GS GeezMahtemUnicode" w:eastAsia="Times New Roman" w:hAnsi="GS GeezMahtemUnicode" w:cs="Abyssinica SIL"/>
-                <w:color w:val="000000"/>
-                <w:sz w:val="36"/>
-                <w:szCs w:val="36"/>
-              </w:rPr>
-              <w:t>ክክ</w:t>
-            </w:r>
-          </w:p>
-        </w:tc>
-        <w:tc>
-          <w:tcPr>
-            <w:tcW w:w="762" w:type="dxa"/>
-            <w:shd w:val="clear" w:color="auto" w:fill="ADD8E6"/>
-          </w:tcPr>
-          <w:p>
-            <w:pPr>
-              <w:rPr>
-                <w:rFonts w:ascii="Abyssinica SIL" w:eastAsia="Times New Roman" w:hAnsi="Abyssinica SIL" w:cs="Abyssinica SIL"/>
-                <w:color w:val="000000"/>
-                <w:sz w:val="36"/>
-                <w:szCs w:val="36"/>
-              </w:rPr>
-            </w:pPr>
-            <w:r>
-              <w:rPr>
-                <w:rFonts w:ascii="GS GeezMahtemUnicode" w:eastAsia="Times New Roman" w:hAnsi="GS GeezMahtemUnicode" w:cs="Abyssinica SIL"/>
-                <w:color w:val="000000"/>
-                <w:sz w:val="36"/>
-                <w:szCs w:val="36"/>
-              </w:rPr>
-              <w:t>ዝዝ</w:t>
-            </w:r>
-          </w:p>
-        </w:tc>
-        <w:tc>
-          <w:tcPr>
-            <w:tcW w:w="893" w:type="dxa"/>
-            <w:shd w:val="clear" w:color="auto" w:fill="ADD8E6"/>
-          </w:tcPr>
-          <w:p>
-            <w:pPr>
-              <w:rPr>
-                <w:rFonts w:ascii="Abyssinica SIL" w:eastAsia="Times New Roman" w:hAnsi="Abyssinica SIL" w:cs="Abyssinica SIL"/>
-                <w:color w:val="000000"/>
-                <w:sz w:val="36"/>
-                <w:szCs w:val="36"/>
-              </w:rPr>
-            </w:pPr>
-            <w:r>
-              <w:rPr>
-                <w:rFonts w:ascii="GS GeezMahtemUnicode" w:eastAsia="Times New Roman" w:hAnsi="GS GeezMahtemUnicode" w:cs="Abyssinica SIL"/>
-                <w:color w:val="000000"/>
-                <w:sz w:val="36"/>
-                <w:szCs w:val="36"/>
-              </w:rPr>
-              <w:t>ድድ</w:t>
-            </w:r>
-          </w:p>
-        </w:tc>
-        <w:tc>
-          <w:tcPr>
-            <w:tcW w:w="765" w:type="dxa"/>
-            <w:shd w:val="clear" w:color="auto" w:fill="ADD8E6"/>
-          </w:tcPr>
-          <w:p>
-            <w:pPr>
-              <w:rPr>
-                <w:rFonts w:ascii="Abyssinica SIL" w:eastAsia="Times New Roman" w:hAnsi="Abyssinica SIL" w:cs="Abyssinica SIL"/>
-                <w:color w:val="000000"/>
-                <w:sz w:val="36"/>
-                <w:szCs w:val="36"/>
-              </w:rPr>
-            </w:pPr>
-            <w:r>
-              <w:rPr>
-                <w:rFonts w:ascii="GS GeezMahtemUnicode" w:eastAsia="Times New Roman" w:hAnsi="GS GeezMahtemUnicode" w:cs="Abyssinica SIL"/>
-                <w:color w:val="000000"/>
-                <w:sz w:val="36"/>
-                <w:szCs w:val="36"/>
-              </w:rPr>
-              <w:t>ግግ</w:t>
-            </w:r>
-          </w:p>
-        </w:tc>
-        <w:tc>
-          <w:tcPr>
-            <w:tcW w:w="814" w:type="dxa"/>
-            <w:shd w:val="clear" w:color="auto" w:fill="ADD8E6"/>
-          </w:tcPr>
-          <w:p>
-            <w:pPr>
-              <w:rPr>
-                <w:rFonts w:ascii="Abyssinica SIL" w:eastAsia="Times New Roman" w:hAnsi="Abyssinica SIL" w:cs="Abyssinica SIL"/>
-                <w:color w:val="000000"/>
-                <w:sz w:val="36"/>
-                <w:szCs w:val="36"/>
-              </w:rPr>
-            </w:pPr>
-            <w:r>
-              <w:rPr>
-                <w:rFonts w:ascii="GS GeezMahtemUnicode" w:eastAsia="Times New Roman" w:hAnsi="GS GeezMahtemUnicode" w:cs="Abyssinica SIL"/>
-                <w:color w:val="000000"/>
-                <w:sz w:val="36"/>
-                <w:szCs w:val="36"/>
-              </w:rPr>
-              <w:t>ጽጽ</w:t>
-            </w:r>
-          </w:p>
-        </w:tc>
-        <w:tc>
-          <w:tcPr>
-            <w:tcW w:w="816" w:type="dxa"/>
-            <w:shd w:val="clear" w:color="auto" w:fill="ADD8E6"/>
-          </w:tcPr>
-          <w:p>
-            <w:pPr>
-              <w:rPr>
-                <w:rFonts w:ascii="GS GeezMahtemUnicode" w:eastAsia="Times New Roman" w:hAnsi="GS GeezMahtemUnicode" w:cs="Abyssinica SIL"/>
-                <w:color w:val="000000"/>
-                <w:sz w:val="36"/>
-                <w:szCs w:val="36"/>
-              </w:rPr>
-            </w:pPr>
-            <w:r>
-              <w:rPr>
-                <w:rFonts w:ascii="GS GeezMahtemUnicode" w:eastAsia="Times New Roman" w:hAnsi="GS GeezMahtemUnicode" w:cs="Abyssinica SIL"/>
-                <w:color w:val="000000"/>
-                <w:sz w:val="36"/>
-                <w:szCs w:val="36"/>
-              </w:rPr>
-              <w:t>ፕፕ</w:t>
-            </w:r>
-          </w:p>
-        </w:tc>
-      </w:tr>
-      <w:tr>
-        <w:tc>
-          <w:tcPr>
-            <w:tcW w:w="768" w:type="dxa"/>
-            <w:shd w:val="clear" w:color="auto" w:fill="D9D9D9" w:themeFill="background1" w:themeFillShade="D9"/>
-          </w:tcPr>
-          <w:p>
-            <w:pPr>
-              <w:jc w:val="center"/>
-              <w:rPr>
-                <w:rFonts w:ascii="Courier New" w:eastAsia="Times New Roman" w:hAnsi="Courier New" w:cs="Courier New"/>
-                <w:b/>
-                <w:bCs/>
-                <w:color w:val="000000"/>
-                <w:sz w:val="36"/>
-                <w:szCs w:val="36"/>
-              </w:rPr>
-            </w:pPr>
-            <w:r>
-              <w:rPr>
-                <w:rFonts w:ascii="Courier New" w:eastAsia="Times New Roman" w:hAnsi="Courier New" w:cs="Courier New"/>
-                <w:b/>
-                <w:bCs/>
-                <w:color w:val="000000"/>
-                <w:sz w:val="36"/>
-                <w:szCs w:val="36"/>
-              </w:rPr>
-              <w:t>h^</w:t>
-            </w:r>
-          </w:p>
-        </w:tc>
-        <w:tc>
-          <w:tcPr>
-            <w:tcW w:w="734" w:type="dxa"/>
-            <w:shd w:val="clear" w:color="auto" w:fill="D9D9D9" w:themeFill="background1" w:themeFillShade="D9"/>
-          </w:tcPr>
-          <w:p>
-            <w:pPr>
-              <w:jc w:val="center"/>
-              <w:rPr>
-                <w:rFonts w:ascii="Courier New" w:eastAsia="Times New Roman" w:hAnsi="Courier New" w:cs="Courier New"/>
-                <w:b/>
-                <w:bCs/>
-                <w:color w:val="000000"/>
-                <w:sz w:val="36"/>
-                <w:szCs w:val="36"/>
-              </w:rPr>
-            </w:pPr>
-            <w:r>
-              <w:rPr>
-                <w:rFonts w:ascii="Courier New" w:eastAsia="Times New Roman" w:hAnsi="Courier New" w:cs="Courier New"/>
-                <w:b/>
-                <w:bCs/>
-                <w:color w:val="000000"/>
-                <w:sz w:val="36"/>
-                <w:szCs w:val="36"/>
-              </w:rPr>
-              <w:t>s^</w:t>
-            </w:r>
-          </w:p>
-        </w:tc>
-        <w:tc>
-          <w:tcPr>
-            <w:tcW w:w="767" w:type="dxa"/>
-            <w:shd w:val="clear" w:color="auto" w:fill="D9D9D9" w:themeFill="background1" w:themeFillShade="D9"/>
-          </w:tcPr>
-          <w:p>
-            <w:pPr>
-              <w:jc w:val="center"/>
-              <w:rPr>
-                <w:rFonts w:ascii="Courier New" w:eastAsia="Times New Roman" w:hAnsi="Courier New" w:cs="Courier New"/>
-                <w:b/>
-                <w:bCs/>
-                <w:color w:val="000000"/>
-                <w:sz w:val="36"/>
-                <w:szCs w:val="36"/>
-              </w:rPr>
-            </w:pPr>
-            <w:r>
-              <w:rPr>
-                <w:rFonts w:ascii="Courier New" w:eastAsia="Times New Roman" w:hAnsi="Courier New" w:cs="Courier New"/>
-                <w:b/>
-                <w:bCs/>
-                <w:color w:val="000000"/>
-                <w:sz w:val="36"/>
-                <w:szCs w:val="36"/>
-              </w:rPr>
-              <w:t>q^</w:t>
-            </w:r>
-          </w:p>
-        </w:tc>
-        <w:tc>
-          <w:tcPr>
-            <w:tcW w:w="825" w:type="dxa"/>
-            <w:shd w:val="clear" w:color="auto" w:fill="D9D9D9" w:themeFill="background1" w:themeFillShade="D9"/>
-          </w:tcPr>
-          <w:p>
-            <w:pPr>
-              <w:jc w:val="center"/>
-              <w:rPr>
-                <w:rFonts w:ascii="Courier New" w:eastAsia="Times New Roman" w:hAnsi="Courier New" w:cs="Courier New"/>
-                <w:b/>
-                <w:bCs/>
-                <w:color w:val="000000"/>
-                <w:sz w:val="36"/>
-                <w:szCs w:val="36"/>
-              </w:rPr>
-            </w:pPr>
-            <w:r>
-              <w:rPr>
-                <w:rFonts w:ascii="Courier New" w:eastAsia="Times New Roman" w:hAnsi="Courier New" w:cs="Courier New"/>
-                <w:b/>
-                <w:bCs/>
-                <w:color w:val="000000"/>
-                <w:sz w:val="36"/>
-                <w:szCs w:val="36"/>
-              </w:rPr>
-              <w:t>t^</w:t>
-            </w:r>
-          </w:p>
-        </w:tc>
-        <w:tc>
-          <w:tcPr>
-            <w:tcW w:w="841" w:type="dxa"/>
-            <w:shd w:val="clear" w:color="auto" w:fill="D9D9D9" w:themeFill="background1" w:themeFillShade="D9"/>
-          </w:tcPr>
-          <w:p>
-            <w:pPr>
-              <w:jc w:val="center"/>
-              <w:rPr>
-                <w:rFonts w:ascii="Courier New" w:eastAsia="Times New Roman" w:hAnsi="Courier New" w:cs="Courier New"/>
-                <w:b/>
-                <w:bCs/>
-                <w:color w:val="000000"/>
-                <w:sz w:val="36"/>
-                <w:szCs w:val="36"/>
-              </w:rPr>
-            </w:pPr>
-            <w:r>
-              <w:rPr>
-                <w:rFonts w:ascii="Courier New" w:eastAsia="Times New Roman" w:hAnsi="Courier New" w:cs="Courier New"/>
-                <w:b/>
-                <w:bCs/>
-                <w:color w:val="000000"/>
-                <w:sz w:val="36"/>
-                <w:szCs w:val="36"/>
-              </w:rPr>
-              <w:t>c^</w:t>
-            </w:r>
-          </w:p>
-        </w:tc>
-        <w:tc>
-          <w:tcPr>
-            <w:tcW w:w="765" w:type="dxa"/>
-            <w:shd w:val="clear" w:color="auto" w:fill="D9D9D9" w:themeFill="background1" w:themeFillShade="D9"/>
-          </w:tcPr>
-          <w:p>
-            <w:pPr>
-              <w:jc w:val="center"/>
-              <w:rPr>
-                <w:rFonts w:ascii="Courier New" w:eastAsia="Times New Roman" w:hAnsi="Courier New" w:cs="Courier New"/>
-                <w:b/>
-                <w:bCs/>
-                <w:color w:val="000000"/>
-                <w:sz w:val="36"/>
-                <w:szCs w:val="36"/>
-              </w:rPr>
-            </w:pPr>
-            <w:r>
-              <w:rPr>
-                <w:rFonts w:ascii="Courier New" w:eastAsia="Times New Roman" w:hAnsi="Courier New" w:cs="Courier New"/>
-                <w:b/>
-                <w:bCs/>
-                <w:color w:val="000000"/>
-                <w:sz w:val="36"/>
-                <w:szCs w:val="36"/>
-              </w:rPr>
-              <w:t>n^</w:t>
-            </w:r>
-          </w:p>
-        </w:tc>
-        <w:tc>
-          <w:tcPr>
-            <w:tcW w:w="754" w:type="dxa"/>
-            <w:shd w:val="clear" w:color="auto" w:fill="D9D9D9" w:themeFill="background1" w:themeFillShade="D9"/>
-          </w:tcPr>
-          <w:p>
-            <w:pPr>
-              <w:jc w:val="center"/>
-              <w:rPr>
-                <w:rFonts w:ascii="Courier New" w:eastAsia="Times New Roman" w:hAnsi="Courier New" w:cs="Courier New"/>
-                <w:b/>
-                <w:bCs/>
-                <w:color w:val="000000"/>
-                <w:sz w:val="36"/>
-                <w:szCs w:val="36"/>
-              </w:rPr>
-            </w:pPr>
-            <w:r>
-              <w:rPr>
-                <w:rFonts w:ascii="Courier New" w:eastAsia="Times New Roman" w:hAnsi="Courier New" w:cs="Courier New"/>
-                <w:b/>
-                <w:bCs/>
-                <w:color w:val="000000"/>
-                <w:sz w:val="36"/>
-                <w:szCs w:val="36"/>
-              </w:rPr>
-              <w:t>k^</w:t>
-            </w:r>
-          </w:p>
-        </w:tc>
-        <w:tc>
-          <w:tcPr>
-            <w:tcW w:w="762" w:type="dxa"/>
-            <w:shd w:val="clear" w:color="auto" w:fill="D9D9D9" w:themeFill="background1" w:themeFillShade="D9"/>
-          </w:tcPr>
-          <w:p>
-            <w:pPr>
-              <w:jc w:val="center"/>
-              <w:rPr>
-                <w:rFonts w:ascii="Courier New" w:eastAsia="Times New Roman" w:hAnsi="Courier New" w:cs="Courier New"/>
-                <w:b/>
-                <w:bCs/>
-                <w:color w:val="000000"/>
-                <w:sz w:val="36"/>
-                <w:szCs w:val="36"/>
-              </w:rPr>
-            </w:pPr>
-            <w:r>
-              <w:rPr>
-                <w:rFonts w:ascii="Courier New" w:eastAsia="Times New Roman" w:hAnsi="Courier New" w:cs="Courier New"/>
-                <w:b/>
-                <w:bCs/>
-                <w:color w:val="000000"/>
-                <w:sz w:val="36"/>
-                <w:szCs w:val="36"/>
-              </w:rPr>
-              <w:t>z^</w:t>
-            </w:r>
-          </w:p>
-        </w:tc>
-        <w:tc>
-          <w:tcPr>
-            <w:tcW w:w="893" w:type="dxa"/>
-            <w:shd w:val="clear" w:color="auto" w:fill="D9D9D9" w:themeFill="background1" w:themeFillShade="D9"/>
-          </w:tcPr>
-          <w:p>
-            <w:pPr>
-              <w:jc w:val="center"/>
-              <w:rPr>
-                <w:rFonts w:ascii="Courier New" w:eastAsia="Times New Roman" w:hAnsi="Courier New" w:cs="Courier New"/>
-                <w:b/>
-                <w:bCs/>
-                <w:color w:val="000000"/>
-                <w:sz w:val="36"/>
-                <w:szCs w:val="36"/>
-              </w:rPr>
-            </w:pPr>
-            <w:r>
-              <w:rPr>
-                <w:rFonts w:ascii="Courier New" w:eastAsia="Times New Roman" w:hAnsi="Courier New" w:cs="Courier New"/>
-                <w:b/>
-                <w:bCs/>
-                <w:color w:val="000000"/>
-                <w:sz w:val="36"/>
-                <w:szCs w:val="36"/>
-              </w:rPr>
-              <w:t>d^</w:t>
-            </w:r>
-          </w:p>
-        </w:tc>
-        <w:tc>
-          <w:tcPr>
-            <w:tcW w:w="765" w:type="dxa"/>
-            <w:shd w:val="clear" w:color="auto" w:fill="D9D9D9" w:themeFill="background1" w:themeFillShade="D9"/>
-          </w:tcPr>
-          <w:p>
-            <w:pPr>
-              <w:jc w:val="center"/>
-              <w:rPr>
-                <w:rFonts w:ascii="Courier New" w:eastAsia="Times New Roman" w:hAnsi="Courier New" w:cs="Courier New"/>
-                <w:b/>
-                <w:bCs/>
-                <w:color w:val="000000"/>
-                <w:sz w:val="36"/>
-                <w:szCs w:val="36"/>
-              </w:rPr>
-            </w:pPr>
-            <w:r>
-              <w:rPr>
-                <w:rFonts w:ascii="Courier New" w:eastAsia="Times New Roman" w:hAnsi="Courier New" w:cs="Courier New"/>
-                <w:b/>
-                <w:bCs/>
-                <w:color w:val="000000"/>
-                <w:sz w:val="36"/>
-                <w:szCs w:val="36"/>
-              </w:rPr>
-              <w:t>n^</w:t>
-            </w:r>
-          </w:p>
-        </w:tc>
-        <w:tc>
-          <w:tcPr>
-            <w:tcW w:w="814" w:type="dxa"/>
-            <w:shd w:val="clear" w:color="auto" w:fill="D9D9D9" w:themeFill="background1" w:themeFillShade="D9"/>
-          </w:tcPr>
-          <w:p>
-            <w:pPr>
-              <w:jc w:val="center"/>
-              <w:rPr>
-                <w:rFonts w:ascii="Courier New" w:eastAsia="Times New Roman" w:hAnsi="Courier New" w:cs="Courier New"/>
-                <w:b/>
-                <w:bCs/>
-                <w:color w:val="000000"/>
-                <w:sz w:val="36"/>
-                <w:szCs w:val="36"/>
-              </w:rPr>
-            </w:pPr>
-            <w:r>
-              <w:rPr>
-                <w:rFonts w:ascii="Courier New" w:eastAsia="Times New Roman" w:hAnsi="Courier New" w:cs="Courier New"/>
-                <w:b/>
-                <w:bCs/>
-                <w:color w:val="000000"/>
-                <w:sz w:val="36"/>
-                <w:szCs w:val="36"/>
-              </w:rPr>
-              <w:t>x^</w:t>
-            </w:r>
-          </w:p>
-        </w:tc>
-        <w:tc>
-          <w:tcPr>
-            <w:tcW w:w="816" w:type="dxa"/>
-            <w:shd w:val="clear" w:color="auto" w:fill="D9D9D9" w:themeFill="background1" w:themeFillShade="D9"/>
-          </w:tcPr>
-          <w:p>
-            <w:pPr>
-              <w:jc w:val="center"/>
-              <w:rPr>
-                <w:rFonts w:ascii="Courier New" w:eastAsia="Times New Roman" w:hAnsi="Courier New" w:cs="Courier New"/>
-                <w:b/>
-                <w:bCs/>
-                <w:color w:val="000000"/>
-                <w:sz w:val="36"/>
-                <w:szCs w:val="36"/>
-              </w:rPr>
-            </w:pPr>
-            <w:r>
-              <w:rPr>
-                <w:rFonts w:ascii="Courier New" w:eastAsia="Times New Roman" w:hAnsi="Courier New" w:cs="Courier New"/>
-                <w:b/>
-                <w:bCs/>
-                <w:color w:val="000000"/>
-                <w:sz w:val="36"/>
-                <w:szCs w:val="36"/>
-              </w:rPr>
-              <w:t>p^</w:t>
-            </w:r>
-          </w:p>
-        </w:tc>
-      </w:tr>
-    </w:tbl>
-    <w:p/>
-    <w:p>
-      <w:pPr>
-        <w:shd w:val="clear" w:color="auto" w:fill="FFFFFF"/>
-        <w:spacing w:after="0" w:line="240" w:lineRule="auto"/>
-        <w:rPr>
-          <w:rFonts w:eastAsia="Times New Roman" w:cs="Helvetica"/>
-          <w:b/>
-          <w:bCs/>
-          <w:color w:val="000000"/>
-          <w:sz w:val="36"/>
-          <w:szCs w:val="36"/>
-        </w:rPr>
-      </w:pPr>
-    </w:p>
-    <w:p>
-      <w:pPr>
-        <w:shd w:val="clear" w:color="auto" w:fill="FFFFFF"/>
-        <w:spacing w:after="0" w:line="540" w:lineRule="atLeast"/>
-        <w:textAlignment w:val="top"/>
-        <w:rPr>
-          <w:rFonts w:ascii="Roboto" w:eastAsia="Times New Roman" w:hAnsi="Roboto" w:cs="Times New Roman"/>
-          <w:color w:val="222222"/>
-          <w:sz w:val="42"/>
-          <w:szCs w:val="42"/>
-        </w:rPr>
-      </w:pPr>
-      <w:r>
-        <w:rPr>
-          <w:rFonts w:ascii="Roboto" w:eastAsia="Times New Roman" w:hAnsi="Roboto" w:cs="Times New Roman"/>
-          <w:color w:val="222222"/>
-          <w:sz w:val="42"/>
-          <w:szCs w:val="42"/>
         </w:rPr>
         <w:br w:type="page"/>
       </w:r>

</xml_diff>